<commit_message>
diagrams added to docx file; changed .gitignore
</commit_message>
<xml_diff>
--- a/УИРС_8В31_Болбин_Константинов_Осипов.docx
+++ b/УИРС_8В31_Болбин_Константинов_Осипов.docx
@@ -246,13 +246,8 @@
       </w:r>
       <w:r>
         <w:tab/>
-        <w:t xml:space="preserve">И.М. </w:t>
-      </w:r>
-      <w:proofErr w:type="spellStart"/>
-      <w:r>
-        <w:t>Болбин</w:t>
-      </w:r>
-      <w:proofErr w:type="spellEnd"/>
+        <w:t>И.М. Болбин</w:t>
+      </w:r>
     </w:p>
     <w:p>
       <w:pPr>
@@ -308,16 +303,8 @@
         <w:rPr>
           <w:lang w:val="ru-RU"/>
         </w:rPr>
-        <w:t xml:space="preserve">Е.А. </w:t>
-      </w:r>
-      <w:proofErr w:type="spellStart"/>
-      <w:r>
-        <w:rPr>
-          <w:lang w:val="ru-RU"/>
-        </w:rPr>
-        <w:t>Мыцко</w:t>
-      </w:r>
-      <w:proofErr w:type="spellEnd"/>
+        <w:t>Е.А. Мыцко</w:t>
+      </w:r>
     </w:p>
     <w:p>
       <w:r>
@@ -379,6 +366,9 @@
     <w:p>
       <w:pPr>
         <w:pStyle w:val="1"/>
+        <w:rPr>
+          <w:lang w:val="ru-RU"/>
+        </w:rPr>
       </w:pPr>
       <w:bookmarkStart w:id="9" w:name="_ood7bipsmdet" w:colFirst="0" w:colLast="0"/>
       <w:bookmarkStart w:id="10" w:name="_Toc220023466"/>
@@ -392,6 +382,165 @@
       <w:bookmarkEnd w:id="11"/>
     </w:p>
     <w:p>
+      <w:pPr>
+        <w:pStyle w:val="2"/>
+        <w:rPr>
+          <w:lang w:val="ru-RU"/>
+        </w:rPr>
+      </w:pPr>
+      <w:r>
+        <w:rPr>
+          <w:lang w:val="ru-RU"/>
+        </w:rPr>
+        <w:t>1 Проектирование приложения</w:t>
+      </w:r>
+    </w:p>
+    <w:p>
+      <w:pPr>
+        <w:rPr>
+          <w:lang w:val="ru-RU"/>
+        </w:rPr>
+      </w:pPr>
+      <w:r>
+        <w:rPr>
+          <w:lang w:val="ru-RU"/>
+        </w:rPr>
+        <w:t>На рисунке А.1 приложения А представлена диаграмма вариантов использования приложения.</w:t>
+      </w:r>
+    </w:p>
+    <w:p>
+      <w:pPr>
+        <w:rPr>
+          <w:lang w:val="ru-RU"/>
+        </w:rPr>
+      </w:pPr>
+      <w:r>
+        <w:rPr>
+          <w:lang w:val="ru-RU"/>
+        </w:rPr>
+        <w:t>Архитектура базы данных приложения представлена на рисунке 1.</w:t>
+      </w:r>
+    </w:p>
+    <w:p>
+      <w:pPr>
+        <w:rPr>
+          <w:lang w:val="ru-RU"/>
+        </w:rPr>
+      </w:pPr>
+    </w:p>
+    <w:p>
+      <w:pPr>
+        <w:pStyle w:val="af"/>
+      </w:pPr>
+      <w:r>
+        <w:rPr>
+          <w:noProof/>
+        </w:rPr>
+        <w:drawing>
+          <wp:inline distT="0" distB="0" distL="0" distR="0" wp14:anchorId="219917BF" wp14:editId="055904F0">
+            <wp:extent cx="5942965" cy="4115435"/>
+            <wp:effectExtent l="0" t="0" r="635" b="0"/>
+            <wp:docPr id="565152719" name="Рисунок 4"/>
+            <wp:cNvGraphicFramePr>
+              <a:graphicFrameLocks xmlns:a="http://schemas.openxmlformats.org/drawingml/2006/main" noChangeAspect="1"/>
+            </wp:cNvGraphicFramePr>
+            <a:graphic xmlns:a="http://schemas.openxmlformats.org/drawingml/2006/main">
+              <a:graphicData uri="http://schemas.openxmlformats.org/drawingml/2006/picture">
+                <pic:pic xmlns:pic="http://schemas.openxmlformats.org/drawingml/2006/picture">
+                  <pic:nvPicPr>
+                    <pic:cNvPr id="565152719" name="Рисунок 565152719"/>
+                    <pic:cNvPicPr/>
+                  </pic:nvPicPr>
+                  <pic:blipFill>
+                    <a:blip r:embed="rId8">
+                      <a:extLst>
+                        <a:ext uri="{28A0092B-C50C-407E-A947-70E740481C1C}">
+                          <a14:useLocalDpi xmlns:a14="http://schemas.microsoft.com/office/drawing/2010/main" val="0"/>
+                        </a:ext>
+                      </a:extLst>
+                    </a:blip>
+                    <a:stretch>
+                      <a:fillRect/>
+                    </a:stretch>
+                  </pic:blipFill>
+                  <pic:spPr>
+                    <a:xfrm>
+                      <a:off x="0" y="0"/>
+                      <a:ext cx="5942965" cy="4115435"/>
+                    </a:xfrm>
+                    <a:prstGeom prst="rect">
+                      <a:avLst/>
+                    </a:prstGeom>
+                  </pic:spPr>
+                </pic:pic>
+              </a:graphicData>
+            </a:graphic>
+          </wp:inline>
+        </w:drawing>
+      </w:r>
+    </w:p>
+    <w:p>
+      <w:pPr>
+        <w:pStyle w:val="af"/>
+      </w:pPr>
+      <w:r>
+        <w:t xml:space="preserve">Рисунок 1 – </w:t>
+      </w:r>
+      <w:r>
+        <w:rPr>
+          <w:lang w:val="en-US"/>
+        </w:rPr>
+        <w:t>UML</w:t>
+      </w:r>
+      <w:r>
+        <w:t>-</w:t>
+      </w:r>
+      <w:r>
+        <w:t>диаграмма архитектуры базы данных</w:t>
+      </w:r>
+    </w:p>
+    <w:p>
+      <w:pPr>
+        <w:pStyle w:val="af"/>
+      </w:pPr>
+    </w:p>
+    <w:p>
+      <w:pPr>
+        <w:rPr>
+          <w:lang w:val="ru-RU"/>
+        </w:rPr>
+      </w:pPr>
+      <w:r>
+        <w:rPr>
+          <w:lang w:val="ru-RU"/>
+        </w:rPr>
+        <w:t xml:space="preserve">Также в приложении Б представлены </w:t>
+      </w:r>
+      <w:r>
+        <w:rPr>
+          <w:lang w:val="en-US"/>
+        </w:rPr>
+        <w:t>UML</w:t>
+      </w:r>
+      <w:r>
+        <w:rPr>
+          <w:lang w:val="ru-RU"/>
+        </w:rPr>
+        <w:t>-</w:t>
+      </w:r>
+      <w:r>
+        <w:rPr>
+          <w:lang w:val="ru-RU"/>
+        </w:rPr>
+        <w:t>диаграммы последовательностей: аутентификации и входа, восстановления пароля, выхода, добавления участника, отправки сообщения, получения списка чатов, редактирования сообщения, смены пароля, удаления сообщения (представленные на рисунках Б.1, Б.2, Б.3, …, Б.10 соответственно).</w:t>
+      </w:r>
+    </w:p>
+    <w:p>
+      <w:pPr>
+        <w:rPr>
+          <w:lang w:val="ru-RU"/>
+        </w:rPr>
+      </w:pPr>
       <w:bookmarkStart w:id="12" w:name="_6w4tz4gr8ciz" w:colFirst="0" w:colLast="0"/>
       <w:bookmarkEnd w:id="12"/>
       <w:r>
@@ -421,6 +570,9 @@
     <w:p>
       <w:pPr>
         <w:pStyle w:val="1"/>
+        <w:rPr>
+          <w:lang w:val="ru-RU"/>
+        </w:rPr>
       </w:pPr>
       <w:bookmarkStart w:id="16" w:name="_nc8amvv1wtnt" w:colFirst="0" w:colLast="0"/>
       <w:bookmarkStart w:id="17" w:name="_Toc220023480"/>
@@ -434,16 +586,17 @@
       <w:bookmarkEnd w:id="18"/>
     </w:p>
     <w:p>
-      <w:r>
-        <w:br w:type="page"/>
-      </w:r>
-    </w:p>
-    <w:p>
       <w:pPr>
         <w:pStyle w:val="1"/>
-        <w:rPr>
-          <w:lang w:val="en-US"/>
-        </w:rPr>
+        <w:sectPr>
+          <w:footerReference w:type="default" r:id="rId9"/>
+          <w:footerReference w:type="first" r:id="rId10"/>
+          <w:pgSz w:w="11909" w:h="16834"/>
+          <w:pgMar w:top="1133" w:right="850" w:bottom="1133" w:left="1700" w:header="720" w:footer="720" w:gutter="0"/>
+          <w:pgNumType w:start="1"/>
+          <w:cols w:space="720"/>
+          <w:titlePg/>
+        </w:sectPr>
       </w:pPr>
       <w:bookmarkStart w:id="19" w:name="_tj1xiu5003xl" w:colFirst="0" w:colLast="0"/>
       <w:bookmarkStart w:id="20" w:name="_iq4xdwyrrbj8" w:colFirst="0" w:colLast="0"/>
@@ -451,6 +604,14 @@
       <w:bookmarkStart w:id="22" w:name="_Toc220068107"/>
       <w:bookmarkEnd w:id="19"/>
       <w:bookmarkEnd w:id="20"/>
+    </w:p>
+    <w:p>
+      <w:pPr>
+        <w:pStyle w:val="1"/>
+        <w:rPr>
+          <w:lang w:val="ru-RU"/>
+        </w:rPr>
+      </w:pPr>
       <w:r>
         <w:lastRenderedPageBreak/>
         <w:t>ПРИЛОЖЕНИЕ А</w:t>
@@ -458,14 +619,1028 @@
       <w:bookmarkEnd w:id="21"/>
       <w:bookmarkEnd w:id="22"/>
     </w:p>
+    <w:p>
+      <w:pPr>
+        <w:ind w:firstLine="0"/>
+        <w:jc w:val="center"/>
+        <w:rPr>
+          <w:b/>
+          <w:bCs/>
+          <w:lang w:val="en-US"/>
+        </w:rPr>
+      </w:pPr>
+      <w:r>
+        <w:rPr>
+          <w:b/>
+          <w:bCs/>
+          <w:lang w:val="ru-RU"/>
+        </w:rPr>
+        <w:t xml:space="preserve">Диаграмма </w:t>
+      </w:r>
+      <w:r>
+        <w:rPr>
+          <w:b/>
+          <w:bCs/>
+          <w:lang w:val="ru-RU"/>
+        </w:rPr>
+        <w:t>вариантов использования приложения</w:t>
+      </w:r>
+    </w:p>
+    <w:p>
+      <w:pPr>
+        <w:pStyle w:val="af"/>
+      </w:pPr>
+    </w:p>
+    <w:p>
+      <w:pPr>
+        <w:pStyle w:val="af"/>
+      </w:pPr>
+      <w:r>
+        <w:rPr>
+          <w:noProof/>
+        </w:rPr>
+        <w:drawing>
+          <wp:inline distT="0" distB="0" distL="0" distR="0" wp14:anchorId="47E06ECF" wp14:editId="1978C366">
+            <wp:extent cx="9250680" cy="3340735"/>
+            <wp:effectExtent l="0" t="0" r="7620" b="0"/>
+            <wp:docPr id="566530649" name="Рисунок 3"/>
+            <wp:cNvGraphicFramePr>
+              <a:graphicFrameLocks xmlns:a="http://schemas.openxmlformats.org/drawingml/2006/main" noChangeAspect="1"/>
+            </wp:cNvGraphicFramePr>
+            <a:graphic xmlns:a="http://schemas.openxmlformats.org/drawingml/2006/main">
+              <a:graphicData uri="http://schemas.openxmlformats.org/drawingml/2006/picture">
+                <pic:pic xmlns:pic="http://schemas.openxmlformats.org/drawingml/2006/picture">
+                  <pic:nvPicPr>
+                    <pic:cNvPr id="566530649" name="Рисунок 566530649"/>
+                    <pic:cNvPicPr/>
+                  </pic:nvPicPr>
+                  <pic:blipFill>
+                    <a:blip r:embed="rId11">
+                      <a:extLst>
+                        <a:ext uri="{28A0092B-C50C-407E-A947-70E740481C1C}">
+                          <a14:useLocalDpi xmlns:a14="http://schemas.microsoft.com/office/drawing/2010/main" val="0"/>
+                        </a:ext>
+                      </a:extLst>
+                    </a:blip>
+                    <a:stretch>
+                      <a:fillRect/>
+                    </a:stretch>
+                  </pic:blipFill>
+                  <pic:spPr>
+                    <a:xfrm>
+                      <a:off x="0" y="0"/>
+                      <a:ext cx="9250680" cy="3340735"/>
+                    </a:xfrm>
+                    <a:prstGeom prst="rect">
+                      <a:avLst/>
+                    </a:prstGeom>
+                  </pic:spPr>
+                </pic:pic>
+              </a:graphicData>
+            </a:graphic>
+          </wp:inline>
+        </w:drawing>
+      </w:r>
+    </w:p>
+    <w:p>
+      <w:pPr>
+        <w:pStyle w:val="af"/>
+      </w:pPr>
+      <w:r>
+        <w:t>Рисунок</w:t>
+      </w:r>
+      <w:r>
+        <w:t xml:space="preserve"> </w:t>
+      </w:r>
+      <w:r>
+        <w:t>А.1 – Диаграмма вариантов использования</w:t>
+      </w:r>
+    </w:p>
+    <w:p>
+      <w:pPr>
+        <w:pStyle w:val="1"/>
+        <w:rPr>
+          <w:lang w:val="ru-RU"/>
+        </w:rPr>
+        <w:sectPr>
+          <w:pgSz w:w="16834" w:h="11909" w:orient="landscape"/>
+          <w:pgMar w:top="1700" w:right="1133" w:bottom="850" w:left="1133" w:header="720" w:footer="720" w:gutter="0"/>
+          <w:cols w:space="720"/>
+          <w:docGrid w:linePitch="326"/>
+        </w:sectPr>
+      </w:pPr>
+    </w:p>
+    <w:p>
+      <w:pPr>
+        <w:pStyle w:val="1"/>
+        <w:rPr>
+          <w:lang w:val="ru-RU"/>
+        </w:rPr>
+      </w:pPr>
+      <w:r>
+        <w:rPr>
+          <w:lang w:val="ru-RU"/>
+        </w:rPr>
+        <w:lastRenderedPageBreak/>
+        <w:t>ПРИЛОЖЕНИЕ Б</w:t>
+      </w:r>
+    </w:p>
+    <w:p>
+      <w:pPr>
+        <w:ind w:firstLine="0"/>
+        <w:jc w:val="center"/>
+        <w:rPr>
+          <w:b/>
+          <w:bCs/>
+          <w:lang w:val="en-US"/>
+        </w:rPr>
+      </w:pPr>
+      <w:r>
+        <w:rPr>
+          <w:b/>
+          <w:bCs/>
+          <w:lang w:val="en-US"/>
+        </w:rPr>
+        <w:t>UML</w:t>
+      </w:r>
+      <w:r>
+        <w:rPr>
+          <w:b/>
+          <w:bCs/>
+          <w:lang w:val="ru-RU"/>
+        </w:rPr>
+        <w:t>-</w:t>
+      </w:r>
+      <w:r>
+        <w:rPr>
+          <w:b/>
+          <w:bCs/>
+          <w:lang w:val="ru-RU"/>
+        </w:rPr>
+        <w:t>диаграмм</w:t>
+      </w:r>
+      <w:r>
+        <w:rPr>
+          <w:b/>
+          <w:bCs/>
+          <w:lang w:val="ru-RU"/>
+        </w:rPr>
+        <w:t>ы последовательностей</w:t>
+      </w:r>
+    </w:p>
+    <w:p>
+      <w:pPr>
+        <w:ind w:firstLine="0"/>
+        <w:jc w:val="center"/>
+        <w:rPr>
+          <w:b/>
+          <w:bCs/>
+          <w:lang w:val="en-US"/>
+        </w:rPr>
+      </w:pPr>
+    </w:p>
+    <w:p>
+      <w:pPr>
+        <w:pStyle w:val="af"/>
+      </w:pPr>
+      <w:r>
+        <w:rPr>
+          <w:noProof/>
+        </w:rPr>
+        <w:drawing>
+          <wp:inline distT="0" distB="0" distL="0" distR="0" wp14:anchorId="74260993" wp14:editId="6C05E836">
+            <wp:extent cx="5942965" cy="6995160"/>
+            <wp:effectExtent l="0" t="0" r="635" b="0"/>
+            <wp:docPr id="870520837" name="Рисунок 2"/>
+            <wp:cNvGraphicFramePr>
+              <a:graphicFrameLocks xmlns:a="http://schemas.openxmlformats.org/drawingml/2006/main" noChangeAspect="1"/>
+            </wp:cNvGraphicFramePr>
+            <a:graphic xmlns:a="http://schemas.openxmlformats.org/drawingml/2006/main">
+              <a:graphicData uri="http://schemas.openxmlformats.org/drawingml/2006/picture">
+                <pic:pic xmlns:pic="http://schemas.openxmlformats.org/drawingml/2006/picture">
+                  <pic:nvPicPr>
+                    <pic:cNvPr id="870520837" name="Рисунок 870520837"/>
+                    <pic:cNvPicPr/>
+                  </pic:nvPicPr>
+                  <pic:blipFill>
+                    <a:blip r:embed="rId12">
+                      <a:extLst>
+                        <a:ext uri="{28A0092B-C50C-407E-A947-70E740481C1C}">
+                          <a14:useLocalDpi xmlns:a14="http://schemas.microsoft.com/office/drawing/2010/main" val="0"/>
+                        </a:ext>
+                      </a:extLst>
+                    </a:blip>
+                    <a:stretch>
+                      <a:fillRect/>
+                    </a:stretch>
+                  </pic:blipFill>
+                  <pic:spPr>
+                    <a:xfrm>
+                      <a:off x="0" y="0"/>
+                      <a:ext cx="5942965" cy="6995160"/>
+                    </a:xfrm>
+                    <a:prstGeom prst="rect">
+                      <a:avLst/>
+                    </a:prstGeom>
+                  </pic:spPr>
+                </pic:pic>
+              </a:graphicData>
+            </a:graphic>
+          </wp:inline>
+        </w:drawing>
+      </w:r>
+    </w:p>
+    <w:p>
+      <w:pPr>
+        <w:pStyle w:val="af"/>
+      </w:pPr>
+      <w:r>
+        <w:t xml:space="preserve">Рисунок Б.1 – </w:t>
+      </w:r>
+      <w:r>
+        <w:rPr>
+          <w:lang w:val="en-US"/>
+        </w:rPr>
+        <w:t>UML</w:t>
+      </w:r>
+      <w:r>
+        <w:t>-</w:t>
+      </w:r>
+      <w:r>
+        <w:t xml:space="preserve">диаграмма </w:t>
+      </w:r>
+      <w:r>
+        <w:t>последовательност</w:t>
+      </w:r>
+      <w:r>
+        <w:t>и аутентификации и входа</w:t>
+      </w:r>
+    </w:p>
+    <w:p>
+      <w:pPr>
+        <w:pStyle w:val="af"/>
+      </w:pPr>
+      <w:r>
+        <w:rPr>
+          <w:noProof/>
+        </w:rPr>
+        <w:lastRenderedPageBreak/>
+        <w:drawing>
+          <wp:inline distT="0" distB="0" distL="0" distR="0" wp14:anchorId="1F13C319" wp14:editId="52E910D2">
+            <wp:extent cx="5942965" cy="6145530"/>
+            <wp:effectExtent l="0" t="0" r="635" b="7620"/>
+            <wp:docPr id="1186159003" name="Рисунок 3"/>
+            <wp:cNvGraphicFramePr>
+              <a:graphicFrameLocks xmlns:a="http://schemas.openxmlformats.org/drawingml/2006/main" noChangeAspect="1"/>
+            </wp:cNvGraphicFramePr>
+            <a:graphic xmlns:a="http://schemas.openxmlformats.org/drawingml/2006/main">
+              <a:graphicData uri="http://schemas.openxmlformats.org/drawingml/2006/picture">
+                <pic:pic xmlns:pic="http://schemas.openxmlformats.org/drawingml/2006/picture">
+                  <pic:nvPicPr>
+                    <pic:cNvPr id="1186159003" name="Рисунок 1186159003"/>
+                    <pic:cNvPicPr/>
+                  </pic:nvPicPr>
+                  <pic:blipFill>
+                    <a:blip r:embed="rId13">
+                      <a:extLst>
+                        <a:ext uri="{28A0092B-C50C-407E-A947-70E740481C1C}">
+                          <a14:useLocalDpi xmlns:a14="http://schemas.microsoft.com/office/drawing/2010/main" val="0"/>
+                        </a:ext>
+                      </a:extLst>
+                    </a:blip>
+                    <a:stretch>
+                      <a:fillRect/>
+                    </a:stretch>
+                  </pic:blipFill>
+                  <pic:spPr>
+                    <a:xfrm>
+                      <a:off x="0" y="0"/>
+                      <a:ext cx="5942965" cy="6145530"/>
+                    </a:xfrm>
+                    <a:prstGeom prst="rect">
+                      <a:avLst/>
+                    </a:prstGeom>
+                  </pic:spPr>
+                </pic:pic>
+              </a:graphicData>
+            </a:graphic>
+          </wp:inline>
+        </w:drawing>
+      </w:r>
+    </w:p>
+    <w:p>
+      <w:pPr>
+        <w:pStyle w:val="af"/>
+      </w:pPr>
+      <w:r>
+        <w:t>Рисунок Б.</w:t>
+      </w:r>
+      <w:r>
+        <w:t>2</w:t>
+      </w:r>
+      <w:r>
+        <w:t xml:space="preserve"> – </w:t>
+      </w:r>
+      <w:r>
+        <w:rPr>
+          <w:lang w:val="en-US"/>
+        </w:rPr>
+        <w:t>UML</w:t>
+      </w:r>
+      <w:r>
+        <w:t>-</w:t>
+      </w:r>
+      <w:r>
+        <w:t xml:space="preserve">диаграмма последовательности </w:t>
+      </w:r>
+      <w:r>
+        <w:t>восстановления пароля</w:t>
+      </w:r>
+    </w:p>
+    <w:p>
+      <w:pPr>
+        <w:pStyle w:val="af"/>
+      </w:pPr>
+      <w:r>
+        <w:rPr>
+          <w:noProof/>
+        </w:rPr>
+        <w:lastRenderedPageBreak/>
+        <w:drawing>
+          <wp:inline distT="0" distB="0" distL="0" distR="0" wp14:anchorId="0277E2D7" wp14:editId="2FC62119">
+            <wp:extent cx="5942965" cy="6145530"/>
+            <wp:effectExtent l="0" t="0" r="635" b="7620"/>
+            <wp:docPr id="844167931" name="Рисунок 4"/>
+            <wp:cNvGraphicFramePr>
+              <a:graphicFrameLocks xmlns:a="http://schemas.openxmlformats.org/drawingml/2006/main" noChangeAspect="1"/>
+            </wp:cNvGraphicFramePr>
+            <a:graphic xmlns:a="http://schemas.openxmlformats.org/drawingml/2006/main">
+              <a:graphicData uri="http://schemas.openxmlformats.org/drawingml/2006/picture">
+                <pic:pic xmlns:pic="http://schemas.openxmlformats.org/drawingml/2006/picture">
+                  <pic:nvPicPr>
+                    <pic:cNvPr id="844167931" name="Рисунок 844167931"/>
+                    <pic:cNvPicPr/>
+                  </pic:nvPicPr>
+                  <pic:blipFill>
+                    <a:blip r:embed="rId13">
+                      <a:extLst>
+                        <a:ext uri="{28A0092B-C50C-407E-A947-70E740481C1C}">
+                          <a14:useLocalDpi xmlns:a14="http://schemas.microsoft.com/office/drawing/2010/main" val="0"/>
+                        </a:ext>
+                      </a:extLst>
+                    </a:blip>
+                    <a:stretch>
+                      <a:fillRect/>
+                    </a:stretch>
+                  </pic:blipFill>
+                  <pic:spPr>
+                    <a:xfrm>
+                      <a:off x="0" y="0"/>
+                      <a:ext cx="5942965" cy="6145530"/>
+                    </a:xfrm>
+                    <a:prstGeom prst="rect">
+                      <a:avLst/>
+                    </a:prstGeom>
+                  </pic:spPr>
+                </pic:pic>
+              </a:graphicData>
+            </a:graphic>
+          </wp:inline>
+        </w:drawing>
+      </w:r>
+    </w:p>
+    <w:p>
+      <w:pPr>
+        <w:pStyle w:val="af"/>
+      </w:pPr>
+      <w:r>
+        <w:t>Рисунок Б.</w:t>
+      </w:r>
+      <w:r>
+        <w:t>3</w:t>
+      </w:r>
+      <w:r>
+        <w:t xml:space="preserve"> – </w:t>
+      </w:r>
+      <w:r>
+        <w:rPr>
+          <w:lang w:val="en-US"/>
+        </w:rPr>
+        <w:t>UML</w:t>
+      </w:r>
+      <w:r>
+        <w:t>-</w:t>
+      </w:r>
+      <w:r>
+        <w:t xml:space="preserve">диаграмма последовательности </w:t>
+      </w:r>
+      <w:r>
+        <w:t>выхода из аккаунта</w:t>
+      </w:r>
+    </w:p>
+    <w:p>
+      <w:pPr>
+        <w:pStyle w:val="af"/>
+      </w:pPr>
+      <w:r>
+        <w:rPr>
+          <w:noProof/>
+        </w:rPr>
+        <w:lastRenderedPageBreak/>
+        <w:drawing>
+          <wp:inline distT="0" distB="0" distL="0" distR="0" wp14:anchorId="43CF6108" wp14:editId="3D176C71">
+            <wp:extent cx="5942965" cy="8975725"/>
+            <wp:effectExtent l="0" t="0" r="635" b="0"/>
+            <wp:docPr id="114883720" name="Рисунок 5"/>
+            <wp:cNvGraphicFramePr>
+              <a:graphicFrameLocks xmlns:a="http://schemas.openxmlformats.org/drawingml/2006/main" noChangeAspect="1"/>
+            </wp:cNvGraphicFramePr>
+            <a:graphic xmlns:a="http://schemas.openxmlformats.org/drawingml/2006/main">
+              <a:graphicData uri="http://schemas.openxmlformats.org/drawingml/2006/picture">
+                <pic:pic xmlns:pic="http://schemas.openxmlformats.org/drawingml/2006/picture">
+                  <pic:nvPicPr>
+                    <pic:cNvPr id="114883720" name="Рисунок 114883720"/>
+                    <pic:cNvPicPr/>
+                  </pic:nvPicPr>
+                  <pic:blipFill>
+                    <a:blip r:embed="rId14">
+                      <a:extLst>
+                        <a:ext uri="{28A0092B-C50C-407E-A947-70E740481C1C}">
+                          <a14:useLocalDpi xmlns:a14="http://schemas.microsoft.com/office/drawing/2010/main" val="0"/>
+                        </a:ext>
+                      </a:extLst>
+                    </a:blip>
+                    <a:stretch>
+                      <a:fillRect/>
+                    </a:stretch>
+                  </pic:blipFill>
+                  <pic:spPr>
+                    <a:xfrm>
+                      <a:off x="0" y="0"/>
+                      <a:ext cx="5942965" cy="8975725"/>
+                    </a:xfrm>
+                    <a:prstGeom prst="rect">
+                      <a:avLst/>
+                    </a:prstGeom>
+                  </pic:spPr>
+                </pic:pic>
+              </a:graphicData>
+            </a:graphic>
+          </wp:inline>
+        </w:drawing>
+      </w:r>
+    </w:p>
+    <w:p>
+      <w:pPr>
+        <w:pStyle w:val="af"/>
+      </w:pPr>
+      <w:r>
+        <w:t>Рисунок Б.</w:t>
+      </w:r>
+      <w:r>
+        <w:t>4</w:t>
+      </w:r>
+      <w:r>
+        <w:t xml:space="preserve"> – </w:t>
+      </w:r>
+      <w:r>
+        <w:rPr>
+          <w:lang w:val="en-US"/>
+        </w:rPr>
+        <w:t>UML</w:t>
+      </w:r>
+      <w:r>
+        <w:t>-</w:t>
+      </w:r>
+      <w:r>
+        <w:t xml:space="preserve">диаграмма последовательности </w:t>
+      </w:r>
+      <w:r>
+        <w:t>добавления участника</w:t>
+      </w:r>
+    </w:p>
+    <w:p>
+      <w:pPr>
+        <w:pStyle w:val="af"/>
+      </w:pPr>
+      <w:r>
+        <w:rPr>
+          <w:noProof/>
+        </w:rPr>
+        <w:lastRenderedPageBreak/>
+        <w:drawing>
+          <wp:inline distT="0" distB="0" distL="0" distR="0" wp14:anchorId="4E895905" wp14:editId="6C0382F7">
+            <wp:extent cx="5942965" cy="5747385"/>
+            <wp:effectExtent l="0" t="0" r="635" b="5715"/>
+            <wp:docPr id="404993533" name="Рисунок 6"/>
+            <wp:cNvGraphicFramePr>
+              <a:graphicFrameLocks xmlns:a="http://schemas.openxmlformats.org/drawingml/2006/main" noChangeAspect="1"/>
+            </wp:cNvGraphicFramePr>
+            <a:graphic xmlns:a="http://schemas.openxmlformats.org/drawingml/2006/main">
+              <a:graphicData uri="http://schemas.openxmlformats.org/drawingml/2006/picture">
+                <pic:pic xmlns:pic="http://schemas.openxmlformats.org/drawingml/2006/picture">
+                  <pic:nvPicPr>
+                    <pic:cNvPr id="404993533" name="Рисунок 404993533"/>
+                    <pic:cNvPicPr/>
+                  </pic:nvPicPr>
+                  <pic:blipFill>
+                    <a:blip r:embed="rId15">
+                      <a:extLst>
+                        <a:ext uri="{28A0092B-C50C-407E-A947-70E740481C1C}">
+                          <a14:useLocalDpi xmlns:a14="http://schemas.microsoft.com/office/drawing/2010/main" val="0"/>
+                        </a:ext>
+                      </a:extLst>
+                    </a:blip>
+                    <a:stretch>
+                      <a:fillRect/>
+                    </a:stretch>
+                  </pic:blipFill>
+                  <pic:spPr>
+                    <a:xfrm>
+                      <a:off x="0" y="0"/>
+                      <a:ext cx="5942965" cy="5747385"/>
+                    </a:xfrm>
+                    <a:prstGeom prst="rect">
+                      <a:avLst/>
+                    </a:prstGeom>
+                  </pic:spPr>
+                </pic:pic>
+              </a:graphicData>
+            </a:graphic>
+          </wp:inline>
+        </w:drawing>
+      </w:r>
+    </w:p>
+    <w:p>
+      <w:pPr>
+        <w:pStyle w:val="af"/>
+        <w:sectPr>
+          <w:pgSz w:w="11909" w:h="16834"/>
+          <w:pgMar w:top="1133" w:right="850" w:bottom="1133" w:left="1700" w:header="720" w:footer="720" w:gutter="0"/>
+          <w:cols w:space="720"/>
+          <w:docGrid w:linePitch="326"/>
+        </w:sectPr>
+      </w:pPr>
+      <w:r>
+        <w:t>Рисунок Б.</w:t>
+      </w:r>
+      <w:r>
+        <w:t>5</w:t>
+      </w:r>
+      <w:r>
+        <w:t xml:space="preserve"> – </w:t>
+      </w:r>
+      <w:r>
+        <w:rPr>
+          <w:lang w:val="en-US"/>
+        </w:rPr>
+        <w:t>UML</w:t>
+      </w:r>
+      <w:r>
+        <w:t>-</w:t>
+      </w:r>
+      <w:r>
+        <w:t xml:space="preserve">диаграмма последовательности </w:t>
+      </w:r>
+      <w:r>
+        <w:t>отправки сообщения</w:t>
+      </w:r>
+    </w:p>
+    <w:p>
+      <w:pPr>
+        <w:pStyle w:val="af"/>
+      </w:pPr>
+      <w:r>
+        <w:rPr>
+          <w:noProof/>
+        </w:rPr>
+        <w:lastRenderedPageBreak/>
+        <w:drawing>
+          <wp:inline distT="0" distB="0" distL="0" distR="0" wp14:anchorId="1B30F52E" wp14:editId="1CED5D31">
+            <wp:extent cx="6940550" cy="5942965"/>
+            <wp:effectExtent l="0" t="0" r="0" b="635"/>
+            <wp:docPr id="1225869227" name="Рисунок 8"/>
+            <wp:cNvGraphicFramePr>
+              <a:graphicFrameLocks xmlns:a="http://schemas.openxmlformats.org/drawingml/2006/main" noChangeAspect="1"/>
+            </wp:cNvGraphicFramePr>
+            <a:graphic xmlns:a="http://schemas.openxmlformats.org/drawingml/2006/main">
+              <a:graphicData uri="http://schemas.openxmlformats.org/drawingml/2006/picture">
+                <pic:pic xmlns:pic="http://schemas.openxmlformats.org/drawingml/2006/picture">
+                  <pic:nvPicPr>
+                    <pic:cNvPr id="1225869227" name="Рисунок 1225869227"/>
+                    <pic:cNvPicPr/>
+                  </pic:nvPicPr>
+                  <pic:blipFill>
+                    <a:blip r:embed="rId16">
+                      <a:extLst>
+                        <a:ext uri="{28A0092B-C50C-407E-A947-70E740481C1C}">
+                          <a14:useLocalDpi xmlns:a14="http://schemas.microsoft.com/office/drawing/2010/main" val="0"/>
+                        </a:ext>
+                      </a:extLst>
+                    </a:blip>
+                    <a:stretch>
+                      <a:fillRect/>
+                    </a:stretch>
+                  </pic:blipFill>
+                  <pic:spPr>
+                    <a:xfrm>
+                      <a:off x="0" y="0"/>
+                      <a:ext cx="6940550" cy="5942965"/>
+                    </a:xfrm>
+                    <a:prstGeom prst="rect">
+                      <a:avLst/>
+                    </a:prstGeom>
+                  </pic:spPr>
+                </pic:pic>
+              </a:graphicData>
+            </a:graphic>
+          </wp:inline>
+        </w:drawing>
+      </w:r>
+    </w:p>
+    <w:p>
+      <w:pPr>
+        <w:pStyle w:val="af"/>
+        <w:sectPr>
+          <w:pgSz w:w="16834" w:h="11909" w:orient="landscape"/>
+          <w:pgMar w:top="851" w:right="1134" w:bottom="851" w:left="1134" w:header="720" w:footer="720" w:gutter="0"/>
+          <w:cols w:space="720"/>
+          <w:docGrid w:linePitch="326"/>
+        </w:sectPr>
+      </w:pPr>
+      <w:r>
+        <w:t>Рисунок Б.</w:t>
+      </w:r>
+      <w:r>
+        <w:t>6</w:t>
+      </w:r>
+      <w:r>
+        <w:t xml:space="preserve"> – </w:t>
+      </w:r>
+      <w:r>
+        <w:rPr>
+          <w:lang w:val="en-US"/>
+        </w:rPr>
+        <w:t>UML</w:t>
+      </w:r>
+      <w:r>
+        <w:t>-</w:t>
+      </w:r>
+      <w:r>
+        <w:t xml:space="preserve">диаграмма последовательности </w:t>
+      </w:r>
+      <w:r>
+        <w:t>получения списка чатов</w:t>
+      </w:r>
+    </w:p>
+    <w:p>
+      <w:pPr>
+        <w:pStyle w:val="af"/>
+      </w:pPr>
+      <w:r>
+        <w:rPr>
+          <w:noProof/>
+        </w:rPr>
+        <w:lastRenderedPageBreak/>
+        <w:drawing>
+          <wp:inline distT="0" distB="0" distL="0" distR="0" wp14:anchorId="63CA73A8" wp14:editId="341DEB43">
+            <wp:extent cx="5941695" cy="6294755"/>
+            <wp:effectExtent l="0" t="0" r="1905" b="0"/>
+            <wp:docPr id="1249396996" name="Рисунок 9"/>
+            <wp:cNvGraphicFramePr>
+              <a:graphicFrameLocks xmlns:a="http://schemas.openxmlformats.org/drawingml/2006/main" noChangeAspect="1"/>
+            </wp:cNvGraphicFramePr>
+            <a:graphic xmlns:a="http://schemas.openxmlformats.org/drawingml/2006/main">
+              <a:graphicData uri="http://schemas.openxmlformats.org/drawingml/2006/picture">
+                <pic:pic xmlns:pic="http://schemas.openxmlformats.org/drawingml/2006/picture">
+                  <pic:nvPicPr>
+                    <pic:cNvPr id="1249396996" name="Рисунок 1249396996"/>
+                    <pic:cNvPicPr/>
+                  </pic:nvPicPr>
+                  <pic:blipFill>
+                    <a:blip r:embed="rId17">
+                      <a:extLst>
+                        <a:ext uri="{28A0092B-C50C-407E-A947-70E740481C1C}">
+                          <a14:useLocalDpi xmlns:a14="http://schemas.microsoft.com/office/drawing/2010/main" val="0"/>
+                        </a:ext>
+                      </a:extLst>
+                    </a:blip>
+                    <a:stretch>
+                      <a:fillRect/>
+                    </a:stretch>
+                  </pic:blipFill>
+                  <pic:spPr>
+                    <a:xfrm>
+                      <a:off x="0" y="0"/>
+                      <a:ext cx="5941695" cy="6294755"/>
+                    </a:xfrm>
+                    <a:prstGeom prst="rect">
+                      <a:avLst/>
+                    </a:prstGeom>
+                  </pic:spPr>
+                </pic:pic>
+              </a:graphicData>
+            </a:graphic>
+          </wp:inline>
+        </w:drawing>
+      </w:r>
+    </w:p>
+    <w:p>
+      <w:pPr>
+        <w:pStyle w:val="af"/>
+      </w:pPr>
+      <w:r>
+        <w:t>Рисунок Б.</w:t>
+      </w:r>
+      <w:r>
+        <w:t>7</w:t>
+      </w:r>
+      <w:r>
+        <w:t xml:space="preserve"> – </w:t>
+      </w:r>
+      <w:r>
+        <w:rPr>
+          <w:lang w:val="en-US"/>
+        </w:rPr>
+        <w:t>UML</w:t>
+      </w:r>
+      <w:r>
+        <w:t>-</w:t>
+      </w:r>
+      <w:r>
+        <w:t xml:space="preserve">диаграмма последовательности </w:t>
+      </w:r>
+      <w:r>
+        <w:t>редактирования сообщения</w:t>
+      </w:r>
+    </w:p>
+    <w:p>
+      <w:pPr>
+        <w:pStyle w:val="af"/>
+      </w:pPr>
+      <w:r>
+        <w:rPr>
+          <w:noProof/>
+        </w:rPr>
+        <w:lastRenderedPageBreak/>
+        <w:drawing>
+          <wp:inline distT="0" distB="0" distL="0" distR="0" wp14:anchorId="6CD9DE3C" wp14:editId="002237BE">
+            <wp:extent cx="5941695" cy="6852920"/>
+            <wp:effectExtent l="0" t="0" r="1905" b="5080"/>
+            <wp:docPr id="1321538055" name="Рисунок 10"/>
+            <wp:cNvGraphicFramePr>
+              <a:graphicFrameLocks xmlns:a="http://schemas.openxmlformats.org/drawingml/2006/main" noChangeAspect="1"/>
+            </wp:cNvGraphicFramePr>
+            <a:graphic xmlns:a="http://schemas.openxmlformats.org/drawingml/2006/main">
+              <a:graphicData uri="http://schemas.openxmlformats.org/drawingml/2006/picture">
+                <pic:pic xmlns:pic="http://schemas.openxmlformats.org/drawingml/2006/picture">
+                  <pic:nvPicPr>
+                    <pic:cNvPr id="1321538055" name="Рисунок 1321538055"/>
+                    <pic:cNvPicPr/>
+                  </pic:nvPicPr>
+                  <pic:blipFill>
+                    <a:blip r:embed="rId18">
+                      <a:extLst>
+                        <a:ext uri="{28A0092B-C50C-407E-A947-70E740481C1C}">
+                          <a14:useLocalDpi xmlns:a14="http://schemas.microsoft.com/office/drawing/2010/main" val="0"/>
+                        </a:ext>
+                      </a:extLst>
+                    </a:blip>
+                    <a:stretch>
+                      <a:fillRect/>
+                    </a:stretch>
+                  </pic:blipFill>
+                  <pic:spPr>
+                    <a:xfrm>
+                      <a:off x="0" y="0"/>
+                      <a:ext cx="5941695" cy="6852920"/>
+                    </a:xfrm>
+                    <a:prstGeom prst="rect">
+                      <a:avLst/>
+                    </a:prstGeom>
+                  </pic:spPr>
+                </pic:pic>
+              </a:graphicData>
+            </a:graphic>
+          </wp:inline>
+        </w:drawing>
+      </w:r>
+    </w:p>
+    <w:p>
+      <w:pPr>
+        <w:pStyle w:val="af"/>
+        <w:sectPr>
+          <w:pgSz w:w="11909" w:h="16834"/>
+          <w:pgMar w:top="1134" w:right="851" w:bottom="1134" w:left="1701" w:header="720" w:footer="720" w:gutter="0"/>
+          <w:cols w:space="720"/>
+          <w:docGrid w:linePitch="326"/>
+        </w:sectPr>
+      </w:pPr>
+      <w:r>
+        <w:t>Рисунок Б.</w:t>
+      </w:r>
+      <w:r>
+        <w:t>8</w:t>
+      </w:r>
+      <w:r>
+        <w:t xml:space="preserve"> – </w:t>
+      </w:r>
+      <w:r>
+        <w:rPr>
+          <w:lang w:val="en-US"/>
+        </w:rPr>
+        <w:t>UML</w:t>
+      </w:r>
+      <w:r>
+        <w:t>-</w:t>
+      </w:r>
+      <w:r>
+        <w:t>диаграмма последовательности</w:t>
+      </w:r>
+      <w:r>
+        <w:t xml:space="preserve"> смены пароля</w:t>
+      </w:r>
+    </w:p>
+    <w:p>
+      <w:pPr>
+        <w:pStyle w:val="af"/>
+      </w:pPr>
+    </w:p>
+    <w:p>
+      <w:pPr>
+        <w:pStyle w:val="af"/>
+      </w:pPr>
+      <w:r>
+        <w:rPr>
+          <w:noProof/>
+        </w:rPr>
+        <w:lastRenderedPageBreak/>
+        <w:drawing>
+          <wp:inline distT="0" distB="0" distL="0" distR="0" wp14:anchorId="60D05C25" wp14:editId="1DFE1B06">
+            <wp:extent cx="5029200" cy="9249410"/>
+            <wp:effectExtent l="0" t="0" r="0" b="8890"/>
+            <wp:docPr id="2131908092" name="Рисунок 11"/>
+            <wp:cNvGraphicFramePr>
+              <a:graphicFrameLocks xmlns:a="http://schemas.openxmlformats.org/drawingml/2006/main" noChangeAspect="1"/>
+            </wp:cNvGraphicFramePr>
+            <a:graphic xmlns:a="http://schemas.openxmlformats.org/drawingml/2006/main">
+              <a:graphicData uri="http://schemas.openxmlformats.org/drawingml/2006/picture">
+                <pic:pic xmlns:pic="http://schemas.openxmlformats.org/drawingml/2006/picture">
+                  <pic:nvPicPr>
+                    <pic:cNvPr id="2131908092" name="Рисунок 2131908092"/>
+                    <pic:cNvPicPr/>
+                  </pic:nvPicPr>
+                  <pic:blipFill>
+                    <a:blip r:embed="rId19">
+                      <a:extLst>
+                        <a:ext uri="{28A0092B-C50C-407E-A947-70E740481C1C}">
+                          <a14:useLocalDpi xmlns:a14="http://schemas.microsoft.com/office/drawing/2010/main" val="0"/>
+                        </a:ext>
+                      </a:extLst>
+                    </a:blip>
+                    <a:stretch>
+                      <a:fillRect/>
+                    </a:stretch>
+                  </pic:blipFill>
+                  <pic:spPr>
+                    <a:xfrm>
+                      <a:off x="0" y="0"/>
+                      <a:ext cx="5029200" cy="9249410"/>
+                    </a:xfrm>
+                    <a:prstGeom prst="rect">
+                      <a:avLst/>
+                    </a:prstGeom>
+                  </pic:spPr>
+                </pic:pic>
+              </a:graphicData>
+            </a:graphic>
+          </wp:inline>
+        </w:drawing>
+      </w:r>
+    </w:p>
+    <w:p>
+      <w:pPr>
+        <w:pStyle w:val="af"/>
+        <w:sectPr>
+          <w:type w:val="continuous"/>
+          <w:pgSz w:w="11909" w:h="16834"/>
+          <w:pgMar w:top="567" w:right="851" w:bottom="1134" w:left="1701" w:header="720" w:footer="720" w:gutter="0"/>
+          <w:cols w:space="720"/>
+          <w:docGrid w:linePitch="326"/>
+        </w:sectPr>
+      </w:pPr>
+      <w:r>
+        <w:t>Рисунок Б.</w:t>
+      </w:r>
+      <w:r>
+        <w:t>9</w:t>
+      </w:r>
+      <w:r>
+        <w:t xml:space="preserve"> – </w:t>
+      </w:r>
+      <w:r>
+        <w:rPr>
+          <w:lang w:val="en-US"/>
+        </w:rPr>
+        <w:t>UML</w:t>
+      </w:r>
+      <w:r>
+        <w:t>-</w:t>
+      </w:r>
+      <w:r>
+        <w:t xml:space="preserve">диаграмма последовательности </w:t>
+      </w:r>
+      <w:r>
+        <w:t>создания чата</w:t>
+      </w:r>
+    </w:p>
+    <w:p>
+      <w:pPr>
+        <w:pStyle w:val="af"/>
+      </w:pPr>
+      <w:r>
+        <w:rPr>
+          <w:noProof/>
+        </w:rPr>
+        <w:lastRenderedPageBreak/>
+        <w:drawing>
+          <wp:inline distT="0" distB="0" distL="0" distR="0" wp14:anchorId="4216D1D6" wp14:editId="73559409">
+            <wp:extent cx="5941695" cy="7181215"/>
+            <wp:effectExtent l="0" t="0" r="1905" b="635"/>
+            <wp:docPr id="1281404502" name="Рисунок 12"/>
+            <wp:cNvGraphicFramePr>
+              <a:graphicFrameLocks xmlns:a="http://schemas.openxmlformats.org/drawingml/2006/main" noChangeAspect="1"/>
+            </wp:cNvGraphicFramePr>
+            <a:graphic xmlns:a="http://schemas.openxmlformats.org/drawingml/2006/main">
+              <a:graphicData uri="http://schemas.openxmlformats.org/drawingml/2006/picture">
+                <pic:pic xmlns:pic="http://schemas.openxmlformats.org/drawingml/2006/picture">
+                  <pic:nvPicPr>
+                    <pic:cNvPr id="1281404502" name="Рисунок 1281404502"/>
+                    <pic:cNvPicPr/>
+                  </pic:nvPicPr>
+                  <pic:blipFill>
+                    <a:blip r:embed="rId20">
+                      <a:extLst>
+                        <a:ext uri="{28A0092B-C50C-407E-A947-70E740481C1C}">
+                          <a14:useLocalDpi xmlns:a14="http://schemas.microsoft.com/office/drawing/2010/main" val="0"/>
+                        </a:ext>
+                      </a:extLst>
+                    </a:blip>
+                    <a:stretch>
+                      <a:fillRect/>
+                    </a:stretch>
+                  </pic:blipFill>
+                  <pic:spPr>
+                    <a:xfrm>
+                      <a:off x="0" y="0"/>
+                      <a:ext cx="5941695" cy="7181215"/>
+                    </a:xfrm>
+                    <a:prstGeom prst="rect">
+                      <a:avLst/>
+                    </a:prstGeom>
+                  </pic:spPr>
+                </pic:pic>
+              </a:graphicData>
+            </a:graphic>
+          </wp:inline>
+        </w:drawing>
+      </w:r>
+    </w:p>
+    <w:p>
+      <w:pPr>
+        <w:pStyle w:val="af"/>
+      </w:pPr>
+      <w:r>
+        <w:t>Рисунок Б.1</w:t>
+      </w:r>
+      <w:r>
+        <w:t>0</w:t>
+      </w:r>
+      <w:r>
+        <w:t xml:space="preserve"> – </w:t>
+      </w:r>
+      <w:r>
+        <w:rPr>
+          <w:lang w:val="en-US"/>
+        </w:rPr>
+        <w:t>UML</w:t>
+      </w:r>
+      <w:r>
+        <w:t>-</w:t>
+      </w:r>
+      <w:r>
+        <w:t>диаграмма последовательности</w:t>
+      </w:r>
+      <w:r>
+        <w:t xml:space="preserve"> удаления сообщения</w:t>
+      </w:r>
+    </w:p>
     <w:sectPr>
-      <w:footerReference w:type="default" r:id="rId8"/>
-      <w:footerReference w:type="first" r:id="rId9"/>
+      <w:type w:val="continuous"/>
       <w:pgSz w:w="11909" w:h="16834"/>
-      <w:pgMar w:top="1133" w:right="850" w:bottom="1133" w:left="1700" w:header="720" w:footer="720" w:gutter="0"/>
-      <w:pgNumType w:start="1"/>
+      <w:pgMar w:top="1134" w:right="851" w:bottom="1134" w:left="1701" w:header="720" w:footer="720" w:gutter="0"/>
       <w:cols w:space="720"/>
-      <w:titlePg/>
+      <w:docGrid w:linePitch="326"/>
     </w:sectPr>
   </w:body>
 </w:document>
@@ -699,6 +1874,119 @@
     </w:lvl>
   </w:abstractNum>
   <w:abstractNum w:abstractNumId="1" w15:restartNumberingAfterBreak="0">
+    <w:nsid w:val="37434A68"/>
+    <w:multiLevelType w:val="multilevel"/>
+    <w:tmpl w:val="539C15E4"/>
+    <w:lvl w:ilvl="0">
+      <w:start w:val="1"/>
+      <w:numFmt w:val="decimal"/>
+      <w:lvlText w:val="%1."/>
+      <w:lvlJc w:val="left"/>
+      <w:pPr>
+        <w:ind w:left="360" w:hanging="360"/>
+      </w:pPr>
+      <w:rPr>
+        <w:rFonts w:hint="default"/>
+      </w:rPr>
+    </w:lvl>
+    <w:lvl w:ilvl="1">
+      <w:start w:val="1"/>
+      <w:numFmt w:val="decimal"/>
+      <w:lvlText w:val="%1.%2."/>
+      <w:lvlJc w:val="left"/>
+      <w:pPr>
+        <w:ind w:left="1068" w:hanging="360"/>
+      </w:pPr>
+      <w:rPr>
+        <w:rFonts w:hint="default"/>
+      </w:rPr>
+    </w:lvl>
+    <w:lvl w:ilvl="2">
+      <w:start w:val="1"/>
+      <w:numFmt w:val="decimal"/>
+      <w:lvlText w:val="%1.%2.%3."/>
+      <w:lvlJc w:val="left"/>
+      <w:pPr>
+        <w:ind w:left="2136" w:hanging="720"/>
+      </w:pPr>
+      <w:rPr>
+        <w:rFonts w:hint="default"/>
+      </w:rPr>
+    </w:lvl>
+    <w:lvl w:ilvl="3">
+      <w:start w:val="1"/>
+      <w:numFmt w:val="decimal"/>
+      <w:lvlText w:val="%1.%2.%3.%4."/>
+      <w:lvlJc w:val="left"/>
+      <w:pPr>
+        <w:ind w:left="2844" w:hanging="720"/>
+      </w:pPr>
+      <w:rPr>
+        <w:rFonts w:hint="default"/>
+      </w:rPr>
+    </w:lvl>
+    <w:lvl w:ilvl="4">
+      <w:start w:val="1"/>
+      <w:numFmt w:val="decimal"/>
+      <w:lvlText w:val="%1.%2.%3.%4.%5."/>
+      <w:lvlJc w:val="left"/>
+      <w:pPr>
+        <w:ind w:left="3912" w:hanging="1080"/>
+      </w:pPr>
+      <w:rPr>
+        <w:rFonts w:hint="default"/>
+      </w:rPr>
+    </w:lvl>
+    <w:lvl w:ilvl="5">
+      <w:start w:val="1"/>
+      <w:numFmt w:val="decimal"/>
+      <w:lvlText w:val="%1.%2.%3.%4.%5.%6."/>
+      <w:lvlJc w:val="left"/>
+      <w:pPr>
+        <w:ind w:left="4620" w:hanging="1080"/>
+      </w:pPr>
+      <w:rPr>
+        <w:rFonts w:hint="default"/>
+      </w:rPr>
+    </w:lvl>
+    <w:lvl w:ilvl="6">
+      <w:start w:val="1"/>
+      <w:numFmt w:val="decimal"/>
+      <w:lvlText w:val="%1.%2.%3.%4.%5.%6.%7."/>
+      <w:lvlJc w:val="left"/>
+      <w:pPr>
+        <w:ind w:left="5688" w:hanging="1440"/>
+      </w:pPr>
+      <w:rPr>
+        <w:rFonts w:hint="default"/>
+      </w:rPr>
+    </w:lvl>
+    <w:lvl w:ilvl="7">
+      <w:start w:val="1"/>
+      <w:numFmt w:val="decimal"/>
+      <w:lvlText w:val="%1.%2.%3.%4.%5.%6.%7.%8."/>
+      <w:lvlJc w:val="left"/>
+      <w:pPr>
+        <w:ind w:left="6396" w:hanging="1440"/>
+      </w:pPr>
+      <w:rPr>
+        <w:rFonts w:hint="default"/>
+      </w:rPr>
+    </w:lvl>
+    <w:lvl w:ilvl="8">
+      <w:start w:val="1"/>
+      <w:numFmt w:val="decimal"/>
+      <w:lvlText w:val="%1.%2.%3.%4.%5.%6.%7.%8.%9."/>
+      <w:lvlJc w:val="left"/>
+      <w:pPr>
+        <w:ind w:left="7464" w:hanging="1800"/>
+      </w:pPr>
+      <w:rPr>
+        <w:rFonts w:hint="default"/>
+      </w:rPr>
+    </w:lvl>
+  </w:abstractNum>
+  <w:abstractNum w:abstractNumId="2" w15:restartNumberingAfterBreak="0">
     <w:nsid w:val="38753164"/>
     <w:multiLevelType w:val="multilevel"/>
     <w:tmpl w:val="7D243F5E"/>
@@ -821,7 +2109,7 @@
       </w:rPr>
     </w:lvl>
   </w:abstractNum>
-  <w:abstractNum w:abstractNumId="2" w15:restartNumberingAfterBreak="0">
+  <w:abstractNum w:abstractNumId="3" w15:restartNumberingAfterBreak="0">
     <w:nsid w:val="49895793"/>
     <w:multiLevelType w:val="multilevel"/>
     <w:tmpl w:val="A720F002"/>
@@ -945,13 +2233,16 @@
     </w:lvl>
   </w:abstractNum>
   <w:num w:numId="1" w16cid:durableId="1547372404">
-    <w:abstractNumId w:val="1"/>
+    <w:abstractNumId w:val="2"/>
   </w:num>
   <w:num w:numId="2" w16cid:durableId="1174149221">
     <w:abstractNumId w:val="0"/>
   </w:num>
   <w:num w:numId="3" w16cid:durableId="161313484">
-    <w:abstractNumId w:val="2"/>
+    <w:abstractNumId w:val="3"/>
+  </w:num>
+  <w:num w:numId="4" w16cid:durableId="371535712">
+    <w:abstractNumId w:val="1"/>
   </w:num>
 </w:numbering>
 </file>
@@ -1718,6 +3009,57 @@
     <w:uiPriority w:val="99"/>
     <w:rsid w:val="00116C22"/>
   </w:style>
+  <w:style w:type="paragraph" w:styleId="ae">
+    <w:name w:val="No Spacing"/>
+    <w:uiPriority w:val="1"/>
+    <w:qFormat/>
+    <w:rsid w:val="00CA0A7A"/>
+    <w:pPr>
+      <w:spacing w:line="240" w:lineRule="auto"/>
+    </w:pPr>
+  </w:style>
+  <w:style w:type="paragraph" w:customStyle="1" w:styleId="af">
+    <w:name w:val="Рисунок"/>
+    <w:basedOn w:val="a"/>
+    <w:link w:val="af0"/>
+    <w:qFormat/>
+    <w:rsid w:val="00CA0A7A"/>
+    <w:pPr>
+      <w:ind w:firstLine="0"/>
+      <w:jc w:val="center"/>
+    </w:pPr>
+    <w:rPr>
+      <w:lang w:val="ru-RU"/>
+    </w:rPr>
+  </w:style>
+  <w:style w:type="character" w:customStyle="1" w:styleId="af0">
+    <w:name w:val="Рисунок Знак"/>
+    <w:basedOn w:val="a0"/>
+    <w:link w:val="af"/>
+    <w:rsid w:val="00CA0A7A"/>
+    <w:rPr>
+      <w:lang w:val="ru-RU"/>
+    </w:rPr>
+  </w:style>
+  <w:style w:type="character" w:styleId="af1">
+    <w:name w:val="line number"/>
+    <w:basedOn w:val="a0"/>
+    <w:uiPriority w:val="99"/>
+    <w:semiHidden/>
+    <w:unhideWhenUsed/>
+    <w:rsid w:val="00B006FC"/>
+  </w:style>
+  <w:style w:type="paragraph" w:styleId="af2">
+    <w:name w:val="List Paragraph"/>
+    <w:basedOn w:val="a"/>
+    <w:uiPriority w:val="34"/>
+    <w:qFormat/>
+    <w:rsid w:val="00C37C4D"/>
+    <w:pPr>
+      <w:ind w:left="720"/>
+      <w:contextualSpacing/>
+    </w:pPr>
+  </w:style>
 </w:styles>
 </file>
 

</xml_diff>

<commit_message>
some interface pictures added
</commit_message>
<xml_diff>
--- a/УИРС_8В31_Болбин_Константинов_Осипов.docx
+++ b/УИРС_8В31_Болбин_Константинов_Осипов.docx
@@ -538,6 +538,222 @@
     <w:p>
       <w:pPr>
         <w:rPr>
+          <w:b/>
+          <w:bCs/>
+          <w:lang w:val="en-US"/>
+        </w:rPr>
+      </w:pPr>
+      <w:r>
+        <w:rPr>
+          <w:lang w:val="en-US"/>
+        </w:rPr>
+        <w:br w:type="page"/>
+      </w:r>
+    </w:p>
+    <w:p>
+      <w:pPr>
+        <w:pStyle w:val="2"/>
+        <w:rPr>
+          <w:lang w:val="ru-RU"/>
+        </w:rPr>
+      </w:pPr>
+      <w:r>
+        <w:rPr>
+          <w:lang w:val="en-US"/>
+        </w:rPr>
+        <w:lastRenderedPageBreak/>
+        <w:t xml:space="preserve">2 </w:t>
+      </w:r>
+      <w:r>
+        <w:rPr>
+          <w:lang w:val="ru-RU"/>
+        </w:rPr>
+        <w:t>Разработка интерфейса приложения</w:t>
+      </w:r>
+    </w:p>
+    <w:p>
+      <w:pPr>
+        <w:rPr>
+          <w:lang w:val="ru-RU"/>
+        </w:rPr>
+      </w:pPr>
+      <w:r>
+        <w:rPr>
+          <w:lang w:val="ru-RU"/>
+        </w:rPr>
+        <w:t xml:space="preserve">На рисунке 2 </w:t>
+      </w:r>
+      <w:r>
+        <w:rPr>
+          <w:lang w:val="ru-RU"/>
+        </w:rPr>
+        <w:t>демонстрируется интерфейс приложения: список чатов и уведомление о создании нового чата, создание нового чата и добавление пользователя.</w:t>
+      </w:r>
+    </w:p>
+    <w:p>
+      <w:pPr>
+        <w:rPr>
+          <w:lang w:val="ru-RU"/>
+        </w:rPr>
+      </w:pPr>
+    </w:p>
+    <w:tbl>
+      <w:tblPr>
+        <w:tblStyle w:val="a7"/>
+        <w:tblW w:w="0" w:type="auto"/>
+        <w:jc w:val="center"/>
+        <w:tblBorders>
+          <w:top w:val="none" w:sz="0" w:space="0" w:color="auto"/>
+          <w:left w:val="none" w:sz="0" w:space="0" w:color="auto"/>
+          <w:bottom w:val="none" w:sz="0" w:space="0" w:color="auto"/>
+          <w:right w:val="none" w:sz="0" w:space="0" w:color="auto"/>
+          <w:insideH w:val="none" w:sz="0" w:space="0" w:color="auto"/>
+          <w:insideV w:val="none" w:sz="0" w:space="0" w:color="auto"/>
+        </w:tblBorders>
+        <w:tblCellMar>
+          <w:left w:w="57" w:type="dxa"/>
+          <w:right w:w="57" w:type="dxa"/>
+        </w:tblCellMar>
+        <w:tblLook w:val="04A0" w:firstRow="1" w:lastRow="0" w:firstColumn="1" w:lastColumn="0" w:noHBand="0" w:noVBand="1"/>
+      </w:tblPr>
+      <w:tblGrid>
+        <w:gridCol w:w="2994"/>
+        <w:gridCol w:w="2994"/>
+      </w:tblGrid>
+      <w:tr>
+        <w:trPr>
+          <w:jc w:val="center"/>
+        </w:trPr>
+        <w:tc>
+          <w:tcPr>
+            <w:tcW w:w="0" w:type="auto"/>
+            <w:vAlign w:val="center"/>
+          </w:tcPr>
+          <w:p>
+            <w:pPr>
+              <w:pStyle w:val="af"/>
+            </w:pPr>
+            <w:r>
+              <w:rPr>
+                <w:noProof/>
+              </w:rPr>
+              <w:drawing>
+                <wp:inline distT="0" distB="0" distL="0" distR="0" wp14:anchorId="71671DD3" wp14:editId="55FE2B50">
+                  <wp:extent cx="1825200" cy="4057200"/>
+                  <wp:effectExtent l="0" t="0" r="3810" b="635"/>
+                  <wp:docPr id="123481061" name="Рисунок 3"/>
+                  <wp:cNvGraphicFramePr>
+                    <a:graphicFrameLocks xmlns:a="http://schemas.openxmlformats.org/drawingml/2006/main" noChangeAspect="1"/>
+                  </wp:cNvGraphicFramePr>
+                  <a:graphic xmlns:a="http://schemas.openxmlformats.org/drawingml/2006/main">
+                    <a:graphicData uri="http://schemas.openxmlformats.org/drawingml/2006/picture">
+                      <pic:pic xmlns:pic="http://schemas.openxmlformats.org/drawingml/2006/picture">
+                        <pic:nvPicPr>
+                          <pic:cNvPr id="123481061" name="Рисунок 123481061"/>
+                          <pic:cNvPicPr/>
+                        </pic:nvPicPr>
+                        <pic:blipFill>
+                          <a:blip r:embed="rId9" cstate="print">
+                            <a:extLst>
+                              <a:ext uri="{28A0092B-C50C-407E-A947-70E740481C1C}">
+                                <a14:useLocalDpi xmlns:a14="http://schemas.microsoft.com/office/drawing/2010/main" val="0"/>
+                              </a:ext>
+                            </a:extLst>
+                          </a:blip>
+                          <a:stretch>
+                            <a:fillRect/>
+                          </a:stretch>
+                        </pic:blipFill>
+                        <pic:spPr>
+                          <a:xfrm>
+                            <a:off x="0" y="0"/>
+                            <a:ext cx="1825200" cy="4057200"/>
+                          </a:xfrm>
+                          <a:prstGeom prst="rect">
+                            <a:avLst/>
+                          </a:prstGeom>
+                        </pic:spPr>
+                      </pic:pic>
+                    </a:graphicData>
+                  </a:graphic>
+                </wp:inline>
+              </w:drawing>
+            </w:r>
+          </w:p>
+        </w:tc>
+        <w:tc>
+          <w:tcPr>
+            <w:tcW w:w="0" w:type="auto"/>
+            <w:vAlign w:val="center"/>
+          </w:tcPr>
+          <w:p>
+            <w:pPr>
+              <w:pStyle w:val="af"/>
+            </w:pPr>
+            <w:r>
+              <w:rPr>
+                <w:noProof/>
+              </w:rPr>
+              <w:drawing>
+                <wp:inline distT="0" distB="0" distL="0" distR="0" wp14:anchorId="38B411F3" wp14:editId="7951E654">
+                  <wp:extent cx="1825200" cy="4057200"/>
+                  <wp:effectExtent l="0" t="0" r="3810" b="635"/>
+                  <wp:docPr id="938729790" name="Рисунок 4"/>
+                  <wp:cNvGraphicFramePr>
+                    <a:graphicFrameLocks xmlns:a="http://schemas.openxmlformats.org/drawingml/2006/main" noChangeAspect="1"/>
+                  </wp:cNvGraphicFramePr>
+                  <a:graphic xmlns:a="http://schemas.openxmlformats.org/drawingml/2006/main">
+                    <a:graphicData uri="http://schemas.openxmlformats.org/drawingml/2006/picture">
+                      <pic:pic xmlns:pic="http://schemas.openxmlformats.org/drawingml/2006/picture">
+                        <pic:nvPicPr>
+                          <pic:cNvPr id="938729790" name="Рисунок 938729790"/>
+                          <pic:cNvPicPr/>
+                        </pic:nvPicPr>
+                        <pic:blipFill>
+                          <a:blip r:embed="rId10" cstate="print">
+                            <a:extLst>
+                              <a:ext uri="{28A0092B-C50C-407E-A947-70E740481C1C}">
+                                <a14:useLocalDpi xmlns:a14="http://schemas.microsoft.com/office/drawing/2010/main" val="0"/>
+                              </a:ext>
+                            </a:extLst>
+                          </a:blip>
+                          <a:stretch>
+                            <a:fillRect/>
+                          </a:stretch>
+                        </pic:blipFill>
+                        <pic:spPr>
+                          <a:xfrm>
+                            <a:off x="0" y="0"/>
+                            <a:ext cx="1825200" cy="4057200"/>
+                          </a:xfrm>
+                          <a:prstGeom prst="rect">
+                            <a:avLst/>
+                          </a:prstGeom>
+                        </pic:spPr>
+                      </pic:pic>
+                    </a:graphicData>
+                  </a:graphic>
+                </wp:inline>
+              </w:drawing>
+            </w:r>
+          </w:p>
+        </w:tc>
+      </w:tr>
+    </w:tbl>
+    <w:p>
+      <w:pPr>
+        <w:pStyle w:val="af"/>
+      </w:pPr>
+      <w:r>
+        <w:t xml:space="preserve">Рисунок 2 – Интерфейс </w:t>
+      </w:r>
+      <w:r>
+        <w:t>приложения</w:t>
+      </w:r>
+    </w:p>
+    <w:p>
+      <w:pPr>
+        <w:rPr>
           <w:lang w:val="ru-RU"/>
         </w:rPr>
       </w:pPr>
@@ -589,8 +805,8 @@
       <w:pPr>
         <w:pStyle w:val="1"/>
         <w:sectPr>
-          <w:footerReference w:type="default" r:id="rId9"/>
-          <w:footerReference w:type="first" r:id="rId10"/>
+          <w:footerReference w:type="default" r:id="rId11"/>
+          <w:footerReference w:type="first" r:id="rId12"/>
           <w:pgSz w:w="11909" w:h="16834"/>
           <w:pgMar w:top="1133" w:right="850" w:bottom="1133" w:left="1700" w:header="720" w:footer="720" w:gutter="0"/>
           <w:pgNumType w:start="1"/>
@@ -675,7 +891,7 @@
                     <pic:cNvPicPr/>
                   </pic:nvPicPr>
                   <pic:blipFill>
-                    <a:blip r:embed="rId11">
+                    <a:blip r:embed="rId13">
                       <a:extLst>
                         <a:ext uri="{28A0092B-C50C-407E-A947-70E740481C1C}">
                           <a14:useLocalDpi xmlns:a14="http://schemas.microsoft.com/office/drawing/2010/main" val="0"/>
@@ -823,7 +1039,7 @@
                     <pic:cNvPicPr/>
                   </pic:nvPicPr>
                   <pic:blipFill>
-                    <a:blip r:embed="rId12">
+                    <a:blip r:embed="rId14">
                       <a:extLst>
                         <a:ext uri="{28A0092B-C50C-407E-A947-70E740481C1C}">
                           <a14:useLocalDpi xmlns:a14="http://schemas.microsoft.com/office/drawing/2010/main" val="0"/>
@@ -901,7 +1117,7 @@
                     <pic:cNvPicPr/>
                   </pic:nvPicPr>
                   <pic:blipFill>
-                    <a:blip r:embed="rId13">
+                    <a:blip r:embed="rId15">
                       <a:extLst>
                         <a:ext uri="{28A0092B-C50C-407E-A947-70E740481C1C}">
                           <a14:useLocalDpi xmlns:a14="http://schemas.microsoft.com/office/drawing/2010/main" val="0"/>
@@ -933,13 +1149,7 @@
         <w:pStyle w:val="af"/>
       </w:pPr>
       <w:r>
-        <w:t>Рисунок Б.</w:t>
-      </w:r>
-      <w:r>
-        <w:t>2</w:t>
-      </w:r>
-      <w:r>
-        <w:t xml:space="preserve"> – </w:t>
+        <w:t xml:space="preserve">Рисунок Б.2 – </w:t>
       </w:r>
       <w:r>
         <w:rPr>
@@ -951,10 +1161,7 @@
         <w:t>-</w:t>
       </w:r>
       <w:r>
-        <w:t xml:space="preserve">диаграмма последовательности </w:t>
-      </w:r>
-      <w:r>
-        <w:t>восстановления пароля</w:t>
+        <w:t>диаграмма последовательности восстановления пароля</w:t>
       </w:r>
     </w:p>
     <w:p>
@@ -982,7 +1189,7 @@
                     <pic:cNvPicPr/>
                   </pic:nvPicPr>
                   <pic:blipFill>
-                    <a:blip r:embed="rId13">
+                    <a:blip r:embed="rId15">
                       <a:extLst>
                         <a:ext uri="{28A0092B-C50C-407E-A947-70E740481C1C}">
                           <a14:useLocalDpi xmlns:a14="http://schemas.microsoft.com/office/drawing/2010/main" val="0"/>
@@ -1014,13 +1221,7 @@
         <w:pStyle w:val="af"/>
       </w:pPr>
       <w:r>
-        <w:t>Рисунок Б.</w:t>
-      </w:r>
-      <w:r>
-        <w:t>3</w:t>
-      </w:r>
-      <w:r>
-        <w:t xml:space="preserve"> – </w:t>
+        <w:t xml:space="preserve">Рисунок Б.3 – </w:t>
       </w:r>
       <w:r>
         <w:rPr>
@@ -1032,10 +1233,7 @@
         <w:t>-</w:t>
       </w:r>
       <w:r>
-        <w:t xml:space="preserve">диаграмма последовательности </w:t>
-      </w:r>
-      <w:r>
-        <w:t>выхода из аккаунта</w:t>
+        <w:t>диаграмма последовательности выхода из аккаунта</w:t>
       </w:r>
     </w:p>
     <w:p>
@@ -1063,7 +1261,7 @@
                     <pic:cNvPicPr/>
                   </pic:nvPicPr>
                   <pic:blipFill>
-                    <a:blip r:embed="rId14">
+                    <a:blip r:embed="rId16">
                       <a:extLst>
                         <a:ext uri="{28A0092B-C50C-407E-A947-70E740481C1C}">
                           <a14:useLocalDpi xmlns:a14="http://schemas.microsoft.com/office/drawing/2010/main" val="0"/>
@@ -1095,13 +1293,7 @@
         <w:pStyle w:val="af"/>
       </w:pPr>
       <w:r>
-        <w:t>Рисунок Б.</w:t>
-      </w:r>
-      <w:r>
-        <w:t>4</w:t>
-      </w:r>
-      <w:r>
-        <w:t xml:space="preserve"> – </w:t>
+        <w:t xml:space="preserve">Рисунок Б.4 – </w:t>
       </w:r>
       <w:r>
         <w:rPr>
@@ -1113,10 +1305,7 @@
         <w:t>-</w:t>
       </w:r>
       <w:r>
-        <w:t xml:space="preserve">диаграмма последовательности </w:t>
-      </w:r>
-      <w:r>
-        <w:t>добавления участника</w:t>
+        <w:t>диаграмма последовательности добавления участника</w:t>
       </w:r>
     </w:p>
     <w:p>
@@ -1144,7 +1333,7 @@
                     <pic:cNvPicPr/>
                   </pic:nvPicPr>
                   <pic:blipFill>
-                    <a:blip r:embed="rId15">
+                    <a:blip r:embed="rId17">
                       <a:extLst>
                         <a:ext uri="{28A0092B-C50C-407E-A947-70E740481C1C}">
                           <a14:useLocalDpi xmlns:a14="http://schemas.microsoft.com/office/drawing/2010/main" val="0"/>
@@ -1182,13 +1371,7 @@
         </w:sectPr>
       </w:pPr>
       <w:r>
-        <w:t>Рисунок Б.</w:t>
-      </w:r>
-      <w:r>
-        <w:t>5</w:t>
-      </w:r>
-      <w:r>
-        <w:t xml:space="preserve"> – </w:t>
+        <w:t xml:space="preserve">Рисунок Б.5 – </w:t>
       </w:r>
       <w:r>
         <w:rPr>
@@ -1200,10 +1383,7 @@
         <w:t>-</w:t>
       </w:r>
       <w:r>
-        <w:t xml:space="preserve">диаграмма последовательности </w:t>
-      </w:r>
-      <w:r>
-        <w:t>отправки сообщения</w:t>
+        <w:t>диаграмма последовательности отправки сообщения</w:t>
       </w:r>
     </w:p>
     <w:p>
@@ -1231,7 +1411,7 @@
                     <pic:cNvPicPr/>
                   </pic:nvPicPr>
                   <pic:blipFill>
-                    <a:blip r:embed="rId16">
+                    <a:blip r:embed="rId18">
                       <a:extLst>
                         <a:ext uri="{28A0092B-C50C-407E-A947-70E740481C1C}">
                           <a14:useLocalDpi xmlns:a14="http://schemas.microsoft.com/office/drawing/2010/main" val="0"/>
@@ -1269,13 +1449,7 @@
         </w:sectPr>
       </w:pPr>
       <w:r>
-        <w:t>Рисунок Б.</w:t>
-      </w:r>
-      <w:r>
-        <w:t>6</w:t>
-      </w:r>
-      <w:r>
-        <w:t xml:space="preserve"> – </w:t>
+        <w:t xml:space="preserve">Рисунок Б.6 – </w:t>
       </w:r>
       <w:r>
         <w:rPr>
@@ -1287,10 +1461,7 @@
         <w:t>-</w:t>
       </w:r>
       <w:r>
-        <w:t xml:space="preserve">диаграмма последовательности </w:t>
-      </w:r>
-      <w:r>
-        <w:t>получения списка чатов</w:t>
+        <w:t>диаграмма последовательности получения списка чатов</w:t>
       </w:r>
     </w:p>
     <w:p>
@@ -1318,7 +1489,7 @@
                     <pic:cNvPicPr/>
                   </pic:nvPicPr>
                   <pic:blipFill>
-                    <a:blip r:embed="rId17">
+                    <a:blip r:embed="rId19">
                       <a:extLst>
                         <a:ext uri="{28A0092B-C50C-407E-A947-70E740481C1C}">
                           <a14:useLocalDpi xmlns:a14="http://schemas.microsoft.com/office/drawing/2010/main" val="0"/>
@@ -1350,13 +1521,7 @@
         <w:pStyle w:val="af"/>
       </w:pPr>
       <w:r>
-        <w:t>Рисунок Б.</w:t>
-      </w:r>
-      <w:r>
-        <w:t>7</w:t>
-      </w:r>
-      <w:r>
-        <w:t xml:space="preserve"> – </w:t>
+        <w:t xml:space="preserve">Рисунок Б.7 – </w:t>
       </w:r>
       <w:r>
         <w:rPr>
@@ -1368,10 +1533,7 @@
         <w:t>-</w:t>
       </w:r>
       <w:r>
-        <w:t xml:space="preserve">диаграмма последовательности </w:t>
-      </w:r>
-      <w:r>
-        <w:t>редактирования сообщения</w:t>
+        <w:t>диаграмма последовательности редактирования сообщения</w:t>
       </w:r>
     </w:p>
     <w:p>
@@ -1399,7 +1561,7 @@
                     <pic:cNvPicPr/>
                   </pic:nvPicPr>
                   <pic:blipFill>
-                    <a:blip r:embed="rId18">
+                    <a:blip r:embed="rId20">
                       <a:extLst>
                         <a:ext uri="{28A0092B-C50C-407E-A947-70E740481C1C}">
                           <a14:useLocalDpi xmlns:a14="http://schemas.microsoft.com/office/drawing/2010/main" val="0"/>
@@ -1437,13 +1599,7 @@
         </w:sectPr>
       </w:pPr>
       <w:r>
-        <w:t>Рисунок Б.</w:t>
-      </w:r>
-      <w:r>
-        <w:t>8</w:t>
-      </w:r>
-      <w:r>
-        <w:t xml:space="preserve"> – </w:t>
+        <w:t xml:space="preserve">Рисунок Б.8 – </w:t>
       </w:r>
       <w:r>
         <w:rPr>
@@ -1455,10 +1611,7 @@
         <w:t>-</w:t>
       </w:r>
       <w:r>
-        <w:t>диаграмма последовательности</w:t>
-      </w:r>
-      <w:r>
-        <w:t xml:space="preserve"> смены пароля</w:t>
+        <w:t>диаграмма последовательности смены пароля</w:t>
       </w:r>
     </w:p>
     <w:p>
@@ -1491,7 +1644,7 @@
                     <pic:cNvPicPr/>
                   </pic:nvPicPr>
                   <pic:blipFill>
-                    <a:blip r:embed="rId19">
+                    <a:blip r:embed="rId21">
                       <a:extLst>
                         <a:ext uri="{28A0092B-C50C-407E-A947-70E740481C1C}">
                           <a14:useLocalDpi xmlns:a14="http://schemas.microsoft.com/office/drawing/2010/main" val="0"/>
@@ -1530,13 +1683,7 @@
         </w:sectPr>
       </w:pPr>
       <w:r>
-        <w:t>Рисунок Б.</w:t>
-      </w:r>
-      <w:r>
-        <w:t>9</w:t>
-      </w:r>
-      <w:r>
-        <w:t xml:space="preserve"> – </w:t>
+        <w:t xml:space="preserve">Рисунок Б.9 – </w:t>
       </w:r>
       <w:r>
         <w:rPr>
@@ -1548,10 +1695,7 @@
         <w:t>-</w:t>
       </w:r>
       <w:r>
-        <w:t xml:space="preserve">диаграмма последовательности </w:t>
-      </w:r>
-      <w:r>
-        <w:t>создания чата</w:t>
+        <w:t>диаграмма последовательности создания чата</w:t>
       </w:r>
     </w:p>
     <w:p>
@@ -1579,7 +1723,7 @@
                     <pic:cNvPicPr/>
                   </pic:nvPicPr>
                   <pic:blipFill>
-                    <a:blip r:embed="rId20">
+                    <a:blip r:embed="rId22">
                       <a:extLst>
                         <a:ext uri="{28A0092B-C50C-407E-A947-70E740481C1C}">
                           <a14:useLocalDpi xmlns:a14="http://schemas.microsoft.com/office/drawing/2010/main" val="0"/>
@@ -1611,13 +1755,7 @@
         <w:pStyle w:val="af"/>
       </w:pPr>
       <w:r>
-        <w:t>Рисунок Б.1</w:t>
-      </w:r>
-      <w:r>
-        <w:t>0</w:t>
-      </w:r>
-      <w:r>
-        <w:t xml:space="preserve"> – </w:t>
+        <w:t xml:space="preserve">Рисунок Б.10 – </w:t>
       </w:r>
       <w:r>
         <w:rPr>
@@ -1629,10 +1767,7 @@
         <w:t>-</w:t>
       </w:r>
       <w:r>
-        <w:t>диаграмма последовательности</w:t>
-      </w:r>
-      <w:r>
-        <w:t xml:space="preserve"> удаления сообщения</w:t>
+        <w:t>диаграмма последовательности удаления сообщения</w:t>
       </w:r>
     </w:p>
     <w:sectPr>

</xml_diff>

<commit_message>
Adding analogs in 1.1
</commit_message>
<xml_diff>
--- a/УИРС_8В31_Болбин_Константинов_Осипов.docx
+++ b/УИРС_8В31_Болбин_Константинов_Осипов.docx
@@ -246,8 +246,13 @@
       </w:r>
       <w:r>
         <w:tab/>
-        <w:t>И.М. Болбин</w:t>
-      </w:r>
+        <w:t xml:space="preserve">И.М. </w:t>
+      </w:r>
+      <w:proofErr w:type="spellStart"/>
+      <w:r>
+        <w:t>Болбин</w:t>
+      </w:r>
+      <w:proofErr w:type="spellEnd"/>
     </w:p>
     <w:p>
       <w:pPr>
@@ -303,8 +308,16 @@
         <w:rPr>
           <w:lang w:val="ru-RU"/>
         </w:rPr>
-        <w:t>Е.А. Мыцко</w:t>
-      </w:r>
+        <w:t xml:space="preserve">Е.А. </w:t>
+      </w:r>
+      <w:proofErr w:type="spellStart"/>
+      <w:r>
+        <w:rPr>
+          <w:lang w:val="ru-RU"/>
+        </w:rPr>
+        <w:t>Мыцко</w:t>
+      </w:r>
+      <w:proofErr w:type="spellEnd"/>
     </w:p>
     <w:p>
       <w:r>
@@ -392,7 +405,1787 @@
         <w:rPr>
           <w:lang w:val="ru-RU"/>
         </w:rPr>
-        <w:t>1 Проектирование приложения</w:t>
+        <w:t>1 Теоретическая часть</w:t>
+      </w:r>
+    </w:p>
+    <w:p>
+      <w:pPr>
+        <w:pStyle w:val="3"/>
+        <w:numPr>
+          <w:ilvl w:val="1"/>
+          <w:numId w:val="5"/>
+        </w:numPr>
+        <w:rPr>
+          <w:lang w:val="ru-RU"/>
+        </w:rPr>
+      </w:pPr>
+      <w:r>
+        <w:rPr>
+          <w:lang w:val="ru-RU"/>
+        </w:rPr>
+        <w:t>Обзор аналогов</w:t>
+      </w:r>
+    </w:p>
+    <w:p>
+      <w:pPr>
+        <w:rPr>
+          <w:lang w:val="ru-RU"/>
+        </w:rPr>
+      </w:pPr>
+      <w:r>
+        <w:rPr>
+          <w:lang w:val="ru-RU"/>
+        </w:rPr>
+        <w:t xml:space="preserve">1.1.1 </w:t>
+      </w:r>
+      <w:proofErr w:type="spellStart"/>
+      <w:r>
+        <w:rPr>
+          <w:lang w:val="en-US"/>
+        </w:rPr>
+        <w:t>Whatsapp</w:t>
+      </w:r>
+      <w:proofErr w:type="spellEnd"/>
+      <w:r>
+        <w:rPr>
+          <w:lang w:val="ru-RU"/>
+        </w:rPr>
+        <w:t xml:space="preserve"> – </w:t>
+      </w:r>
+      <w:r>
+        <w:rPr>
+          <w:lang w:val="ru-RU"/>
+        </w:rPr>
+        <w:t>это бесплатное приложение для простого, безопасного и надежного обмена сообщениями и совершения звонков</w:t>
+      </w:r>
+      <w:r>
+        <w:rPr>
+          <w:lang w:val="ru-RU"/>
+        </w:rPr>
+        <w:t xml:space="preserve"> </w:t>
+      </w:r>
+      <w:r>
+        <w:rPr>
+          <w:lang w:val="ru-RU"/>
+        </w:rPr>
+        <w:t>[1].</w:t>
+      </w:r>
+      <w:r>
+        <w:rPr>
+          <w:lang w:val="ru-RU"/>
+        </w:rPr>
+        <w:t xml:space="preserve"> </w:t>
+      </w:r>
+      <w:r>
+        <w:rPr>
+          <w:lang w:val="ru-RU"/>
+        </w:rPr>
+        <w:t xml:space="preserve">Сначала приложение </w:t>
+      </w:r>
+      <w:proofErr w:type="spellStart"/>
+      <w:r>
+        <w:rPr>
+          <w:lang w:val="ru-RU"/>
+        </w:rPr>
+        <w:t>WhatsApp</w:t>
+      </w:r>
+      <w:proofErr w:type="spellEnd"/>
+      <w:r>
+        <w:rPr>
+          <w:lang w:val="ru-RU"/>
+        </w:rPr>
+        <w:t xml:space="preserve"> задумывалось как альтернатива SMS. Сегодня сервис поддерживает отправку и получение данных в самых разных форматах: сообщения, фото, видео, документы, геопозиция и аудиозвонки.</w:t>
+      </w:r>
+    </w:p>
+    <w:p>
+      <w:pPr>
+        <w:rPr>
+          <w:lang w:val="en-US"/>
+        </w:rPr>
+      </w:pPr>
+      <w:r>
+        <w:rPr>
+          <w:lang w:val="ru-RU"/>
+        </w:rPr>
+        <w:t>М</w:t>
+      </w:r>
+      <w:r>
+        <w:rPr>
+          <w:lang w:val="ru-RU"/>
+        </w:rPr>
+        <w:t>ессенджер</w:t>
+      </w:r>
+      <w:r>
+        <w:rPr>
+          <w:lang w:val="ru-RU"/>
+        </w:rPr>
+        <w:t xml:space="preserve"> </w:t>
+      </w:r>
+      <w:r>
+        <w:rPr>
+          <w:lang w:val="ru-RU"/>
+        </w:rPr>
+        <w:t>является кроссплатформенным</w:t>
+      </w:r>
+      <w:r>
+        <w:rPr>
+          <w:lang w:val="ru-RU"/>
+        </w:rPr>
+        <w:t xml:space="preserve"> с E2E-шифрованием по умолчанию, </w:t>
+      </w:r>
+      <w:r>
+        <w:rPr>
+          <w:lang w:val="ru-RU"/>
+        </w:rPr>
+        <w:t xml:space="preserve">является самым популярным мессенджеров </w:t>
+      </w:r>
+      <w:r>
+        <w:rPr>
+          <w:lang w:val="ru-RU"/>
+        </w:rPr>
+        <w:t>для личного и делового общения</w:t>
+      </w:r>
+      <w:r>
+        <w:rPr>
+          <w:lang w:val="ru-RU"/>
+        </w:rPr>
+        <w:t xml:space="preserve"> во всем мире</w:t>
+      </w:r>
+      <w:r>
+        <w:rPr>
+          <w:lang w:val="ru-RU"/>
+        </w:rPr>
+        <w:t>. В России заблокирован, работает только через VPN.</w:t>
+      </w:r>
+    </w:p>
+    <w:p>
+      <w:pPr>
+        <w:rPr>
+          <w:lang w:val="ru-RU"/>
+        </w:rPr>
+      </w:pPr>
+      <w:r>
+        <w:rPr>
+          <w:lang w:val="ru-RU"/>
+        </w:rPr>
+        <w:t xml:space="preserve">1.1.2 </w:t>
+      </w:r>
+      <w:r>
+        <w:rPr>
+          <w:lang w:val="en-US"/>
+        </w:rPr>
+        <w:t>Telegram</w:t>
+      </w:r>
+      <w:r>
+        <w:rPr>
+          <w:lang w:val="ru-RU"/>
+        </w:rPr>
+        <w:t xml:space="preserve"> –</w:t>
+      </w:r>
+      <w:r>
+        <w:rPr>
+          <w:lang w:val="ru-RU"/>
+        </w:rPr>
+        <w:t xml:space="preserve"> это мессенджер, ориентированный на скорость и безопасность: он очень быстрый, простой и бесплатный</w:t>
+      </w:r>
+      <w:r>
+        <w:rPr>
+          <w:lang w:val="ru-RU"/>
+        </w:rPr>
+        <w:t xml:space="preserve"> </w:t>
+      </w:r>
+      <w:r>
+        <w:rPr>
+          <w:lang w:val="ru-RU"/>
+        </w:rPr>
+        <w:t>[2]</w:t>
+      </w:r>
+      <w:r>
+        <w:rPr>
+          <w:lang w:val="ru-RU"/>
+        </w:rPr>
+        <w:t xml:space="preserve">. </w:t>
+      </w:r>
+      <w:r>
+        <w:rPr>
+          <w:lang w:val="ru-RU"/>
+        </w:rPr>
+        <w:t xml:space="preserve">Приложение </w:t>
+      </w:r>
+      <w:r>
+        <w:rPr>
+          <w:lang w:val="ru-RU"/>
+        </w:rPr>
+        <w:t>входит в пятёрку самых скачиваемых приложений в мире, его аудитория превышает 1 миллиард активных пользователей.</w:t>
+      </w:r>
+    </w:p>
+    <w:p>
+      <w:pPr>
+        <w:rPr>
+          <w:lang w:val="ru-RU"/>
+        </w:rPr>
+      </w:pPr>
+      <w:r>
+        <w:rPr>
+          <w:lang w:val="ru-RU"/>
+        </w:rPr>
+        <w:t xml:space="preserve">С помощью </w:t>
+      </w:r>
+      <w:proofErr w:type="spellStart"/>
+      <w:r>
+        <w:rPr>
+          <w:lang w:val="ru-RU"/>
+        </w:rPr>
+        <w:t>Telegram</w:t>
+      </w:r>
+      <w:proofErr w:type="spellEnd"/>
+      <w:r>
+        <w:rPr>
+          <w:lang w:val="ru-RU"/>
+        </w:rPr>
+        <w:t xml:space="preserve"> можно отправлять сообщения, фотографии, видео и файлы любого типа, </w:t>
+      </w:r>
+      <w:r>
+        <w:rPr>
+          <w:lang w:val="ru-RU"/>
+        </w:rPr>
+        <w:t>имеет широкие возможности для работы с большой аудиторией</w:t>
+      </w:r>
+      <w:r>
+        <w:rPr>
+          <w:lang w:val="ru-RU"/>
+        </w:rPr>
+        <w:t xml:space="preserve">. </w:t>
+      </w:r>
+      <w:r>
+        <w:rPr>
+          <w:lang w:val="ru-RU"/>
+        </w:rPr>
+        <w:t>Мессенджер</w:t>
+      </w:r>
+      <w:r>
+        <w:rPr>
+          <w:lang w:val="ru-RU"/>
+        </w:rPr>
+        <w:t xml:space="preserve"> сочетает в себе функции SMS и электронной почт</w:t>
+      </w:r>
+      <w:r>
+        <w:rPr>
+          <w:lang w:val="ru-RU"/>
+        </w:rPr>
+        <w:t>ы, подходит как для личного, так и для делового общения</w:t>
+      </w:r>
+      <w:r>
+        <w:rPr>
+          <w:lang w:val="ru-RU"/>
+        </w:rPr>
+        <w:t>.</w:t>
+      </w:r>
+    </w:p>
+    <w:p>
+      <w:pPr>
+        <w:rPr>
+          <w:lang w:val="ru-RU"/>
+        </w:rPr>
+      </w:pPr>
+      <w:r>
+        <w:rPr>
+          <w:lang w:val="ru-RU"/>
+        </w:rPr>
+        <w:t>Поддерживает</w:t>
+      </w:r>
+      <w:r>
+        <w:rPr>
+          <w:lang w:val="ru-RU"/>
+        </w:rPr>
+        <w:t xml:space="preserve"> </w:t>
+      </w:r>
+      <w:r>
+        <w:rPr>
+          <w:lang w:val="ru-RU"/>
+        </w:rPr>
+        <w:t xml:space="preserve">возможность создания </w:t>
+      </w:r>
+      <w:r>
+        <w:rPr>
+          <w:lang w:val="ru-RU"/>
+        </w:rPr>
+        <w:t>каналов, групп, ботов, высоким уровнем шифрования (E2E в секретных чатах), кроссплатформенностью. В 2026 году в России официально заблокирован, для работы требуется VPN</w:t>
+      </w:r>
+      <w:r>
+        <w:rPr>
+          <w:lang w:val="ru-RU"/>
+        </w:rPr>
+        <w:t xml:space="preserve"> или прокси-сервера с технологиями </w:t>
+      </w:r>
+      <w:r>
+        <w:rPr>
+          <w:lang w:val="en-US"/>
+        </w:rPr>
+        <w:t>SOCKS</w:t>
+      </w:r>
+      <w:r>
+        <w:rPr>
+          <w:lang w:val="ru-RU"/>
+        </w:rPr>
+        <w:t xml:space="preserve">5 </w:t>
+      </w:r>
+      <w:r>
+        <w:rPr>
+          <w:lang w:val="ru-RU"/>
+        </w:rPr>
+        <w:t xml:space="preserve">или </w:t>
+      </w:r>
+      <w:proofErr w:type="spellStart"/>
+      <w:r>
+        <w:rPr>
+          <w:lang w:val="en-US"/>
+        </w:rPr>
+        <w:t>MTProto</w:t>
+      </w:r>
+      <w:proofErr w:type="spellEnd"/>
+      <w:r>
+        <w:rPr>
+          <w:lang w:val="ru-RU"/>
+        </w:rPr>
+        <w:t xml:space="preserve"> (поддерживается самим </w:t>
+      </w:r>
+      <w:r>
+        <w:rPr>
+          <w:lang w:val="en-US"/>
+        </w:rPr>
+        <w:t>Telegram</w:t>
+      </w:r>
+      <w:r>
+        <w:rPr>
+          <w:lang w:val="ru-RU"/>
+        </w:rPr>
+        <w:t>)</w:t>
+      </w:r>
+      <w:r>
+        <w:rPr>
+          <w:lang w:val="ru-RU"/>
+        </w:rPr>
+        <w:t>.</w:t>
+      </w:r>
+    </w:p>
+    <w:p>
+      <w:pPr>
+        <w:rPr>
+          <w:lang w:val="ru-RU"/>
+        </w:rPr>
+      </w:pPr>
+      <w:r>
+        <w:rPr>
+          <w:lang w:val="ru-RU"/>
+        </w:rPr>
+        <w:t>Имеет большое сообщество разработчиков благодаря открытому исходному коду клиентов (</w:t>
+      </w:r>
+      <w:r>
+        <w:rPr>
+          <w:lang w:val="en-US"/>
+        </w:rPr>
+        <w:t>Android</w:t>
+      </w:r>
+      <w:r>
+        <w:rPr>
+          <w:lang w:val="ru-RU"/>
+        </w:rPr>
+        <w:t>/</w:t>
+      </w:r>
+      <w:r>
+        <w:rPr>
+          <w:lang w:val="en-US"/>
+        </w:rPr>
+        <w:t>Desktop</w:t>
+      </w:r>
+      <w:r>
+        <w:rPr>
+          <w:lang w:val="ru-RU"/>
+        </w:rPr>
+        <w:t>)</w:t>
+      </w:r>
+      <w:r>
+        <w:rPr>
+          <w:lang w:val="ru-RU"/>
+        </w:rPr>
+        <w:t xml:space="preserve"> </w:t>
+      </w:r>
+      <w:r>
+        <w:rPr>
+          <w:lang w:val="ru-RU"/>
+        </w:rPr>
+        <w:t xml:space="preserve">и объемно задокументированному официальному </w:t>
+      </w:r>
+      <w:r>
+        <w:rPr>
+          <w:lang w:val="en-US"/>
+        </w:rPr>
+        <w:t>API</w:t>
+      </w:r>
+      <w:r>
+        <w:rPr>
+          <w:lang w:val="ru-RU"/>
+        </w:rPr>
+        <w:t xml:space="preserve">, что позволяет создавать чат-ботов и веб-приложения внутри самого </w:t>
+      </w:r>
+      <w:r>
+        <w:rPr>
+          <w:lang w:val="en-US"/>
+        </w:rPr>
+        <w:t>Telegram</w:t>
+      </w:r>
+      <w:r>
+        <w:rPr>
+          <w:lang w:val="ru-RU"/>
+        </w:rPr>
+        <w:t>.</w:t>
+      </w:r>
+    </w:p>
+    <w:p>
+      <w:pPr>
+        <w:rPr>
+          <w:lang w:val="ru-RU"/>
+        </w:rPr>
+      </w:pPr>
+      <w:r>
+        <w:rPr>
+          <w:lang w:val="ru-RU"/>
+        </w:rPr>
+        <w:t xml:space="preserve">1.1.3 </w:t>
+      </w:r>
+      <w:r>
+        <w:rPr>
+          <w:lang w:val="en-US"/>
+        </w:rPr>
+        <w:t>VK</w:t>
+      </w:r>
+      <w:r>
+        <w:rPr>
+          <w:lang w:val="ru-RU"/>
+        </w:rPr>
+        <w:t xml:space="preserve"> </w:t>
+      </w:r>
+      <w:r>
+        <w:rPr>
+          <w:lang w:val="ru-RU"/>
+        </w:rPr>
+        <w:t xml:space="preserve">Мессенджер – </w:t>
+      </w:r>
+      <w:r>
+        <w:rPr>
+          <w:lang w:val="ru-RU"/>
+        </w:rPr>
+        <w:t xml:space="preserve">кроссплатформенный </w:t>
+      </w:r>
+      <w:r>
+        <w:t>мессенджер в России,</w:t>
+      </w:r>
+      <w:r>
+        <w:rPr>
+          <w:lang w:val="ru-RU"/>
+        </w:rPr>
+        <w:t xml:space="preserve"> который</w:t>
+      </w:r>
+      <w:r>
+        <w:t xml:space="preserve"> </w:t>
+      </w:r>
+      <w:r>
+        <w:rPr>
+          <w:lang w:val="ru-RU"/>
+        </w:rPr>
+        <w:t xml:space="preserve">объединяет в себе </w:t>
+      </w:r>
+      <w:r>
+        <w:t>людей, сервисы и компании, создавая простые и удобные инструменты коммуникации</w:t>
+      </w:r>
+      <w:r>
+        <w:rPr>
+          <w:lang w:val="ru-RU"/>
+        </w:rPr>
+        <w:t xml:space="preserve"> </w:t>
+      </w:r>
+      <w:r>
+        <w:rPr>
+          <w:lang w:val="ru-RU"/>
+        </w:rPr>
+        <w:t>[</w:t>
+      </w:r>
+      <w:r>
+        <w:rPr>
+          <w:lang w:val="ru-RU"/>
+        </w:rPr>
+        <w:t>4</w:t>
+      </w:r>
+      <w:r>
+        <w:rPr>
+          <w:lang w:val="ru-RU"/>
+        </w:rPr>
+        <w:t>]</w:t>
+      </w:r>
+      <w:r>
+        <w:rPr>
+          <w:lang w:val="ru-RU"/>
+        </w:rPr>
+        <w:t>.</w:t>
+      </w:r>
+    </w:p>
+    <w:p>
+      <w:pPr>
+        <w:rPr>
+          <w:lang w:val="ru-RU"/>
+        </w:rPr>
+      </w:pPr>
+      <w:r>
+        <w:rPr>
+          <w:lang w:val="ru-RU"/>
+        </w:rPr>
+        <w:t>Р</w:t>
+      </w:r>
+      <w:r>
+        <w:rPr>
+          <w:lang w:val="ru-RU"/>
+        </w:rPr>
+        <w:t>оссийский сервис интегрирован с соцсетью ВКонтакте. Поддерживает чаты, видеозвонки, каналы, стикеры, работает без VPN, но не обеспечивает сквозного шифрования и не гарантирует полной приватности.</w:t>
+      </w:r>
+    </w:p>
+    <w:p>
+      <w:pPr>
+        <w:rPr>
+          <w:lang w:val="ru-RU"/>
+        </w:rPr>
+      </w:pPr>
+      <w:r>
+        <w:rPr>
+          <w:lang w:val="ru-RU"/>
+        </w:rPr>
+        <w:t xml:space="preserve">1.1.4 </w:t>
+      </w:r>
+      <w:proofErr w:type="spellStart"/>
+      <w:r>
+        <w:rPr>
+          <w:lang w:val="en-US"/>
+        </w:rPr>
+        <w:t>XChat</w:t>
+      </w:r>
+      <w:proofErr w:type="spellEnd"/>
+      <w:r>
+        <w:rPr>
+          <w:lang w:val="ru-RU"/>
+        </w:rPr>
+        <w:t xml:space="preserve"> – </w:t>
+      </w:r>
+      <w:r>
+        <w:rPr>
+          <w:lang w:val="ru-RU"/>
+        </w:rPr>
+        <w:t>новый мессенджер от компании X (бывший Twitter)</w:t>
+      </w:r>
+      <w:r>
+        <w:rPr>
+          <w:lang w:val="ru-RU"/>
+        </w:rPr>
+        <w:t xml:space="preserve">, доступен только </w:t>
+      </w:r>
+      <w:r>
+        <w:rPr>
+          <w:lang w:val="ru-RU"/>
+        </w:rPr>
+        <w:t xml:space="preserve">в </w:t>
+      </w:r>
+      <w:r>
+        <w:rPr>
+          <w:lang w:val="en-US"/>
+        </w:rPr>
+        <w:t>AppStore</w:t>
+      </w:r>
+      <w:r>
+        <w:rPr>
+          <w:lang w:val="ru-RU"/>
+        </w:rPr>
+        <w:t xml:space="preserve"> (</w:t>
+      </w:r>
+      <w:r>
+        <w:rPr>
+          <w:lang w:val="en-US"/>
+        </w:rPr>
+        <w:t>iOS</w:t>
+      </w:r>
+      <w:r>
+        <w:rPr>
+          <w:lang w:val="ru-RU"/>
+        </w:rPr>
+        <w:t>/</w:t>
+      </w:r>
+      <w:r>
+        <w:rPr>
+          <w:lang w:val="en-US"/>
+        </w:rPr>
+        <w:t>MacOS</w:t>
+      </w:r>
+      <w:r>
+        <w:rPr>
+          <w:lang w:val="ru-RU"/>
+        </w:rPr>
+        <w:t>)</w:t>
+      </w:r>
+      <w:r>
+        <w:rPr>
+          <w:lang w:val="ru-RU"/>
+        </w:rPr>
+        <w:t xml:space="preserve">. </w:t>
+      </w:r>
+      <w:r>
+        <w:rPr>
+          <w:lang w:val="ru-RU"/>
+        </w:rPr>
+        <w:t>Поддерживает</w:t>
+      </w:r>
+      <w:r>
+        <w:rPr>
+          <w:lang w:val="ru-RU"/>
+        </w:rPr>
+        <w:t xml:space="preserve"> сквозное шифрование, функции исчезающих и редактируемых сообщений, блокировку скриншотов. </w:t>
+      </w:r>
+      <w:r>
+        <w:rPr>
+          <w:lang w:val="ru-RU"/>
+        </w:rPr>
+        <w:t>С</w:t>
+      </w:r>
+      <w:r>
+        <w:rPr>
+          <w:lang w:val="ru-RU"/>
+        </w:rPr>
+        <w:t xml:space="preserve">ервис работает отдельно от </w:t>
+      </w:r>
+      <w:r>
+        <w:rPr>
+          <w:lang w:val="ru-RU"/>
+        </w:rPr>
+        <w:lastRenderedPageBreak/>
+        <w:t xml:space="preserve">основного приложения X, хотя встроенные сообщения в соцсети пока сохраняются. Фактически это полноценный конкурент современным мессенджерам вроде </w:t>
+      </w:r>
+      <w:proofErr w:type="spellStart"/>
+      <w:r>
+        <w:rPr>
+          <w:lang w:val="ru-RU"/>
+        </w:rPr>
+        <w:t>Telegram</w:t>
+      </w:r>
+      <w:proofErr w:type="spellEnd"/>
+      <w:r>
+        <w:rPr>
+          <w:lang w:val="ru-RU"/>
+        </w:rPr>
+        <w:t xml:space="preserve"> или </w:t>
+      </w:r>
+      <w:proofErr w:type="spellStart"/>
+      <w:r>
+        <w:rPr>
+          <w:lang w:val="ru-RU"/>
+        </w:rPr>
+        <w:t>WhatsApp</w:t>
+      </w:r>
+      <w:proofErr w:type="spellEnd"/>
+      <w:r>
+        <w:rPr>
+          <w:lang w:val="ru-RU"/>
+        </w:rPr>
+        <w:t>. Причём X делает ставку на приватность и крупные групповые чаты</w:t>
+      </w:r>
+      <w:r>
+        <w:rPr>
+          <w:lang w:val="ru-RU"/>
+        </w:rPr>
+        <w:t xml:space="preserve"> </w:t>
+      </w:r>
+      <w:r>
+        <w:rPr>
+          <w:lang w:val="ru-RU"/>
+        </w:rPr>
+        <w:t>[</w:t>
+      </w:r>
+      <w:r>
+        <w:rPr>
+          <w:lang w:val="ru-RU"/>
+        </w:rPr>
+        <w:t>4</w:t>
+      </w:r>
+      <w:r>
+        <w:rPr>
+          <w:lang w:val="ru-RU"/>
+        </w:rPr>
+        <w:t>]</w:t>
+      </w:r>
+      <w:r>
+        <w:rPr>
+          <w:lang w:val="ru-RU"/>
+        </w:rPr>
+        <w:t>.</w:t>
+      </w:r>
+      <w:r>
+        <w:rPr>
+          <w:lang w:val="ru-RU"/>
+        </w:rPr>
+        <w:t xml:space="preserve"> Поддерживает </w:t>
+      </w:r>
+      <w:r>
+        <w:rPr>
+          <w:lang w:val="ru-RU"/>
+        </w:rPr>
+        <w:t>аудио и видеозвонки</w:t>
+      </w:r>
+      <w:r>
+        <w:rPr>
+          <w:lang w:val="ru-RU"/>
+        </w:rPr>
+        <w:t xml:space="preserve">, </w:t>
+      </w:r>
+      <w:r>
+        <w:rPr>
+          <w:lang w:val="ru-RU"/>
+        </w:rPr>
+        <w:t>отправк</w:t>
+      </w:r>
+      <w:r>
+        <w:rPr>
+          <w:lang w:val="ru-RU"/>
+        </w:rPr>
+        <w:t>у</w:t>
+      </w:r>
+      <w:r>
+        <w:rPr>
+          <w:lang w:val="ru-RU"/>
+        </w:rPr>
+        <w:t xml:space="preserve"> фото, видео и файлов</w:t>
+      </w:r>
+      <w:r>
+        <w:rPr>
+          <w:lang w:val="ru-RU"/>
+        </w:rPr>
+        <w:t xml:space="preserve">, </w:t>
+      </w:r>
+      <w:r>
+        <w:rPr>
+          <w:lang w:val="ru-RU"/>
+        </w:rPr>
+        <w:t>групповые чаты до 350 участников (с обещанием расширения)</w:t>
+      </w:r>
+      <w:r>
+        <w:rPr>
+          <w:lang w:val="ru-RU"/>
+        </w:rPr>
+        <w:t xml:space="preserve">, </w:t>
+      </w:r>
+      <w:r>
+        <w:rPr>
+          <w:lang w:val="ru-RU"/>
+        </w:rPr>
+        <w:t>отсутствие рекламы и трекинга внутри приложения</w:t>
+      </w:r>
+      <w:r>
+        <w:rPr>
+          <w:lang w:val="ru-RU"/>
+        </w:rPr>
+        <w:t>.</w:t>
+      </w:r>
+    </w:p>
+    <w:p>
+      <w:pPr>
+        <w:rPr>
+          <w:lang w:val="en-US"/>
+        </w:rPr>
+      </w:pPr>
+      <w:r>
+        <w:rPr>
+          <w:lang w:val="ru-RU"/>
+        </w:rPr>
+        <w:t xml:space="preserve">1.1.5 </w:t>
+      </w:r>
+      <w:r>
+        <w:rPr>
+          <w:lang w:val="en-US"/>
+        </w:rPr>
+        <w:t>Signal</w:t>
+      </w:r>
+      <w:r>
+        <w:rPr>
+          <w:lang w:val="ru-RU"/>
+        </w:rPr>
+        <w:t xml:space="preserve"> –</w:t>
+      </w:r>
+      <w:r>
+        <w:rPr>
+          <w:lang w:val="ru-RU"/>
+        </w:rPr>
+        <w:t xml:space="preserve"> </w:t>
+      </w:r>
+      <w:r>
+        <w:rPr>
+          <w:lang w:val="ru-RU"/>
+        </w:rPr>
+        <w:t xml:space="preserve">это простой, мощный и безопасный </w:t>
+      </w:r>
+      <w:r>
+        <w:rPr>
+          <w:lang w:val="ru-RU"/>
+        </w:rPr>
+        <w:t xml:space="preserve">кроссплатформенный </w:t>
+      </w:r>
+      <w:r>
+        <w:rPr>
+          <w:lang w:val="ru-RU"/>
+        </w:rPr>
+        <w:t>мессенджер, который использует интернет-соединение вашего телефона для защищённого общения</w:t>
+      </w:r>
+      <w:r>
+        <w:rPr>
+          <w:lang w:val="ru-RU"/>
+        </w:rPr>
+        <w:t xml:space="preserve"> </w:t>
+      </w:r>
+      <w:r>
+        <w:rPr>
+          <w:lang w:val="ru-RU"/>
+        </w:rPr>
+        <w:t>[5]</w:t>
+      </w:r>
+      <w:r>
+        <w:rPr>
+          <w:lang w:val="ru-RU"/>
+        </w:rPr>
+        <w:t>.</w:t>
+      </w:r>
+      <w:r>
+        <w:rPr>
+          <w:lang w:val="ru-RU"/>
+        </w:rPr>
+        <w:t xml:space="preserve"> Есть возможность</w:t>
+      </w:r>
+      <w:r>
+        <w:rPr>
+          <w:lang w:val="ru-RU"/>
+        </w:rPr>
+        <w:t xml:space="preserve"> </w:t>
+      </w:r>
+      <w:r>
+        <w:rPr>
+          <w:lang w:val="ru-RU"/>
+        </w:rPr>
+        <w:t>о</w:t>
+      </w:r>
+      <w:r>
+        <w:rPr>
+          <w:lang w:val="ru-RU"/>
+        </w:rPr>
+        <w:t>тправ</w:t>
+      </w:r>
+      <w:r>
+        <w:rPr>
+          <w:lang w:val="ru-RU"/>
+        </w:rPr>
+        <w:t>ки</w:t>
+      </w:r>
+      <w:r>
+        <w:rPr>
+          <w:lang w:val="ru-RU"/>
+        </w:rPr>
+        <w:t xml:space="preserve"> и получ</w:t>
+      </w:r>
+      <w:r>
+        <w:rPr>
+          <w:lang w:val="ru-RU"/>
+        </w:rPr>
+        <w:t>ения</w:t>
+      </w:r>
+      <w:r>
+        <w:rPr>
+          <w:lang w:val="ru-RU"/>
+        </w:rPr>
+        <w:t xml:space="preserve"> сообщения в высоком качестве, участв</w:t>
+      </w:r>
+      <w:r>
+        <w:rPr>
+          <w:lang w:val="ru-RU"/>
+        </w:rPr>
+        <w:t>овать</w:t>
+      </w:r>
+      <w:r>
+        <w:rPr>
+          <w:lang w:val="ru-RU"/>
+        </w:rPr>
+        <w:t xml:space="preserve"> в голосовых и видеозвонках HD</w:t>
+      </w:r>
+      <w:r>
+        <w:rPr>
+          <w:lang w:val="ru-RU"/>
+        </w:rPr>
+        <w:t xml:space="preserve">. Сервис </w:t>
+      </w:r>
+      <w:r>
+        <w:rPr>
+          <w:lang w:val="ru-RU"/>
+        </w:rPr>
+        <w:t>постоянно расширя</w:t>
+      </w:r>
+      <w:r>
+        <w:rPr>
+          <w:lang w:val="ru-RU"/>
+        </w:rPr>
+        <w:t>ет</w:t>
+      </w:r>
+      <w:r>
+        <w:rPr>
+          <w:lang w:val="ru-RU"/>
+        </w:rPr>
+        <w:t xml:space="preserve"> набор новых функций, которые помогают оставаться на связи.</w:t>
+      </w:r>
+    </w:p>
+    <w:p>
+      <w:pPr>
+        <w:rPr>
+          <w:lang w:val="en-US"/>
+        </w:rPr>
+      </w:pPr>
+      <w:r>
+        <w:rPr>
+          <w:lang w:val="en-US"/>
+        </w:rPr>
+        <w:t>Signal</w:t>
+      </w:r>
+      <w:r>
+        <w:rPr>
+          <w:lang w:val="ru-RU"/>
+        </w:rPr>
+        <w:t xml:space="preserve"> </w:t>
+      </w:r>
+      <w:r>
+        <w:rPr>
+          <w:lang w:val="ru-RU"/>
+        </w:rPr>
+        <w:t>–</w:t>
+      </w:r>
+      <w:r>
+        <w:rPr>
+          <w:lang w:val="ru-RU"/>
+        </w:rPr>
+        <w:t xml:space="preserve"> независимая некоммерческая организация. </w:t>
+      </w:r>
+      <w:r>
+        <w:rPr>
+          <w:lang w:val="ru-RU"/>
+        </w:rPr>
+        <w:t>Она не</w:t>
+      </w:r>
+      <w:r>
+        <w:rPr>
+          <w:lang w:val="ru-RU"/>
+        </w:rPr>
+        <w:t xml:space="preserve"> связан</w:t>
+      </w:r>
+      <w:r>
+        <w:rPr>
+          <w:lang w:val="ru-RU"/>
+        </w:rPr>
+        <w:t>а</w:t>
+      </w:r>
+      <w:r>
+        <w:rPr>
+          <w:lang w:val="ru-RU"/>
+        </w:rPr>
+        <w:t xml:space="preserve"> ни с одной крупной технологической компанией и не може</w:t>
+      </w:r>
+      <w:r>
+        <w:rPr>
+          <w:lang w:val="ru-RU"/>
+        </w:rPr>
+        <w:t>т</w:t>
+      </w:r>
+      <w:r>
+        <w:rPr>
+          <w:lang w:val="ru-RU"/>
+        </w:rPr>
+        <w:t xml:space="preserve"> быть приобретен</w:t>
+      </w:r>
+      <w:r>
+        <w:rPr>
+          <w:lang w:val="ru-RU"/>
+        </w:rPr>
+        <w:t>а</w:t>
+      </w:r>
+      <w:r>
+        <w:rPr>
+          <w:lang w:val="ru-RU"/>
+        </w:rPr>
+        <w:t xml:space="preserve"> кем-либо из них. Развитие сервиса поддерживается за счёт грантов и пожертвовани</w:t>
+      </w:r>
+      <w:r>
+        <w:rPr>
+          <w:lang w:val="ru-RU"/>
+        </w:rPr>
+        <w:t>й пользователей</w:t>
+      </w:r>
+      <w:r>
+        <w:rPr>
+          <w:lang w:val="ru-RU"/>
+        </w:rPr>
+        <w:t>.</w:t>
+      </w:r>
+    </w:p>
+    <w:p>
+      <w:pPr>
+        <w:rPr>
+          <w:lang w:val="ru-RU"/>
+        </w:rPr>
+      </w:pPr>
+      <w:r>
+        <w:rPr>
+          <w:lang w:val="ru-RU"/>
+        </w:rPr>
+        <w:t xml:space="preserve">Передовые технологии </w:t>
+      </w:r>
+      <w:r>
+        <w:rPr>
+          <w:lang w:val="ru-RU"/>
+        </w:rPr>
+        <w:t>E2E-шифровани</w:t>
+      </w:r>
+      <w:r>
+        <w:rPr>
+          <w:lang w:val="ru-RU"/>
+        </w:rPr>
+        <w:t xml:space="preserve">я </w:t>
+      </w:r>
+      <w:proofErr w:type="spellStart"/>
+      <w:r>
+        <w:rPr>
+          <w:lang w:val="ru-RU"/>
+        </w:rPr>
+        <w:t>Signal</w:t>
+      </w:r>
+      <w:proofErr w:type="spellEnd"/>
+      <w:r>
+        <w:rPr>
+          <w:lang w:val="ru-RU"/>
+        </w:rPr>
+        <w:t xml:space="preserve"> по сохранению конфиденциальности всегда включены</w:t>
+      </w:r>
+      <w:r>
+        <w:rPr>
+          <w:lang w:val="ru-RU"/>
+        </w:rPr>
+        <w:t>. Н</w:t>
+      </w:r>
+      <w:r>
+        <w:rPr>
+          <w:lang w:val="ru-RU"/>
+        </w:rPr>
+        <w:t>ет рекламы, партнёрских маркетологов и навязчивого отслеживания</w:t>
+      </w:r>
+      <w:r>
+        <w:rPr>
+          <w:lang w:val="ru-RU"/>
+        </w:rPr>
+        <w:t xml:space="preserve">. В России заблокирован, работает только через VPN. </w:t>
+      </w:r>
+      <w:r>
+        <w:rPr>
+          <w:lang w:val="ru-RU"/>
+        </w:rPr>
+        <w:t>М</w:t>
+      </w:r>
+      <w:r>
+        <w:rPr>
+          <w:lang w:val="ru-RU"/>
+        </w:rPr>
+        <w:t>ессенджер с открытым исходным кодо</w:t>
+      </w:r>
+      <w:r>
+        <w:rPr>
+          <w:lang w:val="ru-RU"/>
+        </w:rPr>
+        <w:t>м</w:t>
+      </w:r>
+      <w:r>
+        <w:rPr>
+          <w:lang w:val="ru-RU"/>
+        </w:rPr>
+        <w:t>, н</w:t>
+      </w:r>
+      <w:r>
+        <w:rPr>
+          <w:lang w:val="ru-RU"/>
+        </w:rPr>
+        <w:t>е поддерживает каналы и ботов, но обеспечивает высокий уровень безопасности</w:t>
+      </w:r>
+      <w:r>
+        <w:rPr>
+          <w:lang w:val="ru-RU"/>
+        </w:rPr>
+        <w:t>.</w:t>
+      </w:r>
+    </w:p>
+    <w:p>
+      <w:pPr>
+        <w:rPr>
+          <w:lang w:val="ru-RU"/>
+        </w:rPr>
+      </w:pPr>
+      <w:r>
+        <w:rPr>
+          <w:lang w:val="ru-RU"/>
+        </w:rPr>
+        <w:t xml:space="preserve">1.1.6 </w:t>
+      </w:r>
+      <w:proofErr w:type="spellStart"/>
+      <w:r>
+        <w:rPr>
+          <w:lang w:val="en-US"/>
+        </w:rPr>
+        <w:t>YouGile</w:t>
+      </w:r>
+      <w:proofErr w:type="spellEnd"/>
+      <w:r>
+        <w:rPr>
+          <w:lang w:val="ru-RU"/>
+        </w:rPr>
+        <w:t xml:space="preserve"> </w:t>
+      </w:r>
+      <w:r>
+        <w:rPr>
+          <w:lang w:val="ru-RU"/>
+        </w:rPr>
+        <w:t>–</w:t>
+      </w:r>
+      <w:r>
+        <w:rPr>
+          <w:lang w:val="ru-RU"/>
+        </w:rPr>
+        <w:t xml:space="preserve"> </w:t>
+      </w:r>
+      <w:r>
+        <w:rPr>
+          <w:lang w:val="ru-RU"/>
+        </w:rPr>
+        <w:t xml:space="preserve">российский сервис для командной работы, объединяющий </w:t>
+      </w:r>
+      <w:r>
+        <w:rPr>
+          <w:lang w:val="ru-RU"/>
+        </w:rPr>
+        <w:br/>
+      </w:r>
+      <w:r>
+        <w:rPr>
+          <w:lang w:val="ru-RU"/>
+        </w:rPr>
+        <w:t>канбан-доски и встроенный мессенджер</w:t>
+      </w:r>
+      <w:r>
+        <w:rPr>
+          <w:lang w:val="ru-RU"/>
+        </w:rPr>
+        <w:t xml:space="preserve"> </w:t>
+      </w:r>
+      <w:r>
+        <w:rPr>
+          <w:lang w:val="ru-RU"/>
+        </w:rPr>
+        <w:t>[</w:t>
+      </w:r>
+      <w:r>
+        <w:rPr>
+          <w:lang w:val="ru-RU"/>
+        </w:rPr>
+        <w:t>6</w:t>
+      </w:r>
+      <w:r>
+        <w:rPr>
+          <w:lang w:val="ru-RU"/>
+        </w:rPr>
+        <w:t>]</w:t>
+      </w:r>
+      <w:r>
+        <w:rPr>
+          <w:lang w:val="ru-RU"/>
+        </w:rPr>
+        <w:t xml:space="preserve">. Каждая задача </w:t>
+      </w:r>
+      <w:r>
+        <w:rPr>
+          <w:lang w:val="ru-RU"/>
+        </w:rPr>
+        <w:t>–</w:t>
+      </w:r>
+      <w:r>
+        <w:rPr>
+          <w:lang w:val="ru-RU"/>
+        </w:rPr>
+        <w:t xml:space="preserve"> отдельный чат, что удобно для проектного управления и обсуждения рабочих вопросов. Подходит для компаний, которым важно </w:t>
+      </w:r>
+      <w:proofErr w:type="spellStart"/>
+      <w:r>
+        <w:rPr>
+          <w:lang w:val="ru-RU"/>
+        </w:rPr>
+        <w:t>on</w:t>
+      </w:r>
+      <w:proofErr w:type="spellEnd"/>
+      <w:r>
+        <w:rPr>
+          <w:lang w:val="ru-RU"/>
+        </w:rPr>
+        <w:t>-</w:t>
+      </w:r>
+      <w:proofErr w:type="spellStart"/>
+      <w:r>
+        <w:rPr>
+          <w:lang w:val="ru-RU"/>
+        </w:rPr>
+        <w:t>premise</w:t>
+      </w:r>
+      <w:proofErr w:type="spellEnd"/>
+      <w:r>
+        <w:rPr>
+          <w:lang w:val="ru-RU"/>
+        </w:rPr>
+        <w:t xml:space="preserve">-развёртывание и интеграция задач с обсуждениями. </w:t>
+      </w:r>
+      <w:r>
+        <w:rPr>
+          <w:lang w:val="ru-RU"/>
+        </w:rPr>
+        <w:t xml:space="preserve">Поддерживает </w:t>
+      </w:r>
+      <w:r>
+        <w:rPr>
+          <w:lang w:val="ru-RU"/>
+        </w:rPr>
+        <w:t>обмен файлами</w:t>
+      </w:r>
+      <w:r>
+        <w:rPr>
+          <w:lang w:val="ru-RU"/>
+        </w:rPr>
+        <w:t xml:space="preserve"> любых форматов</w:t>
+      </w:r>
+      <w:r>
+        <w:rPr>
+          <w:lang w:val="ru-RU"/>
+        </w:rPr>
+        <w:t>, уведомления, опросы, реакции, голосовые сообщения</w:t>
+      </w:r>
+      <w:r>
+        <w:rPr>
+          <w:lang w:val="ru-RU"/>
+        </w:rPr>
+        <w:t xml:space="preserve"> с расшифровыванием в текст</w:t>
+      </w:r>
+      <w:r>
+        <w:rPr>
+          <w:lang w:val="ru-RU"/>
+        </w:rPr>
+        <w:t xml:space="preserve">, </w:t>
+      </w:r>
+      <w:r>
+        <w:rPr>
+          <w:lang w:val="ru-RU"/>
+        </w:rPr>
+        <w:t xml:space="preserve">видеосообщения с </w:t>
+      </w:r>
+      <w:r>
+        <w:rPr>
+          <w:lang w:val="ru-RU"/>
+        </w:rPr>
+        <w:t>демонстраци</w:t>
+      </w:r>
+      <w:r>
+        <w:rPr>
+          <w:lang w:val="ru-RU"/>
+        </w:rPr>
+        <w:t>ей</w:t>
+      </w:r>
+      <w:r>
+        <w:rPr>
+          <w:lang w:val="ru-RU"/>
+        </w:rPr>
+        <w:t xml:space="preserve"> экрана</w:t>
+      </w:r>
+      <w:r>
+        <w:rPr>
+          <w:lang w:val="ru-RU"/>
+        </w:rPr>
+        <w:t>.</w:t>
+      </w:r>
+    </w:p>
+    <w:p>
+      <w:pPr>
+        <w:pStyle w:val="3"/>
+        <w:rPr>
+          <w:lang w:val="ru-RU"/>
+        </w:rPr>
+      </w:pPr>
+      <w:r>
+        <w:rPr>
+          <w:lang w:val="ru-RU"/>
+        </w:rPr>
+        <w:t xml:space="preserve">1.2 </w:t>
+      </w:r>
+      <w:r>
+        <w:rPr>
+          <w:lang w:val="ru-RU"/>
+        </w:rPr>
+        <w:t>Сравнение аналогов</w:t>
+      </w:r>
+    </w:p>
+    <w:p>
+      <w:pPr>
+        <w:rPr>
+          <w:lang w:val="ru-RU"/>
+        </w:rPr>
+      </w:pPr>
+      <w:r>
+        <w:rPr>
+          <w:lang w:val="ru-RU"/>
+        </w:rPr>
+        <w:t>1. Технические характеристики</w:t>
+      </w:r>
+    </w:p>
+    <w:p>
+      <w:pPr>
+        <w:rPr>
+          <w:lang w:val="ru-RU"/>
+        </w:rPr>
+      </w:pPr>
+      <w:r>
+        <w:rPr>
+          <w:lang w:val="ru-RU"/>
+        </w:rPr>
+        <w:t xml:space="preserve">- Кроссплатформенность: поддержка </w:t>
+      </w:r>
+      <w:proofErr w:type="spellStart"/>
+      <w:r>
+        <w:rPr>
+          <w:lang w:val="ru-RU"/>
+        </w:rPr>
+        <w:t>iOS</w:t>
+      </w:r>
+      <w:proofErr w:type="spellEnd"/>
+      <w:r>
+        <w:rPr>
+          <w:lang w:val="ru-RU"/>
+        </w:rPr>
+        <w:t xml:space="preserve">, </w:t>
+      </w:r>
+      <w:proofErr w:type="spellStart"/>
+      <w:r>
+        <w:rPr>
+          <w:lang w:val="ru-RU"/>
+        </w:rPr>
+        <w:t>Android</w:t>
+      </w:r>
+      <w:proofErr w:type="spellEnd"/>
+      <w:r>
+        <w:rPr>
+          <w:lang w:val="ru-RU"/>
+        </w:rPr>
+        <w:t xml:space="preserve">, Windows, </w:t>
+      </w:r>
+      <w:proofErr w:type="spellStart"/>
+      <w:r>
+        <w:rPr>
+          <w:lang w:val="ru-RU"/>
+        </w:rPr>
+        <w:t>macOS</w:t>
+      </w:r>
+      <w:proofErr w:type="spellEnd"/>
+      <w:r>
+        <w:rPr>
+          <w:lang w:val="ru-RU"/>
+        </w:rPr>
+        <w:t>, Linux и Web.</w:t>
+      </w:r>
+    </w:p>
+    <w:p>
+      <w:pPr>
+        <w:rPr>
+          <w:lang w:val="ru-RU"/>
+        </w:rPr>
+      </w:pPr>
+      <w:r>
+        <w:rPr>
+          <w:lang w:val="ru-RU"/>
+        </w:rPr>
+        <w:t>- Отказоустойчивость: наличие механизмов обхода блокировок, поддержка прокси, VPN, P2P-соединений.</w:t>
+      </w:r>
+    </w:p>
+    <w:p>
+      <w:pPr>
+        <w:rPr>
+          <w:lang w:val="ru-RU"/>
+        </w:rPr>
+      </w:pPr>
+      <w:r>
+        <w:rPr>
+          <w:lang w:val="ru-RU"/>
+        </w:rPr>
+        <w:t>- Масштабируемость: способность выдерживать рост числа пользователей и нагрузки.</w:t>
+      </w:r>
+    </w:p>
+    <w:p>
+      <w:pPr>
+        <w:rPr>
+          <w:lang w:val="ru-RU"/>
+        </w:rPr>
+      </w:pPr>
+      <w:r>
+        <w:rPr>
+          <w:lang w:val="ru-RU"/>
+        </w:rPr>
+        <w:t>- Скорость доставки сообщений: среднее и максимальное время доставки.</w:t>
+      </w:r>
+    </w:p>
+    <w:p>
+      <w:pPr>
+        <w:rPr>
+          <w:lang w:val="ru-RU"/>
+        </w:rPr>
+      </w:pPr>
+      <w:r>
+        <w:rPr>
+          <w:lang w:val="ru-RU"/>
+        </w:rPr>
+        <w:t>- Стабильность работы: частота сбоев, время восстановления после сбоев.</w:t>
+      </w:r>
+    </w:p>
+    <w:p>
+      <w:pPr>
+        <w:rPr>
+          <w:lang w:val="ru-RU"/>
+        </w:rPr>
+      </w:pPr>
+      <w:r>
+        <w:rPr>
+          <w:lang w:val="ru-RU"/>
+        </w:rPr>
+        <w:t>2. Безопасность и конфиденциальность</w:t>
+      </w:r>
+    </w:p>
+    <w:p>
+      <w:pPr>
+        <w:rPr>
+          <w:lang w:val="ru-RU"/>
+        </w:rPr>
+      </w:pPr>
+      <w:r>
+        <w:rPr>
+          <w:lang w:val="ru-RU"/>
+        </w:rPr>
+        <w:lastRenderedPageBreak/>
+        <w:t>- Шифрование: использование E2EE (сквозное шифрование), алгоритмы шифрования (AES, RSA и др.).</w:t>
+      </w:r>
+    </w:p>
+    <w:p>
+      <w:pPr>
+        <w:rPr>
+          <w:lang w:val="ru-RU"/>
+        </w:rPr>
+      </w:pPr>
+      <w:r>
+        <w:rPr>
+          <w:lang w:val="ru-RU"/>
+        </w:rPr>
+        <w:t>- Анонимность: возможность регистрации без номера телефона, поддержка анонимных аккаунтов.</w:t>
+      </w:r>
+    </w:p>
+    <w:p>
+      <w:pPr>
+        <w:rPr>
+          <w:lang w:val="ru-RU"/>
+        </w:rPr>
+      </w:pPr>
+      <w:r>
+        <w:rPr>
+          <w:lang w:val="ru-RU"/>
+        </w:rPr>
+        <w:t>- Хранение данных: где и как хранятся сообщения (локально/на сервере), политика хранения.</w:t>
+      </w:r>
+    </w:p>
+    <w:p>
+      <w:pPr>
+        <w:rPr>
+          <w:lang w:val="ru-RU"/>
+        </w:rPr>
+      </w:pPr>
+      <w:r>
+        <w:rPr>
+          <w:lang w:val="ru-RU"/>
+        </w:rPr>
+        <w:t>- Защита от взлома: механизмы аутентификации, двухфакторная аутентификация, защита от фишинга.</w:t>
+      </w:r>
+    </w:p>
+    <w:p>
+      <w:pPr>
+        <w:rPr>
+          <w:lang w:val="ru-RU"/>
+        </w:rPr>
+      </w:pPr>
+      <w:r>
+        <w:rPr>
+          <w:lang w:val="ru-RU"/>
+        </w:rPr>
+        <w:t>3. Функциональность</w:t>
+      </w:r>
+    </w:p>
+    <w:p>
+      <w:pPr>
+        <w:rPr>
+          <w:lang w:val="ru-RU"/>
+        </w:rPr>
+      </w:pPr>
+    </w:p>
+    <w:p>
+      <w:pPr>
+        <w:rPr>
+          <w:lang w:val="ru-RU"/>
+        </w:rPr>
+      </w:pPr>
+      <w:r>
+        <w:rPr>
+          <w:lang w:val="ru-RU"/>
+        </w:rPr>
+        <w:t>- Базовые возможности: чаты (групповые, личные), голосовые и видеозвонки, обмен файлами.</w:t>
+      </w:r>
+    </w:p>
+    <w:p>
+      <w:pPr>
+        <w:rPr>
+          <w:lang w:val="ru-RU"/>
+        </w:rPr>
+      </w:pPr>
+      <w:r>
+        <w:rPr>
+          <w:lang w:val="ru-RU"/>
+        </w:rPr>
+        <w:t>- **Расширенные функции:* каналы*, боты, интеграции с внешними сервисами, инструменты для бизнеса (платежи, рассылки).</w:t>
+      </w:r>
+    </w:p>
+    <w:p>
+      <w:pPr>
+        <w:rPr>
+          <w:lang w:val="ru-RU"/>
+        </w:rPr>
+      </w:pPr>
+      <w:r>
+        <w:rPr>
+          <w:lang w:val="ru-RU"/>
+        </w:rPr>
+        <w:t>- Потребление контента: поддержка медиафайлов, ленты новостей, интеграция с социальными сетями.</w:t>
+      </w:r>
+    </w:p>
+    <w:p>
+      <w:pPr>
+        <w:rPr>
+          <w:lang w:val="ru-RU"/>
+        </w:rPr>
+      </w:pPr>
+      <w:r>
+        <w:rPr>
+          <w:lang w:val="ru-RU"/>
+        </w:rPr>
+        <w:t>- Настройка интерфейса: темы, кастомизация, доступность для людей с ограниченными возможностями.</w:t>
+      </w:r>
+    </w:p>
+    <w:p>
+      <w:pPr>
+        <w:rPr>
+          <w:lang w:val="ru-RU"/>
+        </w:rPr>
+      </w:pPr>
+      <w:r>
+        <w:rPr>
+          <w:lang w:val="ru-RU"/>
+        </w:rPr>
+        <w:t>4. Пользовательский опыт (UX/UI)</w:t>
+      </w:r>
+    </w:p>
+    <w:p>
+      <w:pPr>
+        <w:rPr>
+          <w:lang w:val="ru-RU"/>
+        </w:rPr>
+      </w:pPr>
+      <w:r>
+        <w:rPr>
+          <w:lang w:val="ru-RU"/>
+        </w:rPr>
+        <w:t>- Удобство интерфейса: интуитивность, скорость работы, адаптивность.</w:t>
+      </w:r>
+    </w:p>
+    <w:p>
+      <w:pPr>
+        <w:rPr>
+          <w:lang w:val="ru-RU"/>
+        </w:rPr>
+      </w:pPr>
+      <w:r>
+        <w:rPr>
+          <w:lang w:val="ru-RU"/>
+        </w:rPr>
+        <w:t>- Локализация: поддержка русского языка и региональных особенностей.</w:t>
+      </w:r>
+    </w:p>
+    <w:p>
+      <w:pPr>
+        <w:rPr>
+          <w:lang w:val="ru-RU"/>
+        </w:rPr>
+      </w:pPr>
+      <w:r>
+        <w:rPr>
+          <w:lang w:val="ru-RU"/>
+        </w:rPr>
+        <w:t>- Обратная связь: наличие поддержки, скорость ответа на обращения.</w:t>
+      </w:r>
+    </w:p>
+    <w:p>
+      <w:pPr>
+        <w:rPr>
+          <w:lang w:val="ru-RU"/>
+        </w:rPr>
+      </w:pPr>
+      <w:r>
+        <w:rPr>
+          <w:lang w:val="ru-RU"/>
+        </w:rPr>
+        <w:t>5. Экосистема и интеграции</w:t>
+      </w:r>
+    </w:p>
+    <w:p>
+      <w:pPr>
+        <w:rPr>
+          <w:lang w:val="ru-RU"/>
+        </w:rPr>
+      </w:pPr>
+      <w:r>
+        <w:rPr>
+          <w:lang w:val="ru-RU"/>
+        </w:rPr>
+        <w:t>- API и SDK: наличие открытых инструментов для разработчиков.</w:t>
+      </w:r>
+    </w:p>
+    <w:p>
+      <w:pPr>
+        <w:rPr>
+          <w:lang w:val="ru-RU"/>
+        </w:rPr>
+      </w:pPr>
+      <w:r>
+        <w:rPr>
+          <w:lang w:val="ru-RU"/>
+        </w:rPr>
+        <w:t>- Интеграции: с корпоративными системами (CRM, ERP), платежными сервисами, календарями.</w:t>
+      </w:r>
+    </w:p>
+    <w:p>
+      <w:pPr>
+        <w:rPr>
+          <w:lang w:val="ru-RU"/>
+        </w:rPr>
+      </w:pPr>
+      <w:r>
+        <w:rPr>
+          <w:lang w:val="ru-RU"/>
+        </w:rPr>
+        <w:t>- Сообщество: активность пользователей, наличие форумов, каналов поддержки.</w:t>
+      </w:r>
+    </w:p>
+    <w:p>
+      <w:pPr>
+        <w:rPr>
+          <w:lang w:val="ru-RU"/>
+        </w:rPr>
+      </w:pPr>
+      <w:r>
+        <w:rPr>
+          <w:lang w:val="ru-RU"/>
+        </w:rPr>
+        <w:t>6. Экономические и юридические аспекты</w:t>
+      </w:r>
+    </w:p>
+    <w:p>
+      <w:pPr>
+        <w:rPr>
+          <w:lang w:val="ru-RU"/>
+        </w:rPr>
+      </w:pPr>
+      <w:r>
+        <w:rPr>
+          <w:lang w:val="ru-RU"/>
+        </w:rPr>
+        <w:t>- Модель монетизации: платные функции, подписки, реклама.</w:t>
+      </w:r>
+    </w:p>
+    <w:p>
+      <w:pPr>
+        <w:rPr>
+          <w:lang w:val="ru-RU"/>
+        </w:rPr>
+      </w:pPr>
+      <w:r>
+        <w:rPr>
+          <w:lang w:val="ru-RU"/>
+        </w:rPr>
+        <w:t>- Юрисдикция: страна регистрации компании-разработчика, соответствие законодательству РФ.</w:t>
+      </w:r>
+    </w:p>
+    <w:p>
+      <w:pPr>
+        <w:rPr>
+          <w:lang w:val="ru-RU"/>
+        </w:rPr>
+      </w:pPr>
+      <w:r>
+        <w:rPr>
+          <w:lang w:val="ru-RU"/>
+        </w:rPr>
+        <w:t>- Политика конфиденциальности: прозрачность сбора и использования данных.</w:t>
+      </w:r>
+    </w:p>
+    <w:p>
+      <w:pPr>
+        <w:pStyle w:val="2"/>
+        <w:rPr>
+          <w:lang w:val="ru-RU"/>
+        </w:rPr>
+      </w:pPr>
+      <w:r>
+        <w:rPr>
+          <w:lang w:val="ru-RU"/>
+        </w:rPr>
+        <w:lastRenderedPageBreak/>
+        <w:t>2 Практическая часть</w:t>
+      </w:r>
+    </w:p>
+    <w:p>
+      <w:pPr>
+        <w:pStyle w:val="3"/>
+        <w:rPr>
+          <w:lang w:val="ru-RU"/>
+        </w:rPr>
+      </w:pPr>
+      <w:r>
+        <w:rPr>
+          <w:lang w:val="ru-RU"/>
+        </w:rPr>
+        <w:t>2.1</w:t>
+      </w:r>
+      <w:r>
+        <w:rPr>
+          <w:lang w:val="ru-RU"/>
+        </w:rPr>
+        <w:t xml:space="preserve"> Проектирование приложения</w:t>
       </w:r>
     </w:p>
     <w:p>
@@ -540,12 +2333,12 @@
         <w:rPr>
           <w:b/>
           <w:bCs/>
-          <w:lang w:val="en-US"/>
-        </w:rPr>
-      </w:pPr>
-      <w:r>
-        <w:rPr>
-          <w:lang w:val="en-US"/>
+          <w:lang w:val="ru-RU"/>
+        </w:rPr>
+      </w:pPr>
+      <w:r>
+        <w:rPr>
+          <w:lang w:val="ru-RU"/>
         </w:rPr>
         <w:br w:type="page"/>
       </w:r>
@@ -559,7 +2352,7 @@
       </w:pPr>
       <w:r>
         <w:rPr>
-          <w:lang w:val="en-US"/>
+          <w:lang w:val="ru-RU"/>
         </w:rPr>
         <w:lastRenderedPageBreak/>
         <w:t xml:space="preserve">2 </w:t>
@@ -638,7 +2431,7 @@
                 <w:noProof/>
               </w:rPr>
               <w:drawing>
-                <wp:inline distT="0" distB="0" distL="0" distR="0" wp14:anchorId="71671DD3" wp14:editId="55FE2B50">
+                <wp:inline distT="0" distB="0" distL="0" distR="0" wp14:anchorId="71671DD3" wp14:editId="0190AA2D">
                   <wp:extent cx="1825200" cy="4057200"/>
                   <wp:effectExtent l="0" t="0" r="3810" b="635"/>
                   <wp:docPr id="123481061" name="Рисунок 3"/>
@@ -695,7 +2488,7 @@
                 <w:noProof/>
               </w:rPr>
               <w:drawing>
-                <wp:inline distT="0" distB="0" distL="0" distR="0" wp14:anchorId="38B411F3" wp14:editId="7951E654">
+                <wp:inline distT="0" distB="0" distL="0" distR="0" wp14:anchorId="38B411F3" wp14:editId="1BBB7553">
                   <wp:extent cx="1825200" cy="4057200"/>
                   <wp:effectExtent l="0" t="0" r="3810" b="635"/>
                   <wp:docPr id="938729790" name="Рисунок 4"/>
@@ -787,7 +2580,7 @@
       <w:pPr>
         <w:pStyle w:val="1"/>
         <w:rPr>
-          <w:lang w:val="ru-RU"/>
+          <w:lang w:val="en-US"/>
         </w:rPr>
       </w:pPr>
       <w:bookmarkStart w:id="16" w:name="_nc8amvv1wtnt" w:colFirst="0" w:colLast="0"/>
@@ -803,10 +2596,816 @@
     </w:p>
     <w:p>
       <w:pPr>
+        <w:rPr>
+          <w:lang w:val="ru-RU"/>
+        </w:rPr>
+      </w:pPr>
+      <w:r>
+        <w:rPr>
+          <w:lang w:val="ru-RU"/>
+        </w:rPr>
+        <w:t xml:space="preserve">1 </w:t>
+      </w:r>
+      <w:proofErr w:type="spellStart"/>
+      <w:r>
+        <w:rPr>
+          <w:lang w:val="en-US"/>
+        </w:rPr>
+        <w:t>Whatsapp</w:t>
+      </w:r>
+      <w:proofErr w:type="spellEnd"/>
+      <w:r>
+        <w:rPr>
+          <w:lang w:val="ru-RU"/>
+        </w:rPr>
+        <w:t xml:space="preserve"> – </w:t>
+      </w:r>
+      <w:r>
+        <w:rPr>
+          <w:lang w:val="en-US"/>
+        </w:rPr>
+        <w:t>URL</w:t>
+      </w:r>
+      <w:r>
+        <w:rPr>
+          <w:lang w:val="ru-RU"/>
+        </w:rPr>
+        <w:t xml:space="preserve">: </w:t>
+      </w:r>
+      <w:hyperlink r:id="rId11" w:history="1">
+        <w:r>
+          <w:rPr>
+            <w:rStyle w:val="a9"/>
+            <w:lang w:val="en-US"/>
+          </w:rPr>
+          <w:t>https</w:t>
+        </w:r>
+        <w:r>
+          <w:rPr>
+            <w:rStyle w:val="a9"/>
+            <w:lang w:val="ru-RU"/>
+          </w:rPr>
+          <w:t>://</w:t>
+        </w:r>
+        <w:r>
+          <w:rPr>
+            <w:rStyle w:val="a9"/>
+            <w:lang w:val="en-US"/>
+          </w:rPr>
+          <w:t>www</w:t>
+        </w:r>
+        <w:r>
+          <w:rPr>
+            <w:rStyle w:val="a9"/>
+            <w:lang w:val="ru-RU"/>
+          </w:rPr>
+          <w:t>.</w:t>
+        </w:r>
+        <w:proofErr w:type="spellStart"/>
+        <w:r>
+          <w:rPr>
+            <w:rStyle w:val="a9"/>
+            <w:lang w:val="en-US"/>
+          </w:rPr>
+          <w:t>whatsapp</w:t>
+        </w:r>
+        <w:proofErr w:type="spellEnd"/>
+        <w:r>
+          <w:rPr>
+            <w:rStyle w:val="a9"/>
+            <w:lang w:val="ru-RU"/>
+          </w:rPr>
+          <w:t>.</w:t>
+        </w:r>
+        <w:r>
+          <w:rPr>
+            <w:rStyle w:val="a9"/>
+            <w:lang w:val="en-US"/>
+          </w:rPr>
+          <w:t>com</w:t>
+        </w:r>
+        <w:r>
+          <w:rPr>
+            <w:rStyle w:val="a9"/>
+            <w:lang w:val="ru-RU"/>
+          </w:rPr>
+          <w:t>/</w:t>
+        </w:r>
+        <w:r>
+          <w:rPr>
+            <w:rStyle w:val="a9"/>
+            <w:lang w:val="en-US"/>
+          </w:rPr>
+          <w:t>about</w:t>
+        </w:r>
+      </w:hyperlink>
+      <w:r>
+        <w:rPr>
+          <w:lang w:val="ru-RU"/>
+        </w:rPr>
+        <w:t xml:space="preserve"> </w:t>
+      </w:r>
+      <w:r>
+        <w:rPr>
+          <w:lang w:val="ru-RU"/>
+        </w:rPr>
+        <w:t xml:space="preserve">(дата обращения </w:t>
+      </w:r>
+      <w:r>
+        <w:rPr>
+          <w:lang w:val="ru-RU"/>
+        </w:rPr>
+        <w:t>01</w:t>
+      </w:r>
+      <w:r>
+        <w:rPr>
+          <w:lang w:val="ru-RU"/>
+        </w:rPr>
+        <w:t>.</w:t>
+      </w:r>
+      <w:r>
+        <w:rPr>
+          <w:lang w:val="ru-RU"/>
+        </w:rPr>
+        <w:t>05</w:t>
+      </w:r>
+      <w:r>
+        <w:rPr>
+          <w:lang w:val="ru-RU"/>
+        </w:rPr>
+        <w:t>.202</w:t>
+      </w:r>
+      <w:r>
+        <w:rPr>
+          <w:lang w:val="ru-RU"/>
+        </w:rPr>
+        <w:t>6</w:t>
+      </w:r>
+      <w:r>
+        <w:rPr>
+          <w:lang w:val="ru-RU"/>
+        </w:rPr>
+        <w:t>).</w:t>
+      </w:r>
+    </w:p>
+    <w:p>
+      <w:pPr>
+        <w:rPr>
+          <w:lang w:val="ru-RU"/>
+        </w:rPr>
+      </w:pPr>
+      <w:r>
+        <w:rPr>
+          <w:lang w:val="ru-RU"/>
+        </w:rPr>
+        <w:t xml:space="preserve">2 </w:t>
+      </w:r>
+      <w:r>
+        <w:rPr>
+          <w:lang w:val="en-US"/>
+        </w:rPr>
+        <w:t>Telegram</w:t>
+      </w:r>
+      <w:r>
+        <w:rPr>
+          <w:lang w:val="ru-RU"/>
+        </w:rPr>
+        <w:t xml:space="preserve"> – </w:t>
+      </w:r>
+      <w:r>
+        <w:rPr>
+          <w:lang w:val="en-US"/>
+        </w:rPr>
+        <w:t>URL</w:t>
+      </w:r>
+      <w:r>
+        <w:rPr>
+          <w:lang w:val="ru-RU"/>
+        </w:rPr>
+        <w:t xml:space="preserve">: </w:t>
+      </w:r>
+      <w:hyperlink r:id="rId12" w:history="1">
+        <w:r>
+          <w:rPr>
+            <w:rStyle w:val="a9"/>
+            <w:lang w:val="en-US"/>
+          </w:rPr>
+          <w:t>https</w:t>
+        </w:r>
+        <w:r>
+          <w:rPr>
+            <w:rStyle w:val="a9"/>
+            <w:lang w:val="ru-RU"/>
+          </w:rPr>
+          <w:t>://</w:t>
+        </w:r>
+        <w:r>
+          <w:rPr>
+            <w:rStyle w:val="a9"/>
+            <w:lang w:val="en-US"/>
+          </w:rPr>
+          <w:t>telegram</w:t>
+        </w:r>
+        <w:r>
+          <w:rPr>
+            <w:rStyle w:val="a9"/>
+            <w:lang w:val="ru-RU"/>
+          </w:rPr>
+          <w:t>.</w:t>
+        </w:r>
+        <w:r>
+          <w:rPr>
+            <w:rStyle w:val="a9"/>
+            <w:lang w:val="en-US"/>
+          </w:rPr>
+          <w:t>org</w:t>
+        </w:r>
+        <w:r>
+          <w:rPr>
+            <w:rStyle w:val="a9"/>
+            <w:lang w:val="ru-RU"/>
+          </w:rPr>
+          <w:t>/</w:t>
+        </w:r>
+        <w:proofErr w:type="spellStart"/>
+        <w:r>
+          <w:rPr>
+            <w:rStyle w:val="a9"/>
+            <w:lang w:val="en-US"/>
+          </w:rPr>
+          <w:t>faq</w:t>
+        </w:r>
+        <w:proofErr w:type="spellEnd"/>
+      </w:hyperlink>
+      <w:r>
+        <w:rPr>
+          <w:lang w:val="ru-RU"/>
+        </w:rPr>
+        <w:t xml:space="preserve"> (</w:t>
+      </w:r>
+      <w:r>
+        <w:rPr>
+          <w:lang w:val="ru-RU"/>
+        </w:rPr>
+        <w:t>дата</w:t>
+      </w:r>
+      <w:r>
+        <w:rPr>
+          <w:lang w:val="ru-RU"/>
+        </w:rPr>
+        <w:t xml:space="preserve"> </w:t>
+      </w:r>
+      <w:r>
+        <w:rPr>
+          <w:lang w:val="ru-RU"/>
+        </w:rPr>
+        <w:t xml:space="preserve">обращения </w:t>
+      </w:r>
+      <w:r>
+        <w:rPr>
+          <w:lang w:val="ru-RU"/>
+        </w:rPr>
+        <w:t>01.05.2026</w:t>
+      </w:r>
+      <w:r>
+        <w:rPr>
+          <w:lang w:val="ru-RU"/>
+        </w:rPr>
+        <w:t>).</w:t>
+      </w:r>
+    </w:p>
+    <w:p>
+      <w:pPr>
+        <w:rPr>
+          <w:lang w:val="ru-RU"/>
+        </w:rPr>
+      </w:pPr>
+      <w:r>
+        <w:rPr>
+          <w:lang w:val="ru-RU"/>
+        </w:rPr>
+        <w:t xml:space="preserve">3 </w:t>
+      </w:r>
+      <w:r>
+        <w:rPr>
+          <w:lang w:val="en-US"/>
+        </w:rPr>
+        <w:t>VK</w:t>
+      </w:r>
+      <w:r>
+        <w:rPr>
+          <w:lang w:val="ru-RU"/>
+        </w:rPr>
+        <w:t xml:space="preserve"> </w:t>
+      </w:r>
+      <w:r>
+        <w:rPr>
+          <w:lang w:val="ru-RU"/>
+        </w:rPr>
+        <w:t xml:space="preserve">Мессенджер – </w:t>
+      </w:r>
+      <w:r>
+        <w:rPr>
+          <w:lang w:val="en-US"/>
+        </w:rPr>
+        <w:t>URL</w:t>
+      </w:r>
+      <w:r>
+        <w:rPr>
+          <w:lang w:val="ru-RU"/>
+        </w:rPr>
+        <w:t xml:space="preserve">: </w:t>
+      </w:r>
+      <w:hyperlink r:id="rId13" w:history="1">
+        <w:r>
+          <w:rPr>
+            <w:rStyle w:val="a9"/>
+            <w:lang w:val="en-US"/>
+          </w:rPr>
+          <w:t>https</w:t>
+        </w:r>
+        <w:r>
+          <w:rPr>
+            <w:rStyle w:val="a9"/>
+            <w:lang w:val="ru-RU"/>
+          </w:rPr>
+          <w:t>://</w:t>
+        </w:r>
+        <w:r>
+          <w:rPr>
+            <w:rStyle w:val="a9"/>
+            <w:lang w:val="en-US"/>
+          </w:rPr>
+          <w:t>team</w:t>
+        </w:r>
+        <w:r>
+          <w:rPr>
+            <w:rStyle w:val="a9"/>
+            <w:lang w:val="ru-RU"/>
+          </w:rPr>
+          <w:t>.</w:t>
+        </w:r>
+        <w:proofErr w:type="spellStart"/>
+        <w:r>
+          <w:rPr>
+            <w:rStyle w:val="a9"/>
+            <w:lang w:val="en-US"/>
+          </w:rPr>
+          <w:t>vk</w:t>
+        </w:r>
+        <w:proofErr w:type="spellEnd"/>
+        <w:r>
+          <w:rPr>
+            <w:rStyle w:val="a9"/>
+            <w:lang w:val="ru-RU"/>
+          </w:rPr>
+          <w:t>.</w:t>
+        </w:r>
+        <w:r>
+          <w:rPr>
+            <w:rStyle w:val="a9"/>
+            <w:lang w:val="en-US"/>
+          </w:rPr>
+          <w:t>company</w:t>
+        </w:r>
+        <w:r>
+          <w:rPr>
+            <w:rStyle w:val="a9"/>
+            <w:lang w:val="ru-RU"/>
+          </w:rPr>
+          <w:t>/</w:t>
+        </w:r>
+        <w:r>
+          <w:rPr>
+            <w:rStyle w:val="a9"/>
+            <w:lang w:val="en-US"/>
+          </w:rPr>
+          <w:t>projects</w:t>
+        </w:r>
+        <w:r>
+          <w:rPr>
+            <w:rStyle w:val="a9"/>
+            <w:lang w:val="ru-RU"/>
+          </w:rPr>
+          <w:t>/294/</w:t>
+        </w:r>
+      </w:hyperlink>
+      <w:r>
+        <w:rPr>
+          <w:lang w:val="ru-RU"/>
+        </w:rPr>
+        <w:t xml:space="preserve"> (</w:t>
+      </w:r>
+      <w:r>
+        <w:rPr>
+          <w:lang w:val="ru-RU"/>
+        </w:rPr>
+        <w:t>дата обращения 01.05.2026</w:t>
+      </w:r>
+      <w:r>
+        <w:rPr>
+          <w:lang w:val="ru-RU"/>
+        </w:rPr>
+        <w:t>).</w:t>
+      </w:r>
+    </w:p>
+    <w:p>
+      <w:pPr>
+        <w:rPr>
+          <w:lang w:val="ru-RU"/>
+        </w:rPr>
+      </w:pPr>
+      <w:r>
+        <w:rPr>
+          <w:lang w:val="ru-RU"/>
+        </w:rPr>
+        <w:t>4</w:t>
+      </w:r>
+      <w:r>
+        <w:rPr>
+          <w:lang w:val="ru-RU"/>
+        </w:rPr>
+        <w:t xml:space="preserve"> </w:t>
+      </w:r>
+      <w:r>
+        <w:rPr>
+          <w:lang w:val="ru-RU"/>
+        </w:rPr>
+        <w:t xml:space="preserve">Статья на форуме </w:t>
+      </w:r>
+      <w:r>
+        <w:rPr>
+          <w:lang w:val="ru-RU"/>
+        </w:rPr>
+        <w:t>4</w:t>
+      </w:r>
+      <w:r>
+        <w:rPr>
+          <w:lang w:val="en-US"/>
+        </w:rPr>
+        <w:t>PDA</w:t>
+      </w:r>
+      <w:r>
+        <w:rPr>
+          <w:lang w:val="ru-RU"/>
+        </w:rPr>
+        <w:t xml:space="preserve"> </w:t>
+      </w:r>
+      <w:r>
+        <w:rPr>
+          <w:lang w:val="ru-RU"/>
+        </w:rPr>
+        <w:t xml:space="preserve">о мессенджере </w:t>
+      </w:r>
+      <w:proofErr w:type="spellStart"/>
+      <w:r>
+        <w:rPr>
+          <w:lang w:val="en-US"/>
+        </w:rPr>
+        <w:t>XChat</w:t>
+      </w:r>
+      <w:proofErr w:type="spellEnd"/>
+      <w:r>
+        <w:rPr>
+          <w:lang w:val="ru-RU"/>
+        </w:rPr>
+        <w:t xml:space="preserve"> </w:t>
+      </w:r>
+      <w:r>
+        <w:rPr>
+          <w:lang w:val="ru-RU"/>
+        </w:rPr>
+        <w:t>–</w:t>
+      </w:r>
+      <w:r>
+        <w:rPr>
+          <w:lang w:val="ru-RU"/>
+        </w:rPr>
+        <w:t xml:space="preserve"> </w:t>
+      </w:r>
+      <w:r>
+        <w:rPr>
+          <w:lang w:val="en-US"/>
+        </w:rPr>
+        <w:t>URL</w:t>
+      </w:r>
+      <w:r>
+        <w:rPr>
+          <w:lang w:val="ru-RU"/>
+        </w:rPr>
+        <w:t xml:space="preserve">: </w:t>
+      </w:r>
+      <w:hyperlink r:id="rId14" w:history="1">
+        <w:r>
+          <w:rPr>
+            <w:rStyle w:val="a9"/>
+            <w:lang w:val="ru-RU"/>
+          </w:rPr>
+          <w:t>https://4pda.to/2026/04/25/455711/vyshlo_prilozhenie_xchat_eto_zaschischyonnyj_messendzher_ot_ilona_maska/</w:t>
+        </w:r>
+      </w:hyperlink>
+      <w:r>
+        <w:rPr>
+          <w:lang w:val="ru-RU"/>
+        </w:rPr>
+        <w:t xml:space="preserve"> (</w:t>
+      </w:r>
+      <w:r>
+        <w:rPr>
+          <w:lang w:val="ru-RU"/>
+        </w:rPr>
+        <w:t>дата обращения 01.05.2026</w:t>
+      </w:r>
+      <w:r>
+        <w:rPr>
+          <w:lang w:val="ru-RU"/>
+        </w:rPr>
+        <w:t>)</w:t>
+      </w:r>
+      <w:r>
+        <w:rPr>
+          <w:lang w:val="ru-RU"/>
+        </w:rPr>
+        <w:t>.</w:t>
+      </w:r>
+    </w:p>
+    <w:p>
+      <w:pPr>
+        <w:rPr>
+          <w:lang w:val="ru-RU"/>
+        </w:rPr>
+      </w:pPr>
+      <w:r>
+        <w:rPr>
+          <w:lang w:val="ru-RU"/>
+        </w:rPr>
+        <w:t xml:space="preserve">5 </w:t>
+      </w:r>
+      <w:r>
+        <w:rPr>
+          <w:lang w:val="en-US"/>
+        </w:rPr>
+        <w:t>Signal</w:t>
+      </w:r>
+      <w:r>
+        <w:rPr>
+          <w:lang w:val="ru-RU"/>
+        </w:rPr>
+        <w:t xml:space="preserve"> – </w:t>
+      </w:r>
+      <w:r>
+        <w:rPr>
+          <w:lang w:val="en-US"/>
+        </w:rPr>
+        <w:t>URL</w:t>
+      </w:r>
+      <w:r>
+        <w:rPr>
+          <w:lang w:val="ru-RU"/>
+        </w:rPr>
+        <w:t xml:space="preserve">: </w:t>
+      </w:r>
+      <w:hyperlink r:id="rId15" w:history="1">
+        <w:r>
+          <w:rPr>
+            <w:rStyle w:val="a9"/>
+            <w:lang w:val="en-US"/>
+          </w:rPr>
+          <w:t>https</w:t>
+        </w:r>
+        <w:r>
+          <w:rPr>
+            <w:rStyle w:val="a9"/>
+            <w:lang w:val="ru-RU"/>
+          </w:rPr>
+          <w:t>://</w:t>
+        </w:r>
+        <w:r>
+          <w:rPr>
+            <w:rStyle w:val="a9"/>
+            <w:lang w:val="en-US"/>
+          </w:rPr>
+          <w:t>signal</w:t>
+        </w:r>
+        <w:r>
+          <w:rPr>
+            <w:rStyle w:val="a9"/>
+            <w:lang w:val="ru-RU"/>
+          </w:rPr>
+          <w:t>.</w:t>
+        </w:r>
+        <w:r>
+          <w:rPr>
+            <w:rStyle w:val="a9"/>
+            <w:lang w:val="en-US"/>
+          </w:rPr>
+          <w:t>org</w:t>
+        </w:r>
+        <w:r>
+          <w:rPr>
+            <w:rStyle w:val="a9"/>
+            <w:lang w:val="ru-RU"/>
+          </w:rPr>
+          <w:t>/</w:t>
+        </w:r>
+      </w:hyperlink>
+      <w:r>
+        <w:rPr>
+          <w:lang w:val="ru-RU"/>
+        </w:rPr>
+        <w:t xml:space="preserve"> (</w:t>
+      </w:r>
+      <w:r>
+        <w:rPr>
+          <w:lang w:val="ru-RU"/>
+        </w:rPr>
+        <w:t>дата</w:t>
+      </w:r>
+      <w:r>
+        <w:rPr>
+          <w:lang w:val="ru-RU"/>
+        </w:rPr>
+        <w:t xml:space="preserve"> </w:t>
+      </w:r>
+      <w:r>
+        <w:rPr>
+          <w:lang w:val="ru-RU"/>
+        </w:rPr>
+        <w:t>обращения 01.05.2026</w:t>
+      </w:r>
+      <w:r>
+        <w:rPr>
+          <w:lang w:val="ru-RU"/>
+        </w:rPr>
+        <w:t>)</w:t>
+      </w:r>
+      <w:r>
+        <w:rPr>
+          <w:lang w:val="ru-RU"/>
+        </w:rPr>
+        <w:t>.</w:t>
+      </w:r>
+    </w:p>
+    <w:p>
+      <w:pPr>
+        <w:rPr>
+          <w:lang w:val="ru-RU"/>
+        </w:rPr>
+      </w:pPr>
+      <w:r>
+        <w:rPr>
+          <w:lang w:val="ru-RU"/>
+        </w:rPr>
+        <w:t xml:space="preserve">6 </w:t>
+      </w:r>
+      <w:proofErr w:type="spellStart"/>
+      <w:r>
+        <w:rPr>
+          <w:lang w:val="en-US"/>
+        </w:rPr>
+        <w:t>YouGile</w:t>
+      </w:r>
+      <w:proofErr w:type="spellEnd"/>
+      <w:r>
+        <w:rPr>
+          <w:lang w:val="ru-RU"/>
+        </w:rPr>
+        <w:t xml:space="preserve"> – </w:t>
+      </w:r>
+      <w:r>
+        <w:rPr>
+          <w:lang w:val="en-US"/>
+        </w:rPr>
+        <w:t>URL</w:t>
+      </w:r>
+      <w:r>
+        <w:rPr>
+          <w:lang w:val="ru-RU"/>
+        </w:rPr>
+        <w:t xml:space="preserve">: </w:t>
+      </w:r>
+      <w:hyperlink r:id="rId16" w:history="1">
+        <w:r>
+          <w:rPr>
+            <w:rStyle w:val="a9"/>
+            <w:lang w:val="en-US"/>
+          </w:rPr>
+          <w:t>https</w:t>
+        </w:r>
+        <w:r>
+          <w:rPr>
+            <w:rStyle w:val="a9"/>
+            <w:lang w:val="ru-RU"/>
+          </w:rPr>
+          <w:t>://</w:t>
+        </w:r>
+        <w:proofErr w:type="spellStart"/>
+        <w:r>
+          <w:rPr>
+            <w:rStyle w:val="a9"/>
+            <w:lang w:val="en-US"/>
+          </w:rPr>
+          <w:t>ru</w:t>
+        </w:r>
+        <w:proofErr w:type="spellEnd"/>
+        <w:r>
+          <w:rPr>
+            <w:rStyle w:val="a9"/>
+            <w:lang w:val="ru-RU"/>
+          </w:rPr>
+          <w:t>.</w:t>
+        </w:r>
+        <w:proofErr w:type="spellStart"/>
+        <w:r>
+          <w:rPr>
+            <w:rStyle w:val="a9"/>
+            <w:lang w:val="en-US"/>
+          </w:rPr>
+          <w:t>yougile</w:t>
+        </w:r>
+        <w:proofErr w:type="spellEnd"/>
+        <w:r>
+          <w:rPr>
+            <w:rStyle w:val="a9"/>
+            <w:lang w:val="ru-RU"/>
+          </w:rPr>
+          <w:t>.</w:t>
+        </w:r>
+        <w:r>
+          <w:rPr>
+            <w:rStyle w:val="a9"/>
+            <w:lang w:val="en-US"/>
+          </w:rPr>
+          <w:t>com</w:t>
+        </w:r>
+        <w:r>
+          <w:rPr>
+            <w:rStyle w:val="a9"/>
+            <w:lang w:val="ru-RU"/>
+          </w:rPr>
+          <w:t>/</w:t>
+        </w:r>
+        <w:r>
+          <w:rPr>
+            <w:rStyle w:val="a9"/>
+            <w:lang w:val="en-US"/>
+          </w:rPr>
+          <w:t>messenger</w:t>
+        </w:r>
+      </w:hyperlink>
+      <w:r>
+        <w:rPr>
+          <w:lang w:val="ru-RU"/>
+        </w:rPr>
+        <w:t xml:space="preserve"> (</w:t>
+      </w:r>
+      <w:r>
+        <w:rPr>
+          <w:lang w:val="ru-RU"/>
+        </w:rPr>
+        <w:t>дата</w:t>
+      </w:r>
+      <w:r>
+        <w:rPr>
+          <w:lang w:val="ru-RU"/>
+        </w:rPr>
+        <w:t xml:space="preserve"> </w:t>
+      </w:r>
+      <w:r>
+        <w:rPr>
+          <w:lang w:val="ru-RU"/>
+        </w:rPr>
+        <w:t>обращения 01.05.2026</w:t>
+      </w:r>
+      <w:r>
+        <w:rPr>
+          <w:lang w:val="ru-RU"/>
+        </w:rPr>
+        <w:t>)</w:t>
+      </w:r>
+      <w:r>
+        <w:rPr>
+          <w:lang w:val="ru-RU"/>
+        </w:rPr>
+        <w:t>.</w:t>
+      </w:r>
+    </w:p>
+    <w:p>
+      <w:pPr>
+        <w:rPr>
+          <w:lang w:val="ru-RU"/>
+        </w:rPr>
+      </w:pPr>
+    </w:p>
+    <w:p>
+      <w:pPr>
         <w:pStyle w:val="1"/>
+        <w:rPr>
+          <w:lang w:val="ru-RU"/>
+        </w:rPr>
         <w:sectPr>
-          <w:footerReference w:type="default" r:id="rId11"/>
-          <w:footerReference w:type="first" r:id="rId12"/>
+          <w:footerReference w:type="default" r:id="rId17"/>
+          <w:footerReference w:type="first" r:id="rId18"/>
           <w:pgSz w:w="11909" w:h="16834"/>
           <w:pgMar w:top="1133" w:right="850" w:bottom="1133" w:left="1700" w:header="720" w:footer="720" w:gutter="0"/>
           <w:pgNumType w:start="1"/>
@@ -842,7 +3441,7 @@
         <w:rPr>
           <w:b/>
           <w:bCs/>
-          <w:lang w:val="en-US"/>
+          <w:lang w:val="ru-RU"/>
         </w:rPr>
       </w:pPr>
       <w:r>
@@ -891,7 +3490,7 @@
                     <pic:cNvPicPr/>
                   </pic:nvPicPr>
                   <pic:blipFill>
-                    <a:blip r:embed="rId13">
+                    <a:blip r:embed="rId19">
                       <a:extLst>
                         <a:ext uri="{28A0092B-C50C-407E-A947-70E740481C1C}">
                           <a14:useLocalDpi xmlns:a14="http://schemas.microsoft.com/office/drawing/2010/main" val="0"/>
@@ -1039,7 +3638,7 @@
                     <pic:cNvPicPr/>
                   </pic:nvPicPr>
                   <pic:blipFill>
-                    <a:blip r:embed="rId14">
+                    <a:blip r:embed="rId20">
                       <a:extLst>
                         <a:ext uri="{28A0092B-C50C-407E-A947-70E740481C1C}">
                           <a14:useLocalDpi xmlns:a14="http://schemas.microsoft.com/office/drawing/2010/main" val="0"/>
@@ -1117,7 +3716,7 @@
                     <pic:cNvPicPr/>
                   </pic:nvPicPr>
                   <pic:blipFill>
-                    <a:blip r:embed="rId15">
+                    <a:blip r:embed="rId21">
                       <a:extLst>
                         <a:ext uri="{28A0092B-C50C-407E-A947-70E740481C1C}">
                           <a14:useLocalDpi xmlns:a14="http://schemas.microsoft.com/office/drawing/2010/main" val="0"/>
@@ -1189,7 +3788,7 @@
                     <pic:cNvPicPr/>
                   </pic:nvPicPr>
                   <pic:blipFill>
-                    <a:blip r:embed="rId15">
+                    <a:blip r:embed="rId21">
                       <a:extLst>
                         <a:ext uri="{28A0092B-C50C-407E-A947-70E740481C1C}">
                           <a14:useLocalDpi xmlns:a14="http://schemas.microsoft.com/office/drawing/2010/main" val="0"/>
@@ -1261,7 +3860,7 @@
                     <pic:cNvPicPr/>
                   </pic:nvPicPr>
                   <pic:blipFill>
-                    <a:blip r:embed="rId16">
+                    <a:blip r:embed="rId22">
                       <a:extLst>
                         <a:ext uri="{28A0092B-C50C-407E-A947-70E740481C1C}">
                           <a14:useLocalDpi xmlns:a14="http://schemas.microsoft.com/office/drawing/2010/main" val="0"/>
@@ -1333,7 +3932,7 @@
                     <pic:cNvPicPr/>
                   </pic:nvPicPr>
                   <pic:blipFill>
-                    <a:blip r:embed="rId17">
+                    <a:blip r:embed="rId23">
                       <a:extLst>
                         <a:ext uri="{28A0092B-C50C-407E-A947-70E740481C1C}">
                           <a14:useLocalDpi xmlns:a14="http://schemas.microsoft.com/office/drawing/2010/main" val="0"/>
@@ -1411,7 +4010,7 @@
                     <pic:cNvPicPr/>
                   </pic:nvPicPr>
                   <pic:blipFill>
-                    <a:blip r:embed="rId18">
+                    <a:blip r:embed="rId24">
                       <a:extLst>
                         <a:ext uri="{28A0092B-C50C-407E-A947-70E740481C1C}">
                           <a14:useLocalDpi xmlns:a14="http://schemas.microsoft.com/office/drawing/2010/main" val="0"/>
@@ -1489,7 +4088,7 @@
                     <pic:cNvPicPr/>
                   </pic:nvPicPr>
                   <pic:blipFill>
-                    <a:blip r:embed="rId19">
+                    <a:blip r:embed="rId25">
                       <a:extLst>
                         <a:ext uri="{28A0092B-C50C-407E-A947-70E740481C1C}">
                           <a14:useLocalDpi xmlns:a14="http://schemas.microsoft.com/office/drawing/2010/main" val="0"/>
@@ -1561,7 +4160,7 @@
                     <pic:cNvPicPr/>
                   </pic:nvPicPr>
                   <pic:blipFill>
-                    <a:blip r:embed="rId20">
+                    <a:blip r:embed="rId26">
                       <a:extLst>
                         <a:ext uri="{28A0092B-C50C-407E-A947-70E740481C1C}">
                           <a14:useLocalDpi xmlns:a14="http://schemas.microsoft.com/office/drawing/2010/main" val="0"/>
@@ -1644,7 +4243,7 @@
                     <pic:cNvPicPr/>
                   </pic:nvPicPr>
                   <pic:blipFill>
-                    <a:blip r:embed="rId21">
+                    <a:blip r:embed="rId27">
                       <a:extLst>
                         <a:ext uri="{28A0092B-C50C-407E-A947-70E740481C1C}">
                           <a14:useLocalDpi xmlns:a14="http://schemas.microsoft.com/office/drawing/2010/main" val="0"/>
@@ -1723,7 +4322,7 @@
                     <pic:cNvPicPr/>
                   </pic:nvPicPr>
                   <pic:blipFill>
-                    <a:blip r:embed="rId22">
+                    <a:blip r:embed="rId28">
                       <a:extLst>
                         <a:ext uri="{28A0092B-C50C-407E-A947-70E740481C1C}">
                           <a14:useLocalDpi xmlns:a14="http://schemas.microsoft.com/office/drawing/2010/main" val="0"/>
@@ -1886,6 +4485,119 @@
 <file path=word/numbering.xml><?xml version="1.0" encoding="utf-8"?>
 <w:numbering xmlns:wpc="http://schemas.microsoft.com/office/word/2010/wordprocessingCanvas" xmlns:cx="http://schemas.microsoft.com/office/drawing/2014/chartex" xmlns:cx1="http://schemas.microsoft.com/office/drawing/2015/9/8/chartex" xmlns:cx2="http://schemas.microsoft.com/office/drawing/2015/10/21/chartex" xmlns:cx3="http://schemas.microsoft.com/office/drawing/2016/5/9/chartex" xmlns:cx4="http://schemas.microsoft.com/office/drawing/2016/5/10/chartex" xmlns:cx5="http://schemas.microsoft.com/office/drawing/2016/5/11/chartex" xmlns:cx6="http://schemas.microsoft.com/office/drawing/2016/5/12/chartex" xmlns:cx7="http://schemas.microsoft.com/office/drawing/2016/5/13/chartex" xmlns:cx8="http://schemas.microsoft.com/office/drawing/2016/5/14/chartex" xmlns:mc="http://schemas.openxmlformats.org/markup-compatibility/2006" xmlns:aink="http://schemas.microsoft.com/office/drawing/2016/ink" xmlns:am3d="http://schemas.microsoft.com/office/drawing/2017/model3d" xmlns:o="urn:schemas-microsoft-com:office:office" xmlns:oel="http://schemas.microsoft.com/office/2019/extlst" xmlns:r="http://schemas.openxmlformats.org/officeDocument/2006/relationships" xmlns:m="http://schemas.openxmlformats.org/officeDocument/2006/math" xmlns:v="urn:schemas-microsoft-com:vml" xmlns:wp14="http://schemas.microsoft.com/office/word/2010/wordprocessingDrawing" xmlns:wp="http://schemas.openxmlformats.org/drawingml/2006/wordprocessingDrawing" xmlns:w10="urn:schemas-microsoft-com:office:word" xmlns:w="http://schemas.openxmlformats.org/wordprocessingml/2006/main" xmlns:w14="http://schemas.microsoft.com/office/word/2010/wordml" xmlns:w15="http://schemas.microsoft.com/office/word/2012/wordml" xmlns:w16cex="http://schemas.microsoft.com/office/word/2018/wordml/cex" xmlns:w16cid="http://schemas.microsoft.com/office/word/2016/wordml/cid" xmlns:w16="http://schemas.microsoft.com/office/word/2018/wordml" xmlns:w16du="http://schemas.microsoft.com/office/word/2023/wordml/word16du" xmlns:w16sdtdh="http://schemas.microsoft.com/office/word/2020/wordml/sdtdatahash" xmlns:w16sdtfl="http://schemas.microsoft.com/office/word/2024/wordml/sdtformatlock" xmlns:w16se="http://schemas.microsoft.com/office/word/2015/wordml/symex" xmlns:wpg="http://schemas.microsoft.com/office/word/2010/wordprocessingGroup" xmlns:wpi="http://schemas.microsoft.com/office/word/2010/wordprocessingInk" xmlns:wne="http://schemas.microsoft.com/office/word/2006/wordml" xmlns:wps="http://schemas.microsoft.com/office/word/2010/wordprocessingShape" mc:Ignorable="w14 w15 w16se w16cid w16 w16cex w16sdtdh w16sdtfl w16du wp14">
   <w:abstractNum w:abstractNumId="0" w15:restartNumberingAfterBreak="0">
+    <w:nsid w:val="07615288"/>
+    <w:multiLevelType w:val="multilevel"/>
+    <w:tmpl w:val="E4A08768"/>
+    <w:lvl w:ilvl="0">
+      <w:start w:val="1"/>
+      <w:numFmt w:val="decimal"/>
+      <w:lvlText w:val="%1"/>
+      <w:lvlJc w:val="left"/>
+      <w:pPr>
+        <w:ind w:left="360" w:hanging="360"/>
+      </w:pPr>
+      <w:rPr>
+        <w:rFonts w:hint="default"/>
+      </w:rPr>
+    </w:lvl>
+    <w:lvl w:ilvl="1">
+      <w:start w:val="1"/>
+      <w:numFmt w:val="decimal"/>
+      <w:lvlText w:val="%1.%2"/>
+      <w:lvlJc w:val="left"/>
+      <w:pPr>
+        <w:ind w:left="1068" w:hanging="360"/>
+      </w:pPr>
+      <w:rPr>
+        <w:rFonts w:hint="default"/>
+      </w:rPr>
+    </w:lvl>
+    <w:lvl w:ilvl="2">
+      <w:start w:val="1"/>
+      <w:numFmt w:val="decimal"/>
+      <w:lvlText w:val="%1.%2.%3"/>
+      <w:lvlJc w:val="left"/>
+      <w:pPr>
+        <w:ind w:left="2136" w:hanging="720"/>
+      </w:pPr>
+      <w:rPr>
+        <w:rFonts w:hint="default"/>
+      </w:rPr>
+    </w:lvl>
+    <w:lvl w:ilvl="3">
+      <w:start w:val="1"/>
+      <w:numFmt w:val="decimal"/>
+      <w:lvlText w:val="%1.%2.%3.%4"/>
+      <w:lvlJc w:val="left"/>
+      <w:pPr>
+        <w:ind w:left="2844" w:hanging="720"/>
+      </w:pPr>
+      <w:rPr>
+        <w:rFonts w:hint="default"/>
+      </w:rPr>
+    </w:lvl>
+    <w:lvl w:ilvl="4">
+      <w:start w:val="1"/>
+      <w:numFmt w:val="decimal"/>
+      <w:lvlText w:val="%1.%2.%3.%4.%5"/>
+      <w:lvlJc w:val="left"/>
+      <w:pPr>
+        <w:ind w:left="3912" w:hanging="1080"/>
+      </w:pPr>
+      <w:rPr>
+        <w:rFonts w:hint="default"/>
+      </w:rPr>
+    </w:lvl>
+    <w:lvl w:ilvl="5">
+      <w:start w:val="1"/>
+      <w:numFmt w:val="decimal"/>
+      <w:lvlText w:val="%1.%2.%3.%4.%5.%6"/>
+      <w:lvlJc w:val="left"/>
+      <w:pPr>
+        <w:ind w:left="4620" w:hanging="1080"/>
+      </w:pPr>
+      <w:rPr>
+        <w:rFonts w:hint="default"/>
+      </w:rPr>
+    </w:lvl>
+    <w:lvl w:ilvl="6">
+      <w:start w:val="1"/>
+      <w:numFmt w:val="decimal"/>
+      <w:lvlText w:val="%1.%2.%3.%4.%5.%6.%7"/>
+      <w:lvlJc w:val="left"/>
+      <w:pPr>
+        <w:ind w:left="5688" w:hanging="1440"/>
+      </w:pPr>
+      <w:rPr>
+        <w:rFonts w:hint="default"/>
+      </w:rPr>
+    </w:lvl>
+    <w:lvl w:ilvl="7">
+      <w:start w:val="1"/>
+      <w:numFmt w:val="decimal"/>
+      <w:lvlText w:val="%1.%2.%3.%4.%5.%6.%7.%8"/>
+      <w:lvlJc w:val="left"/>
+      <w:pPr>
+        <w:ind w:left="6396" w:hanging="1440"/>
+      </w:pPr>
+      <w:rPr>
+        <w:rFonts w:hint="default"/>
+      </w:rPr>
+    </w:lvl>
+    <w:lvl w:ilvl="8">
+      <w:start w:val="1"/>
+      <w:numFmt w:val="decimal"/>
+      <w:lvlText w:val="%1.%2.%3.%4.%5.%6.%7.%8.%9"/>
+      <w:lvlJc w:val="left"/>
+      <w:pPr>
+        <w:ind w:left="7464" w:hanging="1800"/>
+      </w:pPr>
+      <w:rPr>
+        <w:rFonts w:hint="default"/>
+      </w:rPr>
+    </w:lvl>
+  </w:abstractNum>
+  <w:abstractNum w:abstractNumId="1" w15:restartNumberingAfterBreak="0">
     <w:nsid w:val="0F24020D"/>
     <w:multiLevelType w:val="multilevel"/>
     <w:tmpl w:val="2C320700"/>
@@ -2008,7 +4720,7 @@
       </w:rPr>
     </w:lvl>
   </w:abstractNum>
-  <w:abstractNum w:abstractNumId="1" w15:restartNumberingAfterBreak="0">
+  <w:abstractNum w:abstractNumId="2" w15:restartNumberingAfterBreak="0">
     <w:nsid w:val="37434A68"/>
     <w:multiLevelType w:val="multilevel"/>
     <w:tmpl w:val="539C15E4"/>
@@ -2121,7 +4833,7 @@
       </w:rPr>
     </w:lvl>
   </w:abstractNum>
-  <w:abstractNum w:abstractNumId="2" w15:restartNumberingAfterBreak="0">
+  <w:abstractNum w:abstractNumId="3" w15:restartNumberingAfterBreak="0">
     <w:nsid w:val="38753164"/>
     <w:multiLevelType w:val="multilevel"/>
     <w:tmpl w:val="7D243F5E"/>
@@ -2244,7 +4956,7 @@
       </w:rPr>
     </w:lvl>
   </w:abstractNum>
-  <w:abstractNum w:abstractNumId="3" w15:restartNumberingAfterBreak="0">
+  <w:abstractNum w:abstractNumId="4" w15:restartNumberingAfterBreak="0">
     <w:nsid w:val="49895793"/>
     <w:multiLevelType w:val="multilevel"/>
     <w:tmpl w:val="A720F002"/>
@@ -2368,16 +5080,19 @@
     </w:lvl>
   </w:abstractNum>
   <w:num w:numId="1" w16cid:durableId="1547372404">
+    <w:abstractNumId w:val="3"/>
+  </w:num>
+  <w:num w:numId="2" w16cid:durableId="1174149221">
+    <w:abstractNumId w:val="1"/>
+  </w:num>
+  <w:num w:numId="3" w16cid:durableId="161313484">
+    <w:abstractNumId w:val="4"/>
+  </w:num>
+  <w:num w:numId="4" w16cid:durableId="371535712">
     <w:abstractNumId w:val="2"/>
   </w:num>
-  <w:num w:numId="2" w16cid:durableId="1174149221">
+  <w:num w:numId="5" w16cid:durableId="1008644">
     <w:abstractNumId w:val="0"/>
-  </w:num>
-  <w:num w:numId="3" w16cid:durableId="161313484">
-    <w:abstractNumId w:val="3"/>
-  </w:num>
-  <w:num w:numId="4" w16cid:durableId="371535712">
-    <w:abstractNumId w:val="1"/>
   </w:num>
 </w:numbering>
 </file>
@@ -2899,7 +5614,6 @@
   <w:style w:type="character" w:default="1" w:styleId="a0">
     <w:name w:val="Default Paragraph Font"/>
     <w:uiPriority w:val="1"/>
-    <w:semiHidden/>
     <w:unhideWhenUsed/>
   </w:style>
   <w:style w:type="table" w:default="1" w:styleId="a1">
@@ -3194,6 +5908,18 @@
       <w:ind w:left="720"/>
       <w:contextualSpacing/>
     </w:pPr>
+  </w:style>
+  <w:style w:type="character" w:styleId="af3">
+    <w:name w:val="Unresolved Mention"/>
+    <w:basedOn w:val="a0"/>
+    <w:uiPriority w:val="99"/>
+    <w:semiHidden/>
+    <w:unhideWhenUsed/>
+    <w:rsid w:val="00AA04F0"/>
+    <w:rPr>
+      <w:color w:val="605E5C"/>
+      <w:shd w:val="clear" w:color="auto" w:fill="E1DFDD"/>
+    </w:rPr>
   </w:style>
 </w:styles>
 </file>

</xml_diff>

<commit_message>
Adding comparison table in 1.2
</commit_message>
<xml_diff>
--- a/УИРС_8В31_Болбин_Константинов_Осипов.docx
+++ b/УИРС_8В31_Болбин_Константинов_Осипов.docx
@@ -474,46 +474,113 @@
         <w:rPr>
           <w:lang w:val="ru-RU"/>
         </w:rPr>
+        <w:t xml:space="preserve"> Сначала приложение </w:t>
+      </w:r>
+      <w:proofErr w:type="spellStart"/>
+      <w:r>
+        <w:rPr>
+          <w:lang w:val="ru-RU"/>
+        </w:rPr>
+        <w:t>WhatsApp</w:t>
+      </w:r>
+      <w:proofErr w:type="spellEnd"/>
+      <w:r>
+        <w:rPr>
+          <w:lang w:val="ru-RU"/>
+        </w:rPr>
+        <w:t xml:space="preserve"> задумывалось как альтернатива SMS. Сегодня сервис поддерживает отправку и получение данных в самых разных форматах: сообщения, фото, видео, документы, геопозиция и аудиозвонки.</w:t>
+      </w:r>
+    </w:p>
+    <w:p>
+      <w:pPr>
+        <w:rPr>
+          <w:lang w:val="ru-RU"/>
+        </w:rPr>
+      </w:pPr>
+      <w:r>
+        <w:rPr>
+          <w:lang w:val="ru-RU"/>
+        </w:rPr>
+        <w:t>М</w:t>
+      </w:r>
+      <w:r>
+        <w:rPr>
+          <w:lang w:val="ru-RU"/>
+        </w:rPr>
+        <w:t>ессенджер</w:t>
+      </w:r>
+      <w:r>
+        <w:rPr>
+          <w:lang w:val="ru-RU"/>
+        </w:rPr>
         <w:t xml:space="preserve"> </w:t>
       </w:r>
       <w:r>
         <w:rPr>
           <w:lang w:val="ru-RU"/>
         </w:rPr>
-        <w:t xml:space="preserve">Сначала приложение </w:t>
-      </w:r>
-      <w:proofErr w:type="spellStart"/>
-      <w:r>
-        <w:rPr>
-          <w:lang w:val="ru-RU"/>
-        </w:rPr>
-        <w:t>WhatsApp</w:t>
-      </w:r>
-      <w:proofErr w:type="spellEnd"/>
-      <w:r>
-        <w:rPr>
-          <w:lang w:val="ru-RU"/>
-        </w:rPr>
-        <w:t xml:space="preserve"> задумывалось как альтернатива SMS. Сегодня сервис поддерживает отправку и получение данных в самых разных форматах: сообщения, фото, видео, документы, геопозиция и аудиозвонки.</w:t>
-      </w:r>
-    </w:p>
-    <w:p>
-      <w:pPr>
+        <w:t>является кроссплатформенным</w:t>
+      </w:r>
+      <w:r>
+        <w:rPr>
+          <w:lang w:val="ru-RU"/>
+        </w:rPr>
+        <w:t xml:space="preserve"> с E2E-шифрованием по умолчанию, </w:t>
+      </w:r>
+      <w:r>
+        <w:rPr>
+          <w:lang w:val="ru-RU"/>
+        </w:rPr>
+        <w:t xml:space="preserve">является самым популярным мессенджеров </w:t>
+      </w:r>
+      <w:r>
+        <w:rPr>
+          <w:lang w:val="ru-RU"/>
+        </w:rPr>
+        <w:t>для личного и делового общения</w:t>
+      </w:r>
+      <w:r>
+        <w:rPr>
+          <w:lang w:val="ru-RU"/>
+        </w:rPr>
+        <w:t xml:space="preserve"> во всем мире</w:t>
+      </w:r>
+      <w:r>
+        <w:rPr>
+          <w:lang w:val="ru-RU"/>
+        </w:rPr>
+        <w:t>. В России заблокирован, работает только через VPN.</w:t>
+      </w:r>
+    </w:p>
+    <w:p>
+      <w:pPr>
+        <w:rPr>
+          <w:lang w:val="ru-RU"/>
+        </w:rPr>
+      </w:pPr>
+      <w:r>
+        <w:rPr>
+          <w:lang w:val="ru-RU"/>
+        </w:rPr>
+        <w:t xml:space="preserve">1.1.2 </w:t>
+      </w:r>
+      <w:r>
         <w:rPr>
           <w:lang w:val="en-US"/>
         </w:rPr>
-      </w:pPr>
-      <w:r>
-        <w:rPr>
-          <w:lang w:val="ru-RU"/>
-        </w:rPr>
-        <w:t>М</w:t>
-      </w:r>
-      <w:r>
-        <w:rPr>
-          <w:lang w:val="ru-RU"/>
-        </w:rPr>
-        <w:t>ессенджер</w:t>
+        <w:t>Telegram</w:t>
+      </w:r>
+      <w:r>
+        <w:rPr>
+          <w:lang w:val="ru-RU"/>
+        </w:rPr>
+        <w:t xml:space="preserve"> –</w:t>
+      </w:r>
+      <w:r>
+        <w:rPr>
+          <w:lang w:val="ru-RU"/>
+        </w:rPr>
+        <w:t xml:space="preserve"> это мессенджер, ориентированный на скорость и безопасность: он очень быстрый, простой и бесплатный</w:t>
       </w:r>
       <w:r>
         <w:rPr>
@@ -525,86 +592,7 @@
         <w:rPr>
           <w:lang w:val="ru-RU"/>
         </w:rPr>
-        <w:t>является кроссплатформенным</w:t>
-      </w:r>
-      <w:r>
-        <w:rPr>
-          <w:lang w:val="ru-RU"/>
-        </w:rPr>
-        <w:t xml:space="preserve"> с E2E-шифрованием по умолчанию, </w:t>
-      </w:r>
-      <w:r>
-        <w:rPr>
-          <w:lang w:val="ru-RU"/>
-        </w:rPr>
-        <w:t xml:space="preserve">является самым популярным мессенджеров </w:t>
-      </w:r>
-      <w:r>
-        <w:rPr>
-          <w:lang w:val="ru-RU"/>
-        </w:rPr>
-        <w:t>для личного и делового общения</w:t>
-      </w:r>
-      <w:r>
-        <w:rPr>
-          <w:lang w:val="ru-RU"/>
-        </w:rPr>
-        <w:t xml:space="preserve"> во всем мире</w:t>
-      </w:r>
-      <w:r>
-        <w:rPr>
-          <w:lang w:val="ru-RU"/>
-        </w:rPr>
-        <w:t>. В России заблокирован, работает только через VPN.</w:t>
-      </w:r>
-    </w:p>
-    <w:p>
-      <w:pPr>
-        <w:rPr>
-          <w:lang w:val="ru-RU"/>
-        </w:rPr>
-      </w:pPr>
-      <w:r>
-        <w:rPr>
-          <w:lang w:val="ru-RU"/>
-        </w:rPr>
-        <w:t xml:space="preserve">1.1.2 </w:t>
-      </w:r>
-      <w:r>
-        <w:rPr>
-          <w:lang w:val="en-US"/>
-        </w:rPr>
-        <w:t>Telegram</w:t>
-      </w:r>
-      <w:r>
-        <w:rPr>
-          <w:lang w:val="ru-RU"/>
-        </w:rPr>
-        <w:t xml:space="preserve"> –</w:t>
-      </w:r>
-      <w:r>
-        <w:rPr>
-          <w:lang w:val="ru-RU"/>
-        </w:rPr>
-        <w:t xml:space="preserve"> это мессенджер, ориентированный на скорость и безопасность: он очень быстрый, простой и бесплатный</w:t>
-      </w:r>
-      <w:r>
-        <w:rPr>
-          <w:lang w:val="ru-RU"/>
-        </w:rPr>
-        <w:t xml:space="preserve"> </w:t>
-      </w:r>
-      <w:r>
-        <w:rPr>
-          <w:lang w:val="ru-RU"/>
-        </w:rPr>
-        <w:t>[2]</w:t>
-      </w:r>
-      <w:r>
-        <w:rPr>
-          <w:lang w:val="ru-RU"/>
-        </w:rPr>
-        <w:t xml:space="preserve">. </w:t>
+        <w:t xml:space="preserve">[2]. </w:t>
       </w:r>
       <w:r>
         <w:rPr>
@@ -1194,15 +1182,154 @@
     <w:p>
       <w:pPr>
         <w:rPr>
+          <w:lang w:val="ru-RU"/>
+        </w:rPr>
+      </w:pPr>
+      <w:r>
+        <w:rPr>
+          <w:lang w:val="ru-RU"/>
+        </w:rPr>
+        <w:t xml:space="preserve">1.1.5 </w:t>
+      </w:r>
+      <w:r>
+        <w:rPr>
           <w:lang w:val="en-US"/>
         </w:rPr>
-      </w:pPr>
-      <w:r>
-        <w:rPr>
-          <w:lang w:val="ru-RU"/>
-        </w:rPr>
-        <w:t xml:space="preserve">1.1.5 </w:t>
-      </w:r>
+        <w:t>Signal</w:t>
+      </w:r>
+      <w:r>
+        <w:rPr>
+          <w:lang w:val="ru-RU"/>
+        </w:rPr>
+        <w:t xml:space="preserve"> –</w:t>
+      </w:r>
+      <w:r>
+        <w:rPr>
+          <w:lang w:val="ru-RU"/>
+        </w:rPr>
+        <w:t xml:space="preserve"> </w:t>
+      </w:r>
+      <w:r>
+        <w:rPr>
+          <w:lang w:val="ru-RU"/>
+        </w:rPr>
+        <w:t xml:space="preserve">это простой, мощный и безопасный </w:t>
+      </w:r>
+      <w:r>
+        <w:rPr>
+          <w:lang w:val="ru-RU"/>
+        </w:rPr>
+        <w:t xml:space="preserve">кроссплатформенный </w:t>
+      </w:r>
+      <w:r>
+        <w:rPr>
+          <w:lang w:val="ru-RU"/>
+        </w:rPr>
+        <w:t>мессенджер, который использует интернет-соединение вашего телефона для защищённого общения</w:t>
+      </w:r>
+      <w:r>
+        <w:rPr>
+          <w:lang w:val="ru-RU"/>
+        </w:rPr>
+        <w:t xml:space="preserve"> </w:t>
+      </w:r>
+      <w:r>
+        <w:rPr>
+          <w:lang w:val="ru-RU"/>
+        </w:rPr>
+        <w:t>[5].</w:t>
+      </w:r>
+      <w:r>
+        <w:rPr>
+          <w:lang w:val="ru-RU"/>
+        </w:rPr>
+        <w:t xml:space="preserve"> Есть возможность</w:t>
+      </w:r>
+      <w:r>
+        <w:rPr>
+          <w:lang w:val="ru-RU"/>
+        </w:rPr>
+        <w:t xml:space="preserve"> </w:t>
+      </w:r>
+      <w:r>
+        <w:rPr>
+          <w:lang w:val="ru-RU"/>
+        </w:rPr>
+        <w:t>о</w:t>
+      </w:r>
+      <w:r>
+        <w:rPr>
+          <w:lang w:val="ru-RU"/>
+        </w:rPr>
+        <w:t>тправ</w:t>
+      </w:r>
+      <w:r>
+        <w:rPr>
+          <w:lang w:val="ru-RU"/>
+        </w:rPr>
+        <w:t>ки</w:t>
+      </w:r>
+      <w:r>
+        <w:rPr>
+          <w:lang w:val="ru-RU"/>
+        </w:rPr>
+        <w:t xml:space="preserve"> и получ</w:t>
+      </w:r>
+      <w:r>
+        <w:rPr>
+          <w:lang w:val="ru-RU"/>
+        </w:rPr>
+        <w:t>ения</w:t>
+      </w:r>
+      <w:r>
+        <w:rPr>
+          <w:lang w:val="ru-RU"/>
+        </w:rPr>
+        <w:t xml:space="preserve"> сообщения в высоком качестве, участв</w:t>
+      </w:r>
+      <w:r>
+        <w:rPr>
+          <w:lang w:val="ru-RU"/>
+        </w:rPr>
+        <w:t>овать</w:t>
+      </w:r>
+      <w:r>
+        <w:rPr>
+          <w:lang w:val="ru-RU"/>
+        </w:rPr>
+        <w:t xml:space="preserve"> в голосовых и видеозвонках HD</w:t>
+      </w:r>
+      <w:r>
+        <w:rPr>
+          <w:lang w:val="ru-RU"/>
+        </w:rPr>
+        <w:t xml:space="preserve">. Сервис </w:t>
+      </w:r>
+      <w:r>
+        <w:rPr>
+          <w:lang w:val="ru-RU"/>
+        </w:rPr>
+        <w:t>постоянно расширя</w:t>
+      </w:r>
+      <w:r>
+        <w:rPr>
+          <w:lang w:val="ru-RU"/>
+        </w:rPr>
+        <w:t>ет</w:t>
+      </w:r>
+      <w:r>
+        <w:rPr>
+          <w:lang w:val="ru-RU"/>
+        </w:rPr>
+        <w:t xml:space="preserve"> набор новых функций, которые помогают оставаться на связи.</w:t>
+      </w:r>
+    </w:p>
+    <w:p>
+      <w:pPr>
+        <w:rPr>
+          <w:lang w:val="ru-RU"/>
+        </w:rPr>
+      </w:pPr>
       <w:r>
         <w:rPr>
           <w:lang w:val="en-US"/>
@@ -1213,32 +1340,188 @@
         <w:rPr>
           <w:lang w:val="ru-RU"/>
         </w:rPr>
-        <w:t xml:space="preserve"> –</w:t>
-      </w:r>
-      <w:r>
-        <w:rPr>
-          <w:lang w:val="ru-RU"/>
-        </w:rPr>
         <w:t xml:space="preserve"> </w:t>
       </w:r>
       <w:r>
         <w:rPr>
           <w:lang w:val="ru-RU"/>
         </w:rPr>
-        <w:t xml:space="preserve">это простой, мощный и безопасный </w:t>
-      </w:r>
-      <w:r>
-        <w:rPr>
-          <w:lang w:val="ru-RU"/>
-        </w:rPr>
-        <w:t xml:space="preserve">кроссплатформенный </w:t>
-      </w:r>
-      <w:r>
-        <w:rPr>
-          <w:lang w:val="ru-RU"/>
-        </w:rPr>
-        <w:t>мессенджер, который использует интернет-соединение вашего телефона для защищённого общения</w:t>
-      </w:r>
+        <w:t>–</w:t>
+      </w:r>
+      <w:r>
+        <w:rPr>
+          <w:lang w:val="ru-RU"/>
+        </w:rPr>
+        <w:t xml:space="preserve"> независимая некоммерческая организация. </w:t>
+      </w:r>
+      <w:r>
+        <w:rPr>
+          <w:lang w:val="ru-RU"/>
+        </w:rPr>
+        <w:t>Она не</w:t>
+      </w:r>
+      <w:r>
+        <w:rPr>
+          <w:lang w:val="ru-RU"/>
+        </w:rPr>
+        <w:t xml:space="preserve"> связан</w:t>
+      </w:r>
+      <w:r>
+        <w:rPr>
+          <w:lang w:val="ru-RU"/>
+        </w:rPr>
+        <w:t>а</w:t>
+      </w:r>
+      <w:r>
+        <w:rPr>
+          <w:lang w:val="ru-RU"/>
+        </w:rPr>
+        <w:t xml:space="preserve"> ни с одной крупной технологической компанией и не може</w:t>
+      </w:r>
+      <w:r>
+        <w:rPr>
+          <w:lang w:val="ru-RU"/>
+        </w:rPr>
+        <w:t>т</w:t>
+      </w:r>
+      <w:r>
+        <w:rPr>
+          <w:lang w:val="ru-RU"/>
+        </w:rPr>
+        <w:t xml:space="preserve"> быть приобретен</w:t>
+      </w:r>
+      <w:r>
+        <w:rPr>
+          <w:lang w:val="ru-RU"/>
+        </w:rPr>
+        <w:t>а</w:t>
+      </w:r>
+      <w:r>
+        <w:rPr>
+          <w:lang w:val="ru-RU"/>
+        </w:rPr>
+        <w:t xml:space="preserve"> кем-либо из них. Развитие сервиса поддерживается за счёт грантов и пожертвовани</w:t>
+      </w:r>
+      <w:r>
+        <w:rPr>
+          <w:lang w:val="ru-RU"/>
+        </w:rPr>
+        <w:t>й пользователей</w:t>
+      </w:r>
+      <w:r>
+        <w:rPr>
+          <w:lang w:val="ru-RU"/>
+        </w:rPr>
+        <w:t>.</w:t>
+      </w:r>
+    </w:p>
+    <w:p>
+      <w:pPr>
+        <w:rPr>
+          <w:lang w:val="ru-RU"/>
+        </w:rPr>
+      </w:pPr>
+      <w:r>
+        <w:rPr>
+          <w:lang w:val="ru-RU"/>
+        </w:rPr>
+        <w:t xml:space="preserve">Передовые технологии </w:t>
+      </w:r>
+      <w:r>
+        <w:rPr>
+          <w:lang w:val="ru-RU"/>
+        </w:rPr>
+        <w:t>E2E-шифровани</w:t>
+      </w:r>
+      <w:r>
+        <w:rPr>
+          <w:lang w:val="ru-RU"/>
+        </w:rPr>
+        <w:t xml:space="preserve">я </w:t>
+      </w:r>
+      <w:proofErr w:type="spellStart"/>
+      <w:r>
+        <w:rPr>
+          <w:lang w:val="ru-RU"/>
+        </w:rPr>
+        <w:t>Signal</w:t>
+      </w:r>
+      <w:proofErr w:type="spellEnd"/>
+      <w:r>
+        <w:rPr>
+          <w:lang w:val="ru-RU"/>
+        </w:rPr>
+        <w:t xml:space="preserve"> по сохранению конфиденциальности всегда включены</w:t>
+      </w:r>
+      <w:r>
+        <w:rPr>
+          <w:lang w:val="ru-RU"/>
+        </w:rPr>
+        <w:t>. Н</w:t>
+      </w:r>
+      <w:r>
+        <w:rPr>
+          <w:lang w:val="ru-RU"/>
+        </w:rPr>
+        <w:t>ет рекламы, партнёрских маркетологов и навязчивого отслеживания</w:t>
+      </w:r>
+      <w:r>
+        <w:rPr>
+          <w:lang w:val="ru-RU"/>
+        </w:rPr>
+        <w:t xml:space="preserve">. В России заблокирован, работает только через VPN. </w:t>
+      </w:r>
+      <w:r>
+        <w:rPr>
+          <w:lang w:val="ru-RU"/>
+        </w:rPr>
+        <w:t>М</w:t>
+      </w:r>
+      <w:r>
+        <w:rPr>
+          <w:lang w:val="ru-RU"/>
+        </w:rPr>
+        <w:t>ессенджер с открытым исходным кодо</w:t>
+      </w:r>
+      <w:r>
+        <w:rPr>
+          <w:lang w:val="ru-RU"/>
+        </w:rPr>
+        <w:t>м, н</w:t>
+      </w:r>
+      <w:r>
+        <w:rPr>
+          <w:lang w:val="ru-RU"/>
+        </w:rPr>
+        <w:t>е поддерживает каналы и ботов, но обеспечивает высокий уровень безопасности</w:t>
+      </w:r>
+      <w:r>
+        <w:rPr>
+          <w:lang w:val="ru-RU"/>
+        </w:rPr>
+        <w:t>.</w:t>
+      </w:r>
+    </w:p>
+    <w:p>
+      <w:pPr>
+        <w:rPr>
+          <w:lang w:val="ru-RU"/>
+        </w:rPr>
+      </w:pPr>
+      <w:r>
+        <w:rPr>
+          <w:lang w:val="ru-RU"/>
+        </w:rPr>
+        <w:t xml:space="preserve">1.1.6 </w:t>
+      </w:r>
+      <w:proofErr w:type="spellStart"/>
+      <w:r>
+        <w:rPr>
+          <w:lang w:val="en-US"/>
+        </w:rPr>
+        <w:t>YouGile</w:t>
+      </w:r>
+      <w:proofErr w:type="spellEnd"/>
       <w:r>
         <w:rPr>
           <w:lang w:val="ru-RU"/>
@@ -1249,7 +1532,161 @@
         <w:rPr>
           <w:lang w:val="ru-RU"/>
         </w:rPr>
-        <w:t>[5]</w:t>
+        <w:t>–</w:t>
+      </w:r>
+      <w:r>
+        <w:rPr>
+          <w:lang w:val="ru-RU"/>
+        </w:rPr>
+        <w:t xml:space="preserve"> </w:t>
+      </w:r>
+      <w:r>
+        <w:rPr>
+          <w:lang w:val="ru-RU"/>
+        </w:rPr>
+        <w:t xml:space="preserve">российский сервис для командной работы, объединяющий </w:t>
+      </w:r>
+      <w:r>
+        <w:rPr>
+          <w:lang w:val="ru-RU"/>
+        </w:rPr>
+        <w:br/>
+      </w:r>
+      <w:r>
+        <w:rPr>
+          <w:lang w:val="ru-RU"/>
+        </w:rPr>
+        <w:t>канбан-доски и встроенный мессенджер</w:t>
+      </w:r>
+      <w:r>
+        <w:rPr>
+          <w:lang w:val="ru-RU"/>
+        </w:rPr>
+        <w:t xml:space="preserve"> </w:t>
+      </w:r>
+      <w:r>
+        <w:rPr>
+          <w:lang w:val="ru-RU"/>
+        </w:rPr>
+        <w:t>[</w:t>
+      </w:r>
+      <w:r>
+        <w:rPr>
+          <w:lang w:val="ru-RU"/>
+        </w:rPr>
+        <w:t>6</w:t>
+      </w:r>
+      <w:r>
+        <w:rPr>
+          <w:lang w:val="ru-RU"/>
+        </w:rPr>
+        <w:t>]</w:t>
+      </w:r>
+      <w:r>
+        <w:rPr>
+          <w:lang w:val="ru-RU"/>
+        </w:rPr>
+        <w:t xml:space="preserve">. Каждая задача </w:t>
+      </w:r>
+      <w:r>
+        <w:rPr>
+          <w:lang w:val="ru-RU"/>
+        </w:rPr>
+        <w:t>–</w:t>
+      </w:r>
+      <w:r>
+        <w:rPr>
+          <w:lang w:val="ru-RU"/>
+        </w:rPr>
+        <w:t xml:space="preserve"> отдельный чат, что удобно для проектного управления и обсуждения рабочих вопросов. Подходит для компаний, которым важно </w:t>
+      </w:r>
+      <w:proofErr w:type="spellStart"/>
+      <w:r>
+        <w:rPr>
+          <w:lang w:val="ru-RU"/>
+        </w:rPr>
+        <w:t>on</w:t>
+      </w:r>
+      <w:proofErr w:type="spellEnd"/>
+      <w:r>
+        <w:rPr>
+          <w:lang w:val="ru-RU"/>
+        </w:rPr>
+        <w:t>-</w:t>
+      </w:r>
+      <w:proofErr w:type="spellStart"/>
+      <w:r>
+        <w:rPr>
+          <w:lang w:val="ru-RU"/>
+        </w:rPr>
+        <w:t>premise</w:t>
+      </w:r>
+      <w:proofErr w:type="spellEnd"/>
+      <w:r>
+        <w:rPr>
+          <w:lang w:val="ru-RU"/>
+        </w:rPr>
+        <w:t xml:space="preserve">-развёртывание и интеграция задач с обсуждениями. </w:t>
+      </w:r>
+      <w:r>
+        <w:rPr>
+          <w:lang w:val="ru-RU"/>
+        </w:rPr>
+        <w:t xml:space="preserve">Поддерживает </w:t>
+      </w:r>
+      <w:r>
+        <w:rPr>
+          <w:lang w:val="ru-RU"/>
+        </w:rPr>
+        <w:t>обмен файлами</w:t>
+      </w:r>
+      <w:r>
+        <w:rPr>
+          <w:lang w:val="ru-RU"/>
+        </w:rPr>
+        <w:t xml:space="preserve"> любых форматов</w:t>
+      </w:r>
+      <w:r>
+        <w:rPr>
+          <w:lang w:val="ru-RU"/>
+        </w:rPr>
+        <w:t>, уведомления, опросы, реакции, голосовые сообщения</w:t>
+      </w:r>
+      <w:r>
+        <w:rPr>
+          <w:lang w:val="ru-RU"/>
+        </w:rPr>
+        <w:t xml:space="preserve"> с расшифровыванием в текст</w:t>
+      </w:r>
+      <w:r>
+        <w:rPr>
+          <w:lang w:val="ru-RU"/>
+        </w:rPr>
+        <w:t xml:space="preserve">, </w:t>
+      </w:r>
+      <w:r>
+        <w:rPr>
+          <w:lang w:val="ru-RU"/>
+        </w:rPr>
+        <w:t xml:space="preserve">видеосообщения с </w:t>
+      </w:r>
+      <w:r>
+        <w:rPr>
+          <w:lang w:val="ru-RU"/>
+        </w:rPr>
+        <w:t>демонстраци</w:t>
+      </w:r>
+      <w:r>
+        <w:rPr>
+          <w:lang w:val="ru-RU"/>
+        </w:rPr>
+        <w:t>ей</w:t>
+      </w:r>
+      <w:r>
+        <w:rPr>
+          <w:lang w:val="ru-RU"/>
+        </w:rPr>
+        <w:t xml:space="preserve"> экрана</w:t>
       </w:r>
       <w:r>
         <w:rPr>
@@ -1257,11 +1694,754 @@
         </w:rPr>
         <w:t>.</w:t>
       </w:r>
-      <w:r>
-        <w:rPr>
-          <w:lang w:val="ru-RU"/>
-        </w:rPr>
-        <w:t xml:space="preserve"> Есть возможность</w:t>
+    </w:p>
+    <w:p>
+      <w:pPr>
+        <w:pStyle w:val="3"/>
+        <w:rPr>
+          <w:lang w:val="en-US"/>
+        </w:rPr>
+      </w:pPr>
+      <w:r>
+        <w:rPr>
+          <w:lang w:val="ru-RU"/>
+        </w:rPr>
+        <w:t xml:space="preserve">1.2 </w:t>
+      </w:r>
+      <w:r>
+        <w:rPr>
+          <w:lang w:val="ru-RU"/>
+        </w:rPr>
+        <w:t>Сравнение аналогов</w:t>
+      </w:r>
+    </w:p>
+    <w:p>
+      <w:pPr>
+        <w:rPr>
+          <w:lang w:val="ru-RU"/>
+        </w:rPr>
+      </w:pPr>
+      <w:r>
+        <w:rPr>
+          <w:lang w:val="ru-RU"/>
+        </w:rPr>
+        <w:t>Чтобы сравнить аналоги и выявить их лучшие стороны были выявлены следующие критерии: т</w:t>
+      </w:r>
+      <w:r>
+        <w:rPr>
+          <w:lang w:val="ru-RU"/>
+        </w:rPr>
+        <w:t>ехнические характеристики</w:t>
+      </w:r>
+      <w:r>
+        <w:rPr>
+          <w:lang w:val="ru-RU"/>
+        </w:rPr>
+        <w:t>, б</w:t>
+      </w:r>
+      <w:r>
+        <w:rPr>
+          <w:lang w:val="ru-RU"/>
+        </w:rPr>
+        <w:t>езопасность и конфиденциальность</w:t>
+      </w:r>
+      <w:r>
+        <w:rPr>
+          <w:lang w:val="ru-RU"/>
+        </w:rPr>
+        <w:t>, ф</w:t>
+      </w:r>
+      <w:r>
+        <w:rPr>
+          <w:lang w:val="ru-RU"/>
+        </w:rPr>
+        <w:t>ункциональность</w:t>
+      </w:r>
+      <w:r>
+        <w:rPr>
+          <w:lang w:val="ru-RU"/>
+        </w:rPr>
+        <w:t>, п</w:t>
+      </w:r>
+      <w:r>
+        <w:rPr>
+          <w:lang w:val="ru-RU"/>
+        </w:rPr>
+        <w:t>ользовательский опыт (UX/UI)</w:t>
+      </w:r>
+      <w:r>
+        <w:rPr>
+          <w:lang w:val="ru-RU"/>
+        </w:rPr>
+        <w:t>, э</w:t>
+      </w:r>
+      <w:r>
+        <w:rPr>
+          <w:lang w:val="ru-RU"/>
+        </w:rPr>
+        <w:t>косистема и интеграции</w:t>
+      </w:r>
+      <w:r>
+        <w:rPr>
+          <w:lang w:val="ru-RU"/>
+        </w:rPr>
+        <w:t>, э</w:t>
+      </w:r>
+      <w:r>
+        <w:rPr>
+          <w:lang w:val="ru-RU"/>
+        </w:rPr>
+        <w:t>кономические и юридические аспекты</w:t>
+      </w:r>
+      <w:r>
+        <w:rPr>
+          <w:lang w:val="ru-RU"/>
+        </w:rPr>
+        <w:t>.</w:t>
+      </w:r>
+    </w:p>
+    <w:p>
+      <w:pPr>
+        <w:pStyle w:val="af2"/>
+        <w:numPr>
+          <w:ilvl w:val="0"/>
+          <w:numId w:val="6"/>
+        </w:numPr>
+        <w:rPr>
+          <w:lang w:val="ru-RU"/>
+        </w:rPr>
+      </w:pPr>
+      <w:r>
+        <w:rPr>
+          <w:lang w:val="ru-RU"/>
+        </w:rPr>
+        <w:t>Технические характеристики</w:t>
+      </w:r>
+      <w:r>
+        <w:rPr>
+          <w:lang w:val="ru-RU"/>
+        </w:rPr>
+        <w:t>:</w:t>
+      </w:r>
+    </w:p>
+    <w:p>
+      <w:pPr>
+        <w:rPr>
+          <w:lang w:val="ru-RU"/>
+        </w:rPr>
+      </w:pPr>
+      <w:r>
+        <w:rPr>
+          <w:lang w:val="ru-RU"/>
+        </w:rPr>
+        <w:t xml:space="preserve">- </w:t>
+      </w:r>
+      <w:r>
+        <w:rPr>
+          <w:lang w:val="ru-RU"/>
+        </w:rPr>
+        <w:t>к</w:t>
+      </w:r>
+      <w:r>
+        <w:rPr>
+          <w:lang w:val="ru-RU"/>
+        </w:rPr>
+        <w:t>россплатформенность</w:t>
+      </w:r>
+      <w:r>
+        <w:rPr>
+          <w:lang w:val="ru-RU"/>
+        </w:rPr>
+        <w:t>,</w:t>
+      </w:r>
+      <w:r>
+        <w:rPr>
+          <w:lang w:val="ru-RU"/>
+        </w:rPr>
+        <w:t xml:space="preserve"> поддержка </w:t>
+      </w:r>
+      <w:proofErr w:type="spellStart"/>
+      <w:r>
+        <w:rPr>
+          <w:lang w:val="ru-RU"/>
+        </w:rPr>
+        <w:t>iOS</w:t>
+      </w:r>
+      <w:proofErr w:type="spellEnd"/>
+      <w:r>
+        <w:rPr>
+          <w:lang w:val="ru-RU"/>
+        </w:rPr>
+        <w:t xml:space="preserve">, </w:t>
+      </w:r>
+      <w:proofErr w:type="spellStart"/>
+      <w:r>
+        <w:rPr>
+          <w:lang w:val="ru-RU"/>
+        </w:rPr>
+        <w:t>Android</w:t>
+      </w:r>
+      <w:proofErr w:type="spellEnd"/>
+      <w:r>
+        <w:rPr>
+          <w:lang w:val="ru-RU"/>
+        </w:rPr>
+        <w:t xml:space="preserve">, Windows, </w:t>
+      </w:r>
+      <w:proofErr w:type="spellStart"/>
+      <w:r>
+        <w:rPr>
+          <w:lang w:val="ru-RU"/>
+        </w:rPr>
+        <w:t>macOS</w:t>
+      </w:r>
+      <w:proofErr w:type="spellEnd"/>
+      <w:r>
+        <w:rPr>
+          <w:lang w:val="ru-RU"/>
+        </w:rPr>
+        <w:t>, Linux и Web</w:t>
+      </w:r>
+      <w:r>
+        <w:rPr>
+          <w:lang w:val="ru-RU"/>
+        </w:rPr>
+        <w:t>;</w:t>
+      </w:r>
+    </w:p>
+    <w:p>
+      <w:pPr>
+        <w:rPr>
+          <w:lang w:val="ru-RU"/>
+        </w:rPr>
+      </w:pPr>
+      <w:r>
+        <w:rPr>
+          <w:lang w:val="ru-RU"/>
+        </w:rPr>
+        <w:t xml:space="preserve">- </w:t>
+      </w:r>
+      <w:r>
+        <w:rPr>
+          <w:lang w:val="ru-RU"/>
+        </w:rPr>
+        <w:t>о</w:t>
+      </w:r>
+      <w:r>
+        <w:rPr>
+          <w:lang w:val="ru-RU"/>
+        </w:rPr>
+        <w:t>тказоустойчивость</w:t>
+      </w:r>
+      <w:r>
+        <w:rPr>
+          <w:lang w:val="ru-RU"/>
+        </w:rPr>
+        <w:t>,</w:t>
+      </w:r>
+      <w:r>
+        <w:rPr>
+          <w:lang w:val="ru-RU"/>
+        </w:rPr>
+        <w:t xml:space="preserve"> наличие механизмов обхода блокировок, поддержка прокси, VPN, P2P-соединений</w:t>
+      </w:r>
+      <w:r>
+        <w:rPr>
+          <w:lang w:val="ru-RU"/>
+        </w:rPr>
+        <w:t>;</w:t>
+      </w:r>
+    </w:p>
+    <w:p>
+      <w:pPr>
+        <w:rPr>
+          <w:lang w:val="ru-RU"/>
+        </w:rPr>
+      </w:pPr>
+      <w:r>
+        <w:rPr>
+          <w:lang w:val="ru-RU"/>
+        </w:rPr>
+        <w:lastRenderedPageBreak/>
+        <w:t xml:space="preserve">- </w:t>
+      </w:r>
+      <w:r>
+        <w:rPr>
+          <w:lang w:val="ru-RU"/>
+        </w:rPr>
+        <w:t>м</w:t>
+      </w:r>
+      <w:r>
+        <w:rPr>
+          <w:lang w:val="ru-RU"/>
+        </w:rPr>
+        <w:t>асштабируемость</w:t>
+      </w:r>
+      <w:r>
+        <w:rPr>
+          <w:lang w:val="ru-RU"/>
+        </w:rPr>
+        <w:t>,</w:t>
+      </w:r>
+      <w:r>
+        <w:rPr>
+          <w:lang w:val="ru-RU"/>
+        </w:rPr>
+        <w:t xml:space="preserve"> способность выдерживать рост числа пользователей и нагрузки</w:t>
+      </w:r>
+      <w:r>
+        <w:rPr>
+          <w:lang w:val="ru-RU"/>
+        </w:rPr>
+        <w:t>;</w:t>
+      </w:r>
+    </w:p>
+    <w:p>
+      <w:pPr>
+        <w:rPr>
+          <w:lang w:val="ru-RU"/>
+        </w:rPr>
+      </w:pPr>
+      <w:r>
+        <w:rPr>
+          <w:lang w:val="ru-RU"/>
+        </w:rPr>
+        <w:t xml:space="preserve">- </w:t>
+      </w:r>
+      <w:r>
+        <w:rPr>
+          <w:lang w:val="ru-RU"/>
+        </w:rPr>
+        <w:t>с</w:t>
+      </w:r>
+      <w:r>
+        <w:rPr>
+          <w:lang w:val="ru-RU"/>
+        </w:rPr>
+        <w:t>корость доставки сообщений</w:t>
+      </w:r>
+      <w:r>
+        <w:rPr>
+          <w:lang w:val="ru-RU"/>
+        </w:rPr>
+        <w:t>,</w:t>
+      </w:r>
+      <w:r>
+        <w:rPr>
+          <w:lang w:val="ru-RU"/>
+        </w:rPr>
+        <w:t xml:space="preserve"> среднее и максимальное время доставки</w:t>
+      </w:r>
+      <w:r>
+        <w:rPr>
+          <w:lang w:val="ru-RU"/>
+        </w:rPr>
+        <w:t>;</w:t>
+      </w:r>
+    </w:p>
+    <w:p>
+      <w:pPr>
+        <w:rPr>
+          <w:lang w:val="ru-RU"/>
+        </w:rPr>
+      </w:pPr>
+      <w:r>
+        <w:rPr>
+          <w:lang w:val="ru-RU"/>
+        </w:rPr>
+        <w:t xml:space="preserve">- </w:t>
+      </w:r>
+      <w:r>
+        <w:rPr>
+          <w:lang w:val="ru-RU"/>
+        </w:rPr>
+        <w:t>с</w:t>
+      </w:r>
+      <w:r>
+        <w:rPr>
+          <w:lang w:val="ru-RU"/>
+        </w:rPr>
+        <w:t>табильность работы</w:t>
+      </w:r>
+      <w:r>
+        <w:rPr>
+          <w:lang w:val="ru-RU"/>
+        </w:rPr>
+        <w:t>,</w:t>
+      </w:r>
+      <w:r>
+        <w:rPr>
+          <w:lang w:val="ru-RU"/>
+        </w:rPr>
+        <w:t xml:space="preserve"> частота сбоев, время восстановления после сбоев</w:t>
+      </w:r>
+      <w:r>
+        <w:rPr>
+          <w:lang w:val="ru-RU"/>
+        </w:rPr>
+        <w:t>.</w:t>
+      </w:r>
+    </w:p>
+    <w:p>
+      <w:pPr>
+        <w:pStyle w:val="af2"/>
+        <w:numPr>
+          <w:ilvl w:val="0"/>
+          <w:numId w:val="6"/>
+        </w:numPr>
+        <w:rPr>
+          <w:lang w:val="ru-RU"/>
+        </w:rPr>
+      </w:pPr>
+      <w:r>
+        <w:rPr>
+          <w:lang w:val="ru-RU"/>
+        </w:rPr>
+        <w:t>Безопасность и конфиденциальность</w:t>
+      </w:r>
+      <w:r>
+        <w:rPr>
+          <w:lang w:val="en-US"/>
+        </w:rPr>
+        <w:t>:</w:t>
+      </w:r>
+    </w:p>
+    <w:p>
+      <w:pPr>
+        <w:rPr>
+          <w:lang w:val="ru-RU"/>
+        </w:rPr>
+      </w:pPr>
+      <w:r>
+        <w:rPr>
+          <w:lang w:val="ru-RU"/>
+        </w:rPr>
+        <w:t xml:space="preserve">- </w:t>
+      </w:r>
+      <w:r>
+        <w:rPr>
+          <w:lang w:val="ru-RU"/>
+        </w:rPr>
+        <w:t>ш</w:t>
+      </w:r>
+      <w:r>
+        <w:rPr>
+          <w:lang w:val="ru-RU"/>
+        </w:rPr>
+        <w:t>ифрование</w:t>
+      </w:r>
+      <w:r>
+        <w:rPr>
+          <w:lang w:val="ru-RU"/>
+        </w:rPr>
+        <w:t>,</w:t>
+      </w:r>
+      <w:r>
+        <w:rPr>
+          <w:lang w:val="ru-RU"/>
+        </w:rPr>
+        <w:t xml:space="preserve"> использование E2E (сквозное шифрование), алгоритмы шифрования (AES, RSA и др.)</w:t>
+      </w:r>
+      <w:r>
+        <w:rPr>
+          <w:lang w:val="ru-RU"/>
+        </w:rPr>
+        <w:t>;</w:t>
+      </w:r>
+    </w:p>
+    <w:p>
+      <w:pPr>
+        <w:rPr>
+          <w:lang w:val="ru-RU"/>
+        </w:rPr>
+      </w:pPr>
+      <w:r>
+        <w:rPr>
+          <w:lang w:val="ru-RU"/>
+        </w:rPr>
+        <w:t xml:space="preserve">- </w:t>
+      </w:r>
+      <w:r>
+        <w:rPr>
+          <w:lang w:val="ru-RU"/>
+        </w:rPr>
+        <w:t>а</w:t>
+      </w:r>
+      <w:r>
+        <w:rPr>
+          <w:lang w:val="ru-RU"/>
+        </w:rPr>
+        <w:t>нонимность</w:t>
+      </w:r>
+      <w:r>
+        <w:rPr>
+          <w:lang w:val="ru-RU"/>
+        </w:rPr>
+        <w:t>,</w:t>
+      </w:r>
+      <w:r>
+        <w:rPr>
+          <w:lang w:val="ru-RU"/>
+        </w:rPr>
+        <w:t xml:space="preserve"> возможность регистрации без номера телефона, поддержка анонимных аккаунтов</w:t>
+      </w:r>
+      <w:r>
+        <w:rPr>
+          <w:lang w:val="ru-RU"/>
+        </w:rPr>
+        <w:t>;</w:t>
+      </w:r>
+    </w:p>
+    <w:p>
+      <w:pPr>
+        <w:rPr>
+          <w:lang w:val="ru-RU"/>
+        </w:rPr>
+      </w:pPr>
+      <w:r>
+        <w:rPr>
+          <w:lang w:val="ru-RU"/>
+        </w:rPr>
+        <w:t xml:space="preserve">- </w:t>
+      </w:r>
+      <w:r>
+        <w:rPr>
+          <w:lang w:val="ru-RU"/>
+        </w:rPr>
+        <w:t>х</w:t>
+      </w:r>
+      <w:r>
+        <w:rPr>
+          <w:lang w:val="ru-RU"/>
+        </w:rPr>
+        <w:t>ранение данных</w:t>
+      </w:r>
+      <w:r>
+        <w:rPr>
+          <w:lang w:val="ru-RU"/>
+        </w:rPr>
+        <w:t>,</w:t>
+      </w:r>
+      <w:r>
+        <w:rPr>
+          <w:lang w:val="ru-RU"/>
+        </w:rPr>
+        <w:t xml:space="preserve"> где и как хранятся сообщения (локально/на сервере), политика хранения</w:t>
+      </w:r>
+      <w:r>
+        <w:rPr>
+          <w:lang w:val="ru-RU"/>
+        </w:rPr>
+        <w:t>;</w:t>
+      </w:r>
+    </w:p>
+    <w:p>
+      <w:pPr>
+        <w:rPr>
+          <w:lang w:val="ru-RU"/>
+        </w:rPr>
+      </w:pPr>
+      <w:r>
+        <w:rPr>
+          <w:lang w:val="ru-RU"/>
+        </w:rPr>
+        <w:t xml:space="preserve">- </w:t>
+      </w:r>
+      <w:r>
+        <w:rPr>
+          <w:lang w:val="ru-RU"/>
+        </w:rPr>
+        <w:t>з</w:t>
+      </w:r>
+      <w:r>
+        <w:rPr>
+          <w:lang w:val="ru-RU"/>
+        </w:rPr>
+        <w:t>ащита от взлома</w:t>
+      </w:r>
+      <w:r>
+        <w:rPr>
+          <w:lang w:val="ru-RU"/>
+        </w:rPr>
+        <w:t>,</w:t>
+      </w:r>
+      <w:r>
+        <w:rPr>
+          <w:lang w:val="ru-RU"/>
+        </w:rPr>
+        <w:t xml:space="preserve"> механизмы аутентификации, двухфакторная аутентификация, защита от фишинга</w:t>
+      </w:r>
+      <w:r>
+        <w:rPr>
+          <w:lang w:val="ru-RU"/>
+        </w:rPr>
+        <w:t>.</w:t>
+      </w:r>
+    </w:p>
+    <w:p>
+      <w:pPr>
+        <w:pStyle w:val="af2"/>
+        <w:numPr>
+          <w:ilvl w:val="0"/>
+          <w:numId w:val="6"/>
+        </w:numPr>
+        <w:rPr>
+          <w:lang w:val="ru-RU"/>
+        </w:rPr>
+      </w:pPr>
+      <w:r>
+        <w:rPr>
+          <w:lang w:val="ru-RU"/>
+        </w:rPr>
+        <w:t>Функциональность</w:t>
+      </w:r>
+      <w:r>
+        <w:rPr>
+          <w:lang w:val="ru-RU"/>
+        </w:rPr>
+        <w:t>:</w:t>
+      </w:r>
+    </w:p>
+    <w:p>
+      <w:pPr>
+        <w:rPr>
+          <w:lang w:val="ru-RU"/>
+        </w:rPr>
+      </w:pPr>
+      <w:r>
+        <w:rPr>
+          <w:lang w:val="ru-RU"/>
+        </w:rPr>
+        <w:t xml:space="preserve">- </w:t>
+      </w:r>
+      <w:r>
+        <w:rPr>
+          <w:lang w:val="ru-RU"/>
+        </w:rPr>
+        <w:t>б</w:t>
+      </w:r>
+      <w:r>
+        <w:rPr>
+          <w:lang w:val="ru-RU"/>
+        </w:rPr>
+        <w:t>азовые возможности</w:t>
+      </w:r>
+      <w:r>
+        <w:rPr>
+          <w:lang w:val="ru-RU"/>
+        </w:rPr>
+        <w:t>,</w:t>
+      </w:r>
+      <w:r>
+        <w:rPr>
+          <w:lang w:val="ru-RU"/>
+        </w:rPr>
+        <w:t xml:space="preserve"> чаты (групповые, личные), голосовые и видеозвонки, обмен файлами</w:t>
+      </w:r>
+      <w:r>
+        <w:rPr>
+          <w:lang w:val="ru-RU"/>
+        </w:rPr>
+        <w:t>;</w:t>
+      </w:r>
+    </w:p>
+    <w:p>
+      <w:pPr>
+        <w:rPr>
+          <w:lang w:val="ru-RU"/>
+        </w:rPr>
+      </w:pPr>
+      <w:r>
+        <w:rPr>
+          <w:lang w:val="ru-RU"/>
+        </w:rPr>
+        <w:t xml:space="preserve">- </w:t>
+      </w:r>
+      <w:r>
+        <w:rPr>
+          <w:lang w:val="ru-RU"/>
+        </w:rPr>
+        <w:t>р</w:t>
+      </w:r>
+      <w:r>
+        <w:rPr>
+          <w:lang w:val="ru-RU"/>
+        </w:rPr>
+        <w:t>асширенные функции</w:t>
+      </w:r>
+      <w:r>
+        <w:rPr>
+          <w:lang w:val="ru-RU"/>
+        </w:rPr>
+        <w:t>,</w:t>
+      </w:r>
+      <w:r>
+        <w:rPr>
+          <w:lang w:val="ru-RU"/>
+        </w:rPr>
+        <w:t xml:space="preserve"> каналы, боты, интеграции с внешними сервисами, инструменты для бизнеса (платежи, рассылки)</w:t>
+      </w:r>
+      <w:r>
+        <w:rPr>
+          <w:lang w:val="ru-RU"/>
+        </w:rPr>
+        <w:t>;</w:t>
+      </w:r>
+    </w:p>
+    <w:p>
+      <w:pPr>
+        <w:rPr>
+          <w:lang w:val="ru-RU"/>
+        </w:rPr>
+      </w:pPr>
+      <w:r>
+        <w:rPr>
+          <w:lang w:val="ru-RU"/>
+        </w:rPr>
+        <w:t xml:space="preserve">- </w:t>
+      </w:r>
+      <w:r>
+        <w:rPr>
+          <w:lang w:val="ru-RU"/>
+        </w:rPr>
+        <w:t>п</w:t>
+      </w:r>
+      <w:r>
+        <w:rPr>
+          <w:lang w:val="ru-RU"/>
+        </w:rPr>
+        <w:t>отребление контента</w:t>
+      </w:r>
+      <w:r>
+        <w:rPr>
+          <w:lang w:val="ru-RU"/>
+        </w:rPr>
+        <w:t>,</w:t>
+      </w:r>
+      <w:r>
+        <w:rPr>
+          <w:lang w:val="ru-RU"/>
+        </w:rPr>
+        <w:t xml:space="preserve"> поддержка медиафайлов, ленты новостей, интеграция с социальными сетями</w:t>
+      </w:r>
+      <w:r>
+        <w:rPr>
+          <w:lang w:val="ru-RU"/>
+        </w:rPr>
+        <w:t>;</w:t>
+      </w:r>
+    </w:p>
+    <w:p>
+      <w:pPr>
+        <w:rPr>
+          <w:lang w:val="ru-RU"/>
+        </w:rPr>
+      </w:pPr>
+      <w:r>
+        <w:rPr>
+          <w:lang w:val="ru-RU"/>
+        </w:rPr>
+        <w:t>-</w:t>
       </w:r>
       <w:r>
         <w:rPr>
@@ -1273,158 +2453,455 @@
         <w:rPr>
           <w:lang w:val="ru-RU"/>
         </w:rPr>
+        <w:t>н</w:t>
+      </w:r>
+      <w:r>
+        <w:rPr>
+          <w:lang w:val="ru-RU"/>
+        </w:rPr>
+        <w:t>астройка интерфейса</w:t>
+      </w:r>
+      <w:r>
+        <w:rPr>
+          <w:lang w:val="ru-RU"/>
+        </w:rPr>
+        <w:t>,</w:t>
+      </w:r>
+      <w:r>
+        <w:rPr>
+          <w:lang w:val="ru-RU"/>
+        </w:rPr>
+        <w:t xml:space="preserve"> темы, кастомизация, доступность для людей с ограниченными возможностями.</w:t>
+      </w:r>
+    </w:p>
+    <w:p>
+      <w:pPr>
+        <w:pStyle w:val="af2"/>
+        <w:numPr>
+          <w:ilvl w:val="0"/>
+          <w:numId w:val="6"/>
+        </w:numPr>
+        <w:rPr>
+          <w:lang w:val="ru-RU"/>
+        </w:rPr>
+      </w:pPr>
+      <w:r>
+        <w:rPr>
+          <w:lang w:val="ru-RU"/>
+        </w:rPr>
+        <w:t>Пользовательский опыт (UX/UI)</w:t>
+      </w:r>
+      <w:r>
+        <w:rPr>
+          <w:lang w:val="ru-RU"/>
+        </w:rPr>
+        <w:t>:</w:t>
+      </w:r>
+    </w:p>
+    <w:p>
+      <w:pPr>
+        <w:rPr>
+          <w:lang w:val="ru-RU"/>
+        </w:rPr>
+      </w:pPr>
+      <w:r>
+        <w:rPr>
+          <w:lang w:val="ru-RU"/>
+        </w:rPr>
+        <w:t xml:space="preserve">- </w:t>
+      </w:r>
+      <w:r>
+        <w:rPr>
+          <w:lang w:val="ru-RU"/>
+        </w:rPr>
+        <w:t>у</w:t>
+      </w:r>
+      <w:r>
+        <w:rPr>
+          <w:lang w:val="ru-RU"/>
+        </w:rPr>
+        <w:t>добство интерфейса</w:t>
+      </w:r>
+      <w:r>
+        <w:rPr>
+          <w:lang w:val="ru-RU"/>
+        </w:rPr>
+        <w:t>,</w:t>
+      </w:r>
+      <w:r>
+        <w:rPr>
+          <w:lang w:val="ru-RU"/>
+        </w:rPr>
+        <w:t xml:space="preserve"> интуитивность, скорость работы, адаптивность</w:t>
+      </w:r>
+      <w:r>
+        <w:rPr>
+          <w:lang w:val="ru-RU"/>
+        </w:rPr>
+        <w:t>;</w:t>
+      </w:r>
+    </w:p>
+    <w:p>
+      <w:pPr>
+        <w:rPr>
+          <w:lang w:val="ru-RU"/>
+        </w:rPr>
+      </w:pPr>
+      <w:r>
+        <w:rPr>
+          <w:lang w:val="ru-RU"/>
+        </w:rPr>
+        <w:t xml:space="preserve">- </w:t>
+      </w:r>
+      <w:r>
+        <w:rPr>
+          <w:lang w:val="ru-RU"/>
+        </w:rPr>
+        <w:t>л</w:t>
+      </w:r>
+      <w:r>
+        <w:rPr>
+          <w:lang w:val="ru-RU"/>
+        </w:rPr>
+        <w:t>окализация</w:t>
+      </w:r>
+      <w:r>
+        <w:rPr>
+          <w:lang w:val="ru-RU"/>
+        </w:rPr>
+        <w:t>,</w:t>
+      </w:r>
+      <w:r>
+        <w:rPr>
+          <w:lang w:val="ru-RU"/>
+        </w:rPr>
+        <w:t xml:space="preserve"> поддержка русского языка и региональных особенностей</w:t>
+      </w:r>
+      <w:r>
+        <w:rPr>
+          <w:lang w:val="ru-RU"/>
+        </w:rPr>
+        <w:t>;</w:t>
+      </w:r>
+    </w:p>
+    <w:p>
+      <w:pPr>
+        <w:rPr>
+          <w:lang w:val="ru-RU"/>
+        </w:rPr>
+      </w:pPr>
+      <w:r>
+        <w:rPr>
+          <w:lang w:val="ru-RU"/>
+        </w:rPr>
+        <w:t xml:space="preserve">- </w:t>
+      </w:r>
+      <w:r>
+        <w:rPr>
+          <w:lang w:val="ru-RU"/>
+        </w:rPr>
         <w:t>о</w:t>
       </w:r>
       <w:r>
         <w:rPr>
           <w:lang w:val="ru-RU"/>
         </w:rPr>
-        <w:t>тправ</w:t>
-      </w:r>
-      <w:r>
-        <w:rPr>
-          <w:lang w:val="ru-RU"/>
-        </w:rPr>
-        <w:t>ки</w:t>
-      </w:r>
-      <w:r>
-        <w:rPr>
-          <w:lang w:val="ru-RU"/>
-        </w:rPr>
-        <w:t xml:space="preserve"> и получ</w:t>
-      </w:r>
-      <w:r>
-        <w:rPr>
-          <w:lang w:val="ru-RU"/>
-        </w:rPr>
-        <w:t>ения</w:t>
-      </w:r>
-      <w:r>
-        <w:rPr>
-          <w:lang w:val="ru-RU"/>
-        </w:rPr>
-        <w:t xml:space="preserve"> сообщения в высоком качестве, участв</w:t>
-      </w:r>
-      <w:r>
-        <w:rPr>
-          <w:lang w:val="ru-RU"/>
-        </w:rPr>
-        <w:t>овать</w:t>
-      </w:r>
-      <w:r>
-        <w:rPr>
-          <w:lang w:val="ru-RU"/>
-        </w:rPr>
-        <w:t xml:space="preserve"> в голосовых и видеозвонках HD</w:t>
-      </w:r>
-      <w:r>
-        <w:rPr>
-          <w:lang w:val="ru-RU"/>
-        </w:rPr>
-        <w:t xml:space="preserve">. Сервис </w:t>
-      </w:r>
-      <w:r>
-        <w:rPr>
-          <w:lang w:val="ru-RU"/>
-        </w:rPr>
-        <w:t>постоянно расширя</w:t>
-      </w:r>
-      <w:r>
-        <w:rPr>
-          <w:lang w:val="ru-RU"/>
-        </w:rPr>
-        <w:t>ет</w:t>
-      </w:r>
-      <w:r>
-        <w:rPr>
-          <w:lang w:val="ru-RU"/>
-        </w:rPr>
-        <w:t xml:space="preserve"> набор новых функций, которые помогают оставаться на связи.</w:t>
-      </w:r>
-    </w:p>
-    <w:p>
-      <w:pPr>
+        <w:t>братная связь</w:t>
+      </w:r>
+      <w:r>
+        <w:rPr>
+          <w:lang w:val="ru-RU"/>
+        </w:rPr>
+        <w:t>,</w:t>
+      </w:r>
+      <w:r>
+        <w:rPr>
+          <w:lang w:val="ru-RU"/>
+        </w:rPr>
+        <w:t xml:space="preserve"> наличие поддержки, скорость ответа на обращения</w:t>
+      </w:r>
+      <w:r>
+        <w:rPr>
+          <w:lang w:val="ru-RU"/>
+        </w:rPr>
+        <w:t>.</w:t>
+      </w:r>
+    </w:p>
+    <w:p>
+      <w:pPr>
+        <w:pStyle w:val="af2"/>
+        <w:numPr>
+          <w:ilvl w:val="0"/>
+          <w:numId w:val="6"/>
+        </w:numPr>
+        <w:rPr>
+          <w:lang w:val="ru-RU"/>
+        </w:rPr>
+      </w:pPr>
+      <w:r>
+        <w:rPr>
+          <w:lang w:val="ru-RU"/>
+        </w:rPr>
+        <w:t>Экосистема и интеграции</w:t>
+      </w:r>
+      <w:r>
         <w:rPr>
           <w:lang w:val="en-US"/>
         </w:rPr>
-      </w:pPr>
+        <w:t>:</w:t>
+      </w:r>
+    </w:p>
+    <w:p>
+      <w:pPr>
+        <w:rPr>
+          <w:lang w:val="ru-RU"/>
+        </w:rPr>
+      </w:pPr>
+      <w:r>
+        <w:rPr>
+          <w:lang w:val="ru-RU"/>
+        </w:rPr>
+        <w:t>- API и SDK</w:t>
+      </w:r>
+      <w:r>
+        <w:rPr>
+          <w:lang w:val="ru-RU"/>
+        </w:rPr>
+        <w:t>,</w:t>
+      </w:r>
+      <w:r>
+        <w:rPr>
+          <w:lang w:val="ru-RU"/>
+        </w:rPr>
+        <w:t xml:space="preserve"> наличие открытых инструментов для разработчиков</w:t>
+      </w:r>
+      <w:r>
+        <w:rPr>
+          <w:lang w:val="ru-RU"/>
+        </w:rPr>
+        <w:t>;</w:t>
+      </w:r>
+    </w:p>
+    <w:p>
+      <w:pPr>
+        <w:rPr>
+          <w:lang w:val="ru-RU"/>
+        </w:rPr>
+      </w:pPr>
+      <w:r>
+        <w:rPr>
+          <w:lang w:val="ru-RU"/>
+        </w:rPr>
+        <w:t xml:space="preserve">- </w:t>
+      </w:r>
+      <w:r>
+        <w:rPr>
+          <w:lang w:val="ru-RU"/>
+        </w:rPr>
+        <w:t>и</w:t>
+      </w:r>
+      <w:r>
+        <w:rPr>
+          <w:lang w:val="ru-RU"/>
+        </w:rPr>
+        <w:t>нтеграции с корпоративными системами (CRM, ERP), платежными сервисами, календарями</w:t>
+      </w:r>
+      <w:r>
+        <w:rPr>
+          <w:lang w:val="ru-RU"/>
+        </w:rPr>
+        <w:t>;</w:t>
+      </w:r>
+    </w:p>
+    <w:p>
+      <w:pPr>
+        <w:rPr>
+          <w:lang w:val="ru-RU"/>
+        </w:rPr>
+      </w:pPr>
+      <w:r>
+        <w:rPr>
+          <w:lang w:val="ru-RU"/>
+        </w:rPr>
+        <w:t xml:space="preserve">- </w:t>
+      </w:r>
+      <w:r>
+        <w:rPr>
+          <w:lang w:val="ru-RU"/>
+        </w:rPr>
+        <w:t>с</w:t>
+      </w:r>
+      <w:r>
+        <w:rPr>
+          <w:lang w:val="ru-RU"/>
+        </w:rPr>
+        <w:t>ообщество</w:t>
+      </w:r>
+      <w:r>
+        <w:rPr>
+          <w:lang w:val="ru-RU"/>
+        </w:rPr>
+        <w:t>,</w:t>
+      </w:r>
+      <w:r>
+        <w:rPr>
+          <w:lang w:val="ru-RU"/>
+        </w:rPr>
+        <w:t xml:space="preserve"> активность пользователей, наличие форумов, каналов поддержки</w:t>
+      </w:r>
+      <w:r>
+        <w:rPr>
+          <w:lang w:val="ru-RU"/>
+        </w:rPr>
+        <w:t>.</w:t>
+      </w:r>
+    </w:p>
+    <w:p>
+      <w:pPr>
+        <w:pStyle w:val="af2"/>
+        <w:numPr>
+          <w:ilvl w:val="0"/>
+          <w:numId w:val="6"/>
+        </w:numPr>
+        <w:rPr>
+          <w:lang w:val="ru-RU"/>
+        </w:rPr>
+      </w:pPr>
+      <w:r>
+        <w:rPr>
+          <w:lang w:val="ru-RU"/>
+        </w:rPr>
+        <w:t>Экономические и юридические аспекты</w:t>
+      </w:r>
       <w:r>
         <w:rPr>
           <w:lang w:val="en-US"/>
         </w:rPr>
-        <w:t>Signal</w:t>
-      </w:r>
-      <w:r>
-        <w:rPr>
-          <w:lang w:val="ru-RU"/>
-        </w:rPr>
-        <w:t xml:space="preserve"> </w:t>
-      </w:r>
-      <w:r>
-        <w:rPr>
-          <w:lang w:val="ru-RU"/>
-        </w:rPr>
-        <w:t>–</w:t>
-      </w:r>
-      <w:r>
-        <w:rPr>
-          <w:lang w:val="ru-RU"/>
-        </w:rPr>
-        <w:t xml:space="preserve"> независимая некоммерческая организация. </w:t>
-      </w:r>
-      <w:r>
-        <w:rPr>
-          <w:lang w:val="ru-RU"/>
-        </w:rPr>
-        <w:t>Она не</w:t>
-      </w:r>
-      <w:r>
-        <w:rPr>
-          <w:lang w:val="ru-RU"/>
-        </w:rPr>
-        <w:t xml:space="preserve"> связан</w:t>
-      </w:r>
-      <w:r>
-        <w:rPr>
-          <w:lang w:val="ru-RU"/>
-        </w:rPr>
-        <w:t>а</w:t>
-      </w:r>
-      <w:r>
-        <w:rPr>
-          <w:lang w:val="ru-RU"/>
-        </w:rPr>
-        <w:t xml:space="preserve"> ни с одной крупной технологической компанией и не може</w:t>
-      </w:r>
-      <w:r>
-        <w:rPr>
-          <w:lang w:val="ru-RU"/>
-        </w:rPr>
-        <w:t>т</w:t>
-      </w:r>
-      <w:r>
-        <w:rPr>
-          <w:lang w:val="ru-RU"/>
-        </w:rPr>
-        <w:t xml:space="preserve"> быть приобретен</w:t>
-      </w:r>
-      <w:r>
-        <w:rPr>
-          <w:lang w:val="ru-RU"/>
-        </w:rPr>
-        <w:t>а</w:t>
-      </w:r>
-      <w:r>
-        <w:rPr>
-          <w:lang w:val="ru-RU"/>
-        </w:rPr>
-        <w:t xml:space="preserve"> кем-либо из них. Развитие сервиса поддерживается за счёт грантов и пожертвовани</w:t>
-      </w:r>
-      <w:r>
-        <w:rPr>
-          <w:lang w:val="ru-RU"/>
-        </w:rPr>
-        <w:t>й пользователей</w:t>
+        <w:t>:</w:t>
+      </w:r>
+    </w:p>
+    <w:p>
+      <w:pPr>
+        <w:rPr>
+          <w:lang w:val="ru-RU"/>
+        </w:rPr>
+      </w:pPr>
+      <w:r>
+        <w:rPr>
+          <w:lang w:val="ru-RU"/>
+        </w:rPr>
+        <w:t xml:space="preserve">- </w:t>
+      </w:r>
+      <w:r>
+        <w:rPr>
+          <w:lang w:val="ru-RU"/>
+        </w:rPr>
+        <w:t xml:space="preserve"> м</w:t>
+      </w:r>
+      <w:r>
+        <w:rPr>
+          <w:lang w:val="ru-RU"/>
+        </w:rPr>
+        <w:t>одель монетизации</w:t>
+      </w:r>
+      <w:r>
+        <w:rPr>
+          <w:lang w:val="ru-RU"/>
+        </w:rPr>
+        <w:t>,</w:t>
+      </w:r>
+      <w:r>
+        <w:rPr>
+          <w:lang w:val="ru-RU"/>
+        </w:rPr>
+        <w:t xml:space="preserve"> платные функции, подписки, реклама</w:t>
+      </w:r>
+      <w:r>
+        <w:rPr>
+          <w:lang w:val="ru-RU"/>
+        </w:rPr>
+        <w:t>;</w:t>
+      </w:r>
+    </w:p>
+    <w:p>
+      <w:pPr>
+        <w:rPr>
+          <w:lang w:val="ru-RU"/>
+        </w:rPr>
+      </w:pPr>
+      <w:r>
+        <w:rPr>
+          <w:lang w:val="ru-RU"/>
+        </w:rPr>
+        <w:t xml:space="preserve">- </w:t>
+      </w:r>
+      <w:r>
+        <w:rPr>
+          <w:lang w:val="ru-RU"/>
+        </w:rPr>
+        <w:t>ю</w:t>
+      </w:r>
+      <w:r>
+        <w:rPr>
+          <w:lang w:val="ru-RU"/>
+        </w:rPr>
+        <w:t>рисдикция</w:t>
+      </w:r>
+      <w:r>
+        <w:rPr>
+          <w:lang w:val="ru-RU"/>
+        </w:rPr>
+        <w:t>,</w:t>
+      </w:r>
+      <w:r>
+        <w:rPr>
+          <w:lang w:val="ru-RU"/>
+        </w:rPr>
+        <w:t xml:space="preserve"> страна регистрации компании-разработчика, соответствие законодательству РФ</w:t>
+      </w:r>
+      <w:r>
+        <w:rPr>
+          <w:lang w:val="ru-RU"/>
+        </w:rPr>
+        <w:t>;</w:t>
+      </w:r>
+    </w:p>
+    <w:p>
+      <w:pPr>
+        <w:rPr>
+          <w:lang w:val="ru-RU"/>
+        </w:rPr>
+      </w:pPr>
+      <w:r>
+        <w:rPr>
+          <w:lang w:val="ru-RU"/>
+        </w:rPr>
+        <w:lastRenderedPageBreak/>
+        <w:t xml:space="preserve">- </w:t>
+      </w:r>
+      <w:r>
+        <w:rPr>
+          <w:lang w:val="ru-RU"/>
+        </w:rPr>
+        <w:t>п</w:t>
+      </w:r>
+      <w:r>
+        <w:rPr>
+          <w:lang w:val="ru-RU"/>
+        </w:rPr>
+        <w:t>олитика конфиденциальности</w:t>
+      </w:r>
+      <w:r>
+        <w:rPr>
+          <w:lang w:val="ru-RU"/>
+        </w:rPr>
+        <w:t>,</w:t>
+      </w:r>
+      <w:r>
+        <w:rPr>
+          <w:lang w:val="ru-RU"/>
+        </w:rPr>
+        <w:t xml:space="preserve"> прозрачность сбора и использования данных</w:t>
       </w:r>
       <w:r>
         <w:rPr>
@@ -1443,715 +2920,1318 @@
         <w:rPr>
           <w:lang w:val="ru-RU"/>
         </w:rPr>
-        <w:t xml:space="preserve">Передовые технологии </w:t>
-      </w:r>
-      <w:r>
-        <w:rPr>
-          <w:lang w:val="ru-RU"/>
-        </w:rPr>
-        <w:t>E2E-шифровани</w:t>
-      </w:r>
-      <w:r>
-        <w:rPr>
-          <w:lang w:val="ru-RU"/>
-        </w:rPr>
-        <w:t xml:space="preserve">я </w:t>
-      </w:r>
-      <w:proofErr w:type="spellStart"/>
-      <w:r>
-        <w:rPr>
-          <w:lang w:val="ru-RU"/>
-        </w:rPr>
-        <w:t>Signal</w:t>
-      </w:r>
-      <w:proofErr w:type="spellEnd"/>
-      <w:r>
-        <w:rPr>
-          <w:lang w:val="ru-RU"/>
-        </w:rPr>
-        <w:t xml:space="preserve"> по сохранению конфиденциальности всегда включены</w:t>
-      </w:r>
-      <w:r>
-        <w:rPr>
-          <w:lang w:val="ru-RU"/>
-        </w:rPr>
-        <w:t>. Н</w:t>
-      </w:r>
-      <w:r>
-        <w:rPr>
-          <w:lang w:val="ru-RU"/>
-        </w:rPr>
-        <w:t>ет рекламы, партнёрских маркетологов и навязчивого отслеживания</w:t>
-      </w:r>
-      <w:r>
-        <w:rPr>
-          <w:lang w:val="ru-RU"/>
-        </w:rPr>
-        <w:t xml:space="preserve">. В России заблокирован, работает только через VPN. </w:t>
-      </w:r>
-      <w:r>
-        <w:rPr>
-          <w:lang w:val="ru-RU"/>
-        </w:rPr>
-        <w:t>М</w:t>
-      </w:r>
-      <w:r>
-        <w:rPr>
-          <w:lang w:val="ru-RU"/>
-        </w:rPr>
-        <w:t>ессенджер с открытым исходным кодо</w:t>
-      </w:r>
-      <w:r>
-        <w:rPr>
-          <w:lang w:val="ru-RU"/>
-        </w:rPr>
-        <w:t>м</w:t>
-      </w:r>
-      <w:r>
-        <w:rPr>
-          <w:lang w:val="ru-RU"/>
-        </w:rPr>
-        <w:t>, н</w:t>
-      </w:r>
-      <w:r>
-        <w:rPr>
-          <w:lang w:val="ru-RU"/>
-        </w:rPr>
-        <w:t>е поддерживает каналы и ботов, но обеспечивает высокий уровень безопасности</w:t>
-      </w:r>
-      <w:r>
-        <w:rPr>
-          <w:lang w:val="ru-RU"/>
-        </w:rPr>
-        <w:t>.</w:t>
-      </w:r>
-    </w:p>
-    <w:p>
-      <w:pPr>
-        <w:rPr>
-          <w:lang w:val="ru-RU"/>
-        </w:rPr>
-      </w:pPr>
-      <w:r>
-        <w:rPr>
-          <w:lang w:val="ru-RU"/>
-        </w:rPr>
-        <w:t xml:space="preserve">1.1.6 </w:t>
-      </w:r>
-      <w:proofErr w:type="spellStart"/>
-      <w:r>
-        <w:rPr>
-          <w:lang w:val="en-US"/>
-        </w:rPr>
-        <w:t>YouGile</w:t>
-      </w:r>
-      <w:proofErr w:type="spellEnd"/>
-      <w:r>
-        <w:rPr>
-          <w:lang w:val="ru-RU"/>
-        </w:rPr>
-        <w:t xml:space="preserve"> </w:t>
-      </w:r>
-      <w:r>
-        <w:rPr>
-          <w:lang w:val="ru-RU"/>
-        </w:rPr>
-        <w:t>–</w:t>
-      </w:r>
-      <w:r>
-        <w:rPr>
-          <w:lang w:val="ru-RU"/>
-        </w:rPr>
-        <w:t xml:space="preserve"> </w:t>
-      </w:r>
-      <w:r>
-        <w:rPr>
-          <w:lang w:val="ru-RU"/>
-        </w:rPr>
-        <w:t xml:space="preserve">российский сервис для командной работы, объединяющий </w:t>
-      </w:r>
-      <w:r>
-        <w:rPr>
-          <w:lang w:val="ru-RU"/>
-        </w:rPr>
-        <w:br/>
-      </w:r>
-      <w:r>
-        <w:rPr>
-          <w:lang w:val="ru-RU"/>
-        </w:rPr>
-        <w:t>канбан-доски и встроенный мессенджер</w:t>
-      </w:r>
-      <w:r>
-        <w:rPr>
-          <w:lang w:val="ru-RU"/>
-        </w:rPr>
-        <w:t xml:space="preserve"> </w:t>
-      </w:r>
-      <w:r>
-        <w:rPr>
-          <w:lang w:val="ru-RU"/>
-        </w:rPr>
-        <w:t>[</w:t>
-      </w:r>
-      <w:r>
-        <w:rPr>
-          <w:lang w:val="ru-RU"/>
-        </w:rPr>
-        <w:t>6</w:t>
-      </w:r>
-      <w:r>
-        <w:rPr>
-          <w:lang w:val="ru-RU"/>
-        </w:rPr>
-        <w:t>]</w:t>
-      </w:r>
-      <w:r>
-        <w:rPr>
-          <w:lang w:val="ru-RU"/>
-        </w:rPr>
-        <w:t xml:space="preserve">. Каждая задача </w:t>
-      </w:r>
-      <w:r>
-        <w:rPr>
-          <w:lang w:val="ru-RU"/>
-        </w:rPr>
-        <w:t>–</w:t>
-      </w:r>
-      <w:r>
-        <w:rPr>
-          <w:lang w:val="ru-RU"/>
-        </w:rPr>
-        <w:t xml:space="preserve"> отдельный чат, что удобно для проектного управления и обсуждения рабочих вопросов. Подходит для компаний, которым важно </w:t>
-      </w:r>
-      <w:proofErr w:type="spellStart"/>
-      <w:r>
-        <w:rPr>
-          <w:lang w:val="ru-RU"/>
-        </w:rPr>
-        <w:t>on</w:t>
-      </w:r>
-      <w:proofErr w:type="spellEnd"/>
-      <w:r>
-        <w:rPr>
-          <w:lang w:val="ru-RU"/>
-        </w:rPr>
-        <w:t>-</w:t>
-      </w:r>
-      <w:proofErr w:type="spellStart"/>
-      <w:r>
-        <w:rPr>
-          <w:lang w:val="ru-RU"/>
-        </w:rPr>
-        <w:t>premise</w:t>
-      </w:r>
-      <w:proofErr w:type="spellEnd"/>
-      <w:r>
-        <w:rPr>
-          <w:lang w:val="ru-RU"/>
-        </w:rPr>
-        <w:t xml:space="preserve">-развёртывание и интеграция задач с обсуждениями. </w:t>
-      </w:r>
-      <w:r>
-        <w:rPr>
-          <w:lang w:val="ru-RU"/>
-        </w:rPr>
-        <w:t xml:space="preserve">Поддерживает </w:t>
-      </w:r>
-      <w:r>
-        <w:rPr>
-          <w:lang w:val="ru-RU"/>
-        </w:rPr>
-        <w:t>обмен файлами</w:t>
-      </w:r>
-      <w:r>
-        <w:rPr>
-          <w:lang w:val="ru-RU"/>
-        </w:rPr>
-        <w:t xml:space="preserve"> любых форматов</w:t>
-      </w:r>
-      <w:r>
-        <w:rPr>
-          <w:lang w:val="ru-RU"/>
-        </w:rPr>
-        <w:t>, уведомления, опросы, реакции, голосовые сообщения</w:t>
-      </w:r>
-      <w:r>
-        <w:rPr>
-          <w:lang w:val="ru-RU"/>
-        </w:rPr>
-        <w:t xml:space="preserve"> с расшифровыванием в текст</w:t>
-      </w:r>
-      <w:r>
-        <w:rPr>
-          <w:lang w:val="ru-RU"/>
-        </w:rPr>
-        <w:t xml:space="preserve">, </w:t>
-      </w:r>
-      <w:r>
-        <w:rPr>
-          <w:lang w:val="ru-RU"/>
-        </w:rPr>
-        <w:t xml:space="preserve">видеосообщения с </w:t>
-      </w:r>
-      <w:r>
-        <w:rPr>
-          <w:lang w:val="ru-RU"/>
-        </w:rPr>
-        <w:t>демонстраци</w:t>
-      </w:r>
-      <w:r>
-        <w:rPr>
-          <w:lang w:val="ru-RU"/>
-        </w:rPr>
-        <w:t>ей</w:t>
-      </w:r>
-      <w:r>
-        <w:rPr>
-          <w:lang w:val="ru-RU"/>
-        </w:rPr>
-        <w:t xml:space="preserve"> экрана</w:t>
-      </w:r>
-      <w:r>
-        <w:rPr>
-          <w:lang w:val="ru-RU"/>
-        </w:rPr>
-        <w:t>.</w:t>
-      </w:r>
-    </w:p>
-    <w:p>
-      <w:pPr>
-        <w:pStyle w:val="3"/>
-        <w:rPr>
-          <w:lang w:val="ru-RU"/>
-        </w:rPr>
-      </w:pPr>
-      <w:r>
-        <w:rPr>
-          <w:lang w:val="ru-RU"/>
-        </w:rPr>
-        <w:t xml:space="preserve">1.2 </w:t>
-      </w:r>
-      <w:r>
-        <w:rPr>
-          <w:lang w:val="ru-RU"/>
-        </w:rPr>
-        <w:t>Сравнение аналогов</w:t>
-      </w:r>
-    </w:p>
-    <w:p>
-      <w:pPr>
-        <w:rPr>
-          <w:lang w:val="ru-RU"/>
-        </w:rPr>
-      </w:pPr>
-      <w:r>
-        <w:rPr>
-          <w:lang w:val="ru-RU"/>
-        </w:rPr>
-        <w:t>1. Технические характеристики</w:t>
-      </w:r>
-    </w:p>
-    <w:p>
-      <w:pPr>
-        <w:rPr>
-          <w:lang w:val="ru-RU"/>
-        </w:rPr>
-      </w:pPr>
-      <w:r>
-        <w:rPr>
-          <w:lang w:val="ru-RU"/>
-        </w:rPr>
-        <w:t xml:space="preserve">- Кроссплатформенность: поддержка </w:t>
-      </w:r>
-      <w:proofErr w:type="spellStart"/>
-      <w:r>
-        <w:rPr>
-          <w:lang w:val="ru-RU"/>
-        </w:rPr>
-        <w:t>iOS</w:t>
-      </w:r>
-      <w:proofErr w:type="spellEnd"/>
-      <w:r>
-        <w:rPr>
-          <w:lang w:val="ru-RU"/>
-        </w:rPr>
-        <w:t xml:space="preserve">, </w:t>
-      </w:r>
-      <w:proofErr w:type="spellStart"/>
-      <w:r>
-        <w:rPr>
-          <w:lang w:val="ru-RU"/>
-        </w:rPr>
-        <w:t>Android</w:t>
-      </w:r>
-      <w:proofErr w:type="spellEnd"/>
-      <w:r>
-        <w:rPr>
-          <w:lang w:val="ru-RU"/>
-        </w:rPr>
-        <w:t xml:space="preserve">, Windows, </w:t>
-      </w:r>
-      <w:proofErr w:type="spellStart"/>
-      <w:r>
-        <w:rPr>
-          <w:lang w:val="ru-RU"/>
-        </w:rPr>
-        <w:t>macOS</w:t>
-      </w:r>
-      <w:proofErr w:type="spellEnd"/>
-      <w:r>
-        <w:rPr>
-          <w:lang w:val="ru-RU"/>
-        </w:rPr>
-        <w:t>, Linux и Web.</w:t>
-      </w:r>
-    </w:p>
-    <w:p>
-      <w:pPr>
-        <w:rPr>
-          <w:lang w:val="ru-RU"/>
-        </w:rPr>
-      </w:pPr>
-      <w:r>
-        <w:rPr>
-          <w:lang w:val="ru-RU"/>
-        </w:rPr>
-        <w:t>- Отказоустойчивость: наличие механизмов обхода блокировок, поддержка прокси, VPN, P2P-соединений.</w:t>
-      </w:r>
-    </w:p>
-    <w:p>
-      <w:pPr>
-        <w:rPr>
-          <w:lang w:val="ru-RU"/>
-        </w:rPr>
-      </w:pPr>
-      <w:r>
-        <w:rPr>
-          <w:lang w:val="ru-RU"/>
-        </w:rPr>
-        <w:t>- Масштабируемость: способность выдерживать рост числа пользователей и нагрузки.</w:t>
-      </w:r>
-    </w:p>
-    <w:p>
-      <w:pPr>
-        <w:rPr>
-          <w:lang w:val="ru-RU"/>
-        </w:rPr>
-      </w:pPr>
-      <w:r>
-        <w:rPr>
-          <w:lang w:val="ru-RU"/>
-        </w:rPr>
-        <w:t>- Скорость доставки сообщений: среднее и максимальное время доставки.</w:t>
-      </w:r>
-    </w:p>
-    <w:p>
-      <w:pPr>
-        <w:rPr>
-          <w:lang w:val="ru-RU"/>
-        </w:rPr>
-      </w:pPr>
-      <w:r>
-        <w:rPr>
-          <w:lang w:val="ru-RU"/>
-        </w:rPr>
-        <w:t>- Стабильность работы: частота сбоев, время восстановления после сбоев.</w:t>
-      </w:r>
-    </w:p>
-    <w:p>
-      <w:pPr>
-        <w:rPr>
-          <w:lang w:val="ru-RU"/>
-        </w:rPr>
-      </w:pPr>
-      <w:r>
-        <w:rPr>
-          <w:lang w:val="ru-RU"/>
-        </w:rPr>
-        <w:t>2. Безопасность и конфиденциальность</w:t>
-      </w:r>
-    </w:p>
-    <w:p>
-      <w:pPr>
-        <w:rPr>
-          <w:lang w:val="ru-RU"/>
-        </w:rPr>
-      </w:pPr>
-      <w:r>
-        <w:rPr>
-          <w:lang w:val="ru-RU"/>
-        </w:rPr>
+        <w:t>Наглядное сравнение аналогов представлено таблицей 1.</w:t>
+      </w:r>
+    </w:p>
+    <w:p>
+      <w:pPr>
+        <w:pStyle w:val="af4"/>
+        <w:sectPr>
+          <w:footerReference w:type="default" r:id="rId8"/>
+          <w:footerReference w:type="first" r:id="rId9"/>
+          <w:pgSz w:w="11909" w:h="16834"/>
+          <w:pgMar w:top="1133" w:right="850" w:bottom="1133" w:left="1700" w:header="720" w:footer="720" w:gutter="0"/>
+          <w:pgNumType w:start="1"/>
+          <w:cols w:space="720"/>
+          <w:titlePg/>
+        </w:sectPr>
+      </w:pPr>
+    </w:p>
+    <w:p>
+      <w:pPr>
+        <w:pStyle w:val="af4"/>
+      </w:pPr>
+      <w:r>
         <w:lastRenderedPageBreak/>
-        <w:t>- Шифрование: использование E2EE (сквозное шифрование), алгоритмы шифрования (AES, RSA и др.).</w:t>
-      </w:r>
-    </w:p>
-    <w:p>
-      <w:pPr>
-        <w:rPr>
-          <w:lang w:val="ru-RU"/>
-        </w:rPr>
-      </w:pPr>
-      <w:r>
-        <w:rPr>
-          <w:lang w:val="ru-RU"/>
-        </w:rPr>
-        <w:t>- Анонимность: возможность регистрации без номера телефона, поддержка анонимных аккаунтов.</w:t>
-      </w:r>
-    </w:p>
-    <w:p>
-      <w:pPr>
-        <w:rPr>
-          <w:lang w:val="ru-RU"/>
-        </w:rPr>
-      </w:pPr>
-      <w:r>
-        <w:rPr>
-          <w:lang w:val="ru-RU"/>
-        </w:rPr>
-        <w:t>- Хранение данных: где и как хранятся сообщения (локально/на сервере), политика хранения.</w:t>
-      </w:r>
-    </w:p>
-    <w:p>
-      <w:pPr>
-        <w:rPr>
-          <w:lang w:val="ru-RU"/>
-        </w:rPr>
-      </w:pPr>
-      <w:r>
-        <w:rPr>
-          <w:lang w:val="ru-RU"/>
-        </w:rPr>
-        <w:t>- Защита от взлома: механизмы аутентификации, двухфакторная аутентификация, защита от фишинга.</w:t>
-      </w:r>
-    </w:p>
-    <w:p>
-      <w:pPr>
-        <w:rPr>
-          <w:lang w:val="ru-RU"/>
-        </w:rPr>
-      </w:pPr>
-      <w:r>
-        <w:rPr>
-          <w:lang w:val="ru-RU"/>
-        </w:rPr>
-        <w:t>3. Функциональность</w:t>
-      </w:r>
-    </w:p>
-    <w:p>
-      <w:pPr>
-        <w:rPr>
-          <w:lang w:val="ru-RU"/>
-        </w:rPr>
-      </w:pPr>
-    </w:p>
-    <w:p>
-      <w:pPr>
-        <w:rPr>
-          <w:lang w:val="ru-RU"/>
-        </w:rPr>
-      </w:pPr>
-      <w:r>
-        <w:rPr>
-          <w:lang w:val="ru-RU"/>
-        </w:rPr>
-        <w:t>- Базовые возможности: чаты (групповые, личные), голосовые и видеозвонки, обмен файлами.</w:t>
-      </w:r>
-    </w:p>
-    <w:p>
-      <w:pPr>
-        <w:rPr>
-          <w:lang w:val="ru-RU"/>
-        </w:rPr>
-      </w:pPr>
-      <w:r>
-        <w:rPr>
-          <w:lang w:val="ru-RU"/>
-        </w:rPr>
-        <w:t>- **Расширенные функции:* каналы*, боты, интеграции с внешними сервисами, инструменты для бизнеса (платежи, рассылки).</w:t>
-      </w:r>
-    </w:p>
-    <w:p>
-      <w:pPr>
-        <w:rPr>
-          <w:lang w:val="ru-RU"/>
-        </w:rPr>
-      </w:pPr>
-      <w:r>
-        <w:rPr>
-          <w:lang w:val="ru-RU"/>
-        </w:rPr>
-        <w:t>- Потребление контента: поддержка медиафайлов, ленты новостей, интеграция с социальными сетями.</w:t>
-      </w:r>
-    </w:p>
-    <w:p>
-      <w:pPr>
-        <w:rPr>
-          <w:lang w:val="ru-RU"/>
-        </w:rPr>
-      </w:pPr>
-      <w:r>
-        <w:rPr>
-          <w:lang w:val="ru-RU"/>
-        </w:rPr>
-        <w:t>- Настройка интерфейса: темы, кастомизация, доступность для людей с ограниченными возможностями.</w:t>
-      </w:r>
-    </w:p>
-    <w:p>
-      <w:pPr>
-        <w:rPr>
-          <w:lang w:val="ru-RU"/>
-        </w:rPr>
-      </w:pPr>
-      <w:r>
-        <w:rPr>
-          <w:lang w:val="ru-RU"/>
-        </w:rPr>
-        <w:t>4. Пользовательский опыт (UX/UI)</w:t>
-      </w:r>
-    </w:p>
-    <w:p>
-      <w:pPr>
-        <w:rPr>
-          <w:lang w:val="ru-RU"/>
-        </w:rPr>
-      </w:pPr>
-      <w:r>
-        <w:rPr>
-          <w:lang w:val="ru-RU"/>
-        </w:rPr>
-        <w:t>- Удобство интерфейса: интуитивность, скорость работы, адаптивность.</w:t>
-      </w:r>
-    </w:p>
-    <w:p>
-      <w:pPr>
-        <w:rPr>
-          <w:lang w:val="ru-RU"/>
-        </w:rPr>
-      </w:pPr>
-      <w:r>
-        <w:rPr>
-          <w:lang w:val="ru-RU"/>
-        </w:rPr>
-        <w:t>- Локализация: поддержка русского языка и региональных особенностей.</w:t>
-      </w:r>
-    </w:p>
-    <w:p>
-      <w:pPr>
-        <w:rPr>
-          <w:lang w:val="ru-RU"/>
-        </w:rPr>
-      </w:pPr>
-      <w:r>
-        <w:rPr>
-          <w:lang w:val="ru-RU"/>
-        </w:rPr>
-        <w:t>- Обратная связь: наличие поддержки, скорость ответа на обращения.</w:t>
-      </w:r>
-    </w:p>
-    <w:p>
-      <w:pPr>
-        <w:rPr>
-          <w:lang w:val="ru-RU"/>
-        </w:rPr>
-      </w:pPr>
-      <w:r>
-        <w:rPr>
-          <w:lang w:val="ru-RU"/>
-        </w:rPr>
-        <w:t>5. Экосистема и интеграции</w:t>
-      </w:r>
-    </w:p>
-    <w:p>
-      <w:pPr>
-        <w:rPr>
-          <w:lang w:val="ru-RU"/>
-        </w:rPr>
-      </w:pPr>
-      <w:r>
-        <w:rPr>
-          <w:lang w:val="ru-RU"/>
-        </w:rPr>
-        <w:t>- API и SDK: наличие открытых инструментов для разработчиков.</w:t>
-      </w:r>
-    </w:p>
-    <w:p>
-      <w:pPr>
-        <w:rPr>
-          <w:lang w:val="ru-RU"/>
-        </w:rPr>
-      </w:pPr>
-      <w:r>
-        <w:rPr>
-          <w:lang w:val="ru-RU"/>
-        </w:rPr>
-        <w:t>- Интеграции: с корпоративными системами (CRM, ERP), платежными сервисами, календарями.</w:t>
-      </w:r>
-    </w:p>
-    <w:p>
-      <w:pPr>
-        <w:rPr>
-          <w:lang w:val="ru-RU"/>
-        </w:rPr>
-      </w:pPr>
-      <w:r>
-        <w:rPr>
-          <w:lang w:val="ru-RU"/>
-        </w:rPr>
-        <w:t>- Сообщество: активность пользователей, наличие форумов, каналов поддержки.</w:t>
-      </w:r>
-    </w:p>
-    <w:p>
-      <w:pPr>
-        <w:rPr>
-          <w:lang w:val="ru-RU"/>
-        </w:rPr>
-      </w:pPr>
-      <w:r>
-        <w:rPr>
-          <w:lang w:val="ru-RU"/>
-        </w:rPr>
-        <w:t>6. Экономические и юридические аспекты</w:t>
-      </w:r>
-    </w:p>
-    <w:p>
-      <w:pPr>
-        <w:rPr>
-          <w:lang w:val="ru-RU"/>
-        </w:rPr>
-      </w:pPr>
-      <w:r>
-        <w:rPr>
-          <w:lang w:val="ru-RU"/>
-        </w:rPr>
-        <w:t>- Модель монетизации: платные функции, подписки, реклама.</w:t>
-      </w:r>
-    </w:p>
-    <w:p>
-      <w:pPr>
-        <w:rPr>
-          <w:lang w:val="ru-RU"/>
-        </w:rPr>
-      </w:pPr>
-      <w:r>
-        <w:rPr>
-          <w:lang w:val="ru-RU"/>
-        </w:rPr>
-        <w:t>- Юрисдикция: страна регистрации компании-разработчика, соответствие законодательству РФ.</w:t>
-      </w:r>
-    </w:p>
-    <w:p>
-      <w:pPr>
-        <w:rPr>
-          <w:lang w:val="ru-RU"/>
-        </w:rPr>
-      </w:pPr>
-      <w:r>
-        <w:rPr>
-          <w:lang w:val="ru-RU"/>
-        </w:rPr>
-        <w:t>- Политика конфиденциальности: прозрачность сбора и использования данных.</w:t>
-      </w:r>
+        <w:t>Таблица 1 – Сравнение аналогов</w:t>
+      </w:r>
+    </w:p>
+    <w:tbl>
+      <w:tblPr>
+        <w:tblStyle w:val="a7"/>
+        <w:tblW w:w="0" w:type="auto"/>
+        <w:tblLook w:val="04A0" w:firstRow="1" w:lastRow="0" w:firstColumn="1" w:lastColumn="0" w:noHBand="0" w:noVBand="1"/>
+      </w:tblPr>
+      <w:tblGrid>
+        <w:gridCol w:w="2195"/>
+        <w:gridCol w:w="2071"/>
+        <w:gridCol w:w="2071"/>
+        <w:gridCol w:w="2071"/>
+        <w:gridCol w:w="1834"/>
+        <w:gridCol w:w="2243"/>
+        <w:gridCol w:w="2071"/>
+      </w:tblGrid>
+      <w:tr>
+        <w:tc>
+          <w:tcPr>
+            <w:tcW w:w="1054" w:type="dxa"/>
+          </w:tcPr>
+          <w:p>
+            <w:pPr>
+              <w:pStyle w:val="af5"/>
+            </w:pPr>
+            <w:r>
+              <w:t>Критерии</w:t>
+            </w:r>
+          </w:p>
+        </w:tc>
+        <w:tc>
+          <w:tcPr>
+            <w:tcW w:w="1409" w:type="dxa"/>
+          </w:tcPr>
+          <w:p>
+            <w:pPr>
+              <w:pStyle w:val="af5"/>
+              <w:rPr>
+                <w:lang w:val="en-US"/>
+              </w:rPr>
+            </w:pPr>
+            <w:r>
+              <w:rPr>
+                <w:lang w:val="en-US"/>
+              </w:rPr>
+              <w:t>Telegram</w:t>
+            </w:r>
+          </w:p>
+        </w:tc>
+        <w:tc>
+          <w:tcPr>
+            <w:tcW w:w="1124" w:type="dxa"/>
+          </w:tcPr>
+          <w:p>
+            <w:pPr>
+              <w:pStyle w:val="af5"/>
+              <w:rPr>
+                <w:lang w:val="en-US"/>
+              </w:rPr>
+            </w:pPr>
+            <w:proofErr w:type="spellStart"/>
+            <w:r>
+              <w:rPr>
+                <w:lang w:val="en-US"/>
+              </w:rPr>
+              <w:t>Whatsapp</w:t>
+            </w:r>
+            <w:proofErr w:type="spellEnd"/>
+          </w:p>
+        </w:tc>
+        <w:tc>
+          <w:tcPr>
+            <w:tcW w:w="1409" w:type="dxa"/>
+          </w:tcPr>
+          <w:p>
+            <w:pPr>
+              <w:pStyle w:val="af5"/>
+            </w:pPr>
+            <w:r>
+              <w:rPr>
+                <w:lang w:val="en-US"/>
+              </w:rPr>
+              <w:t xml:space="preserve">VK </w:t>
+            </w:r>
+            <w:r>
+              <w:t>Мессенджер</w:t>
+            </w:r>
+          </w:p>
+        </w:tc>
+        <w:tc>
+          <w:tcPr>
+            <w:tcW w:w="1431" w:type="dxa"/>
+          </w:tcPr>
+          <w:p>
+            <w:pPr>
+              <w:pStyle w:val="af5"/>
+              <w:rPr>
+                <w:lang w:val="en-US"/>
+              </w:rPr>
+            </w:pPr>
+            <w:proofErr w:type="spellStart"/>
+            <w:r>
+              <w:rPr>
+                <w:lang w:val="en-US"/>
+              </w:rPr>
+              <w:t>XChat</w:t>
+            </w:r>
+            <w:proofErr w:type="spellEnd"/>
+          </w:p>
+        </w:tc>
+        <w:tc>
+          <w:tcPr>
+            <w:tcW w:w="1738" w:type="dxa"/>
+          </w:tcPr>
+          <w:p>
+            <w:pPr>
+              <w:pStyle w:val="af5"/>
+              <w:rPr>
+                <w:lang w:val="en-US"/>
+              </w:rPr>
+            </w:pPr>
+            <w:r>
+              <w:rPr>
+                <w:lang w:val="en-US"/>
+              </w:rPr>
+              <w:t>Signal</w:t>
+            </w:r>
+          </w:p>
+        </w:tc>
+        <w:tc>
+          <w:tcPr>
+            <w:tcW w:w="1184" w:type="dxa"/>
+          </w:tcPr>
+          <w:p>
+            <w:pPr>
+              <w:pStyle w:val="af5"/>
+              <w:rPr>
+                <w:lang w:val="en-US"/>
+              </w:rPr>
+            </w:pPr>
+            <w:proofErr w:type="spellStart"/>
+            <w:r>
+              <w:rPr>
+                <w:lang w:val="en-US"/>
+              </w:rPr>
+              <w:t>YouGile</w:t>
+            </w:r>
+            <w:proofErr w:type="spellEnd"/>
+          </w:p>
+        </w:tc>
+      </w:tr>
+      <w:tr>
+        <w:tc>
+          <w:tcPr>
+            <w:tcW w:w="1054" w:type="dxa"/>
+          </w:tcPr>
+          <w:p>
+            <w:pPr>
+              <w:pStyle w:val="af5"/>
+            </w:pPr>
+            <w:r>
+              <w:t>Безопасность</w:t>
+            </w:r>
+          </w:p>
+        </w:tc>
+        <w:tc>
+          <w:tcPr>
+            <w:tcW w:w="1409" w:type="dxa"/>
+          </w:tcPr>
+          <w:p>
+            <w:pPr>
+              <w:pStyle w:val="af5"/>
+            </w:pPr>
+            <w:r>
+              <w:rPr>
+                <w:lang w:val="en-US"/>
+              </w:rPr>
+              <w:t>E</w:t>
+            </w:r>
+            <w:r>
+              <w:t>2</w:t>
+            </w:r>
+            <w:r>
+              <w:rPr>
+                <w:lang w:val="en-US"/>
+              </w:rPr>
+              <w:t>E</w:t>
+            </w:r>
+            <w:r>
+              <w:t xml:space="preserve"> (</w:t>
+            </w:r>
+            <w:r>
+              <w:t>при соблюдении условий</w:t>
+            </w:r>
+            <w:r>
+              <w:t>)</w:t>
+            </w:r>
+            <w:r>
+              <w:t xml:space="preserve">. </w:t>
+            </w:r>
+            <w:r>
+              <w:t>Централизованные серверы.</w:t>
+            </w:r>
+            <w:r>
+              <w:t xml:space="preserve"> </w:t>
+            </w:r>
+            <w:r>
+              <w:rPr>
+                <w:lang w:val="ru"/>
+              </w:rPr>
+              <w:t>Возможен сбор метаданных.</w:t>
+            </w:r>
+          </w:p>
+        </w:tc>
+        <w:tc>
+          <w:tcPr>
+            <w:tcW w:w="1124" w:type="dxa"/>
+          </w:tcPr>
+          <w:p>
+            <w:pPr>
+              <w:pStyle w:val="af5"/>
+            </w:pPr>
+            <w:r>
+              <w:rPr>
+                <w:lang w:val="en-US"/>
+              </w:rPr>
+              <w:t>E</w:t>
+            </w:r>
+            <w:r>
+              <w:t>2</w:t>
+            </w:r>
+            <w:r>
+              <w:rPr>
+                <w:lang w:val="en-US"/>
+              </w:rPr>
+              <w:t>E</w:t>
+            </w:r>
+            <w:r>
+              <w:t xml:space="preserve">. </w:t>
+            </w:r>
+            <w:r>
+              <w:t>Сохраняет метаданные, резервные копии в облаке.</w:t>
+            </w:r>
+          </w:p>
+        </w:tc>
+        <w:tc>
+          <w:tcPr>
+            <w:tcW w:w="1409" w:type="dxa"/>
+          </w:tcPr>
+          <w:p>
+            <w:pPr>
+              <w:pStyle w:val="af5"/>
+            </w:pPr>
+            <w:r>
+              <w:t xml:space="preserve">Присутствие шифрования не упоминается. </w:t>
+            </w:r>
+            <w:r>
+              <w:t>Централизованные серверы. Данные хранятся в РФ.</w:t>
+            </w:r>
+          </w:p>
+        </w:tc>
+        <w:tc>
+          <w:tcPr>
+            <w:tcW w:w="1431" w:type="dxa"/>
+          </w:tcPr>
+          <w:p>
+            <w:pPr>
+              <w:pStyle w:val="af5"/>
+            </w:pPr>
+            <w:r>
+              <w:rPr>
+                <w:lang w:val="en-US"/>
+              </w:rPr>
+              <w:t>E</w:t>
+            </w:r>
+            <w:r>
+              <w:t>2</w:t>
+            </w:r>
+            <w:r>
+              <w:rPr>
+                <w:lang w:val="en-US"/>
+              </w:rPr>
+              <w:t>E</w:t>
+            </w:r>
+            <w:r>
+              <w:t xml:space="preserve"> (</w:t>
+            </w:r>
+            <w:r>
+              <w:t>при соблюдении условий</w:t>
+            </w:r>
+            <w:r>
+              <w:t xml:space="preserve">). </w:t>
+            </w:r>
+            <w:r>
+              <w:t>Возможен сбор метаданных</w:t>
+            </w:r>
+          </w:p>
+        </w:tc>
+        <w:tc>
+          <w:tcPr>
+            <w:tcW w:w="1738" w:type="dxa"/>
+          </w:tcPr>
+          <w:p>
+            <w:pPr>
+              <w:pStyle w:val="af5"/>
+            </w:pPr>
+            <w:r>
+              <w:rPr>
+                <w:lang w:val="en-US"/>
+              </w:rPr>
+              <w:t>E</w:t>
+            </w:r>
+            <w:r>
+              <w:t>2</w:t>
+            </w:r>
+            <w:r>
+              <w:rPr>
+                <w:lang w:val="en-US"/>
+              </w:rPr>
+              <w:t>E</w:t>
+            </w:r>
+            <w:r>
+              <w:t xml:space="preserve">. </w:t>
+            </w:r>
+            <w:r>
+              <w:rPr>
+                <w:lang w:val="ru"/>
+              </w:rPr>
+              <w:t>Открытый исходный код. Не собирает метаданные.</w:t>
+            </w:r>
+          </w:p>
+        </w:tc>
+        <w:tc>
+          <w:tcPr>
+            <w:tcW w:w="1184" w:type="dxa"/>
+          </w:tcPr>
+          <w:p>
+            <w:pPr>
+              <w:pStyle w:val="af5"/>
+            </w:pPr>
+            <w:r>
+              <w:t xml:space="preserve">Присутствие шифрования не упоминается. </w:t>
+            </w:r>
+            <w:r>
+              <w:t>Данные могут храниться на своих серверах.</w:t>
+            </w:r>
+          </w:p>
+        </w:tc>
+      </w:tr>
+      <w:tr>
+        <w:tc>
+          <w:tcPr>
+            <w:tcW w:w="1054" w:type="dxa"/>
+          </w:tcPr>
+          <w:p>
+            <w:pPr>
+              <w:pStyle w:val="af5"/>
+            </w:pPr>
+            <w:r>
+              <w:t>Функционал</w:t>
+            </w:r>
+          </w:p>
+        </w:tc>
+        <w:tc>
+          <w:tcPr>
+            <w:tcW w:w="1409" w:type="dxa"/>
+          </w:tcPr>
+          <w:p>
+            <w:pPr>
+              <w:pStyle w:val="af5"/>
+            </w:pPr>
+            <w:r>
+              <w:t>Чаты, каналы, боты, групповые звонки, передача файлов до 2 ГБ, облачная синхронизация.</w:t>
+            </w:r>
+          </w:p>
+        </w:tc>
+        <w:tc>
+          <w:tcPr>
+            <w:tcW w:w="1124" w:type="dxa"/>
+          </w:tcPr>
+          <w:p>
+            <w:pPr>
+              <w:pStyle w:val="af5"/>
+            </w:pPr>
+            <w:r>
+              <w:rPr>
+                <w:lang w:val="ru"/>
+              </w:rPr>
+              <w:t xml:space="preserve">Чаты, групповые звонки, </w:t>
+            </w:r>
+            <w:proofErr w:type="spellStart"/>
+            <w:r>
+              <w:rPr>
+                <w:lang w:val="ru"/>
+              </w:rPr>
+              <w:t>автоудаление</w:t>
+            </w:r>
+            <w:proofErr w:type="spellEnd"/>
+            <w:r>
+              <w:rPr>
+                <w:lang w:val="ru"/>
+              </w:rPr>
+              <w:t xml:space="preserve"> сообщений.</w:t>
+            </w:r>
+          </w:p>
+        </w:tc>
+        <w:tc>
+          <w:tcPr>
+            <w:tcW w:w="1409" w:type="dxa"/>
+          </w:tcPr>
+          <w:p>
+            <w:pPr>
+              <w:pStyle w:val="af5"/>
+            </w:pPr>
+            <w:r>
+              <w:rPr>
+                <w:lang w:val="ru"/>
+              </w:rPr>
+              <w:t xml:space="preserve">Чаты, групповые чаты, видеозвонки, каналы, интеграция с VK </w:t>
+            </w:r>
+            <w:proofErr w:type="spellStart"/>
+            <w:r>
+              <w:rPr>
+                <w:lang w:val="ru"/>
+              </w:rPr>
+              <w:t>WorkSpace</w:t>
+            </w:r>
+            <w:proofErr w:type="spellEnd"/>
+            <w:r>
+              <w:rPr>
+                <w:lang w:val="ru"/>
+              </w:rPr>
+              <w:t>.</w:t>
+            </w:r>
+          </w:p>
+        </w:tc>
+        <w:tc>
+          <w:tcPr>
+            <w:tcW w:w="1431" w:type="dxa"/>
+          </w:tcPr>
+          <w:p>
+            <w:pPr>
+              <w:pStyle w:val="af5"/>
+            </w:pPr>
+            <w:r>
+              <w:rPr>
+                <w:lang w:val="ru"/>
+              </w:rPr>
+              <w:t>Чаты, звонки</w:t>
+            </w:r>
+            <w:r>
+              <w:rPr>
+                <w:lang w:val="ru"/>
+              </w:rPr>
+              <w:t xml:space="preserve">, </w:t>
+            </w:r>
+            <w:r>
+              <w:rPr>
+                <w:lang w:val="ru"/>
+              </w:rPr>
+              <w:t>фокус на приватности.</w:t>
+            </w:r>
+          </w:p>
+        </w:tc>
+        <w:tc>
+          <w:tcPr>
+            <w:tcW w:w="1738" w:type="dxa"/>
+          </w:tcPr>
+          <w:p>
+            <w:pPr>
+              <w:pStyle w:val="af5"/>
+            </w:pPr>
+            <w:r>
+              <w:rPr>
+                <w:lang w:val="ru"/>
+              </w:rPr>
+              <w:t>Чаты, голосовые/видеозвонки, а</w:t>
+            </w:r>
+            <w:proofErr w:type="spellStart"/>
+            <w:r>
+              <w:rPr>
+                <w:lang w:val="ru"/>
+              </w:rPr>
+              <w:t>втоудаление</w:t>
+            </w:r>
+            <w:proofErr w:type="spellEnd"/>
+            <w:r>
+              <w:rPr>
+                <w:lang w:val="ru"/>
+              </w:rPr>
+              <w:t xml:space="preserve"> сообщений.</w:t>
+            </w:r>
+          </w:p>
+        </w:tc>
+        <w:tc>
+          <w:tcPr>
+            <w:tcW w:w="1184" w:type="dxa"/>
+          </w:tcPr>
+          <w:p>
+            <w:pPr>
+              <w:pStyle w:val="af5"/>
+            </w:pPr>
+            <w:r>
+              <w:rPr>
+                <w:lang w:val="ru"/>
+              </w:rPr>
+              <w:t>Чаты внутри задач, групповые чаты, голосовые сообщения с расшифровкой, запись экрана.</w:t>
+            </w:r>
+          </w:p>
+        </w:tc>
+      </w:tr>
+      <w:tr>
+        <w:tc>
+          <w:tcPr>
+            <w:tcW w:w="1054" w:type="dxa"/>
+          </w:tcPr>
+          <w:p>
+            <w:pPr>
+              <w:pStyle w:val="af5"/>
+            </w:pPr>
+            <w:r>
+              <w:t>Интерфейс</w:t>
+            </w:r>
+          </w:p>
+        </w:tc>
+        <w:tc>
+          <w:tcPr>
+            <w:tcW w:w="1409" w:type="dxa"/>
+          </w:tcPr>
+          <w:p>
+            <w:pPr>
+              <w:pStyle w:val="af5"/>
+            </w:pPr>
+            <w:r>
+              <w:rPr>
+                <w:lang w:val="ru"/>
+              </w:rPr>
+              <w:t>Современный интерфейс, высокая скорость работы.</w:t>
+            </w:r>
+          </w:p>
+        </w:tc>
+        <w:tc>
+          <w:tcPr>
+            <w:tcW w:w="1124" w:type="dxa"/>
+          </w:tcPr>
+          <w:p>
+            <w:pPr>
+              <w:pStyle w:val="af5"/>
+            </w:pPr>
+            <w:r>
+              <w:rPr>
+                <w:lang w:val="ru"/>
+              </w:rPr>
+              <w:t>Простой интерфейс, привычен массовому пользователю.</w:t>
+            </w:r>
+          </w:p>
+        </w:tc>
+        <w:tc>
+          <w:tcPr>
+            <w:tcW w:w="1409" w:type="dxa"/>
+          </w:tcPr>
+          <w:p>
+            <w:pPr>
+              <w:pStyle w:val="af5"/>
+            </w:pPr>
+            <w:r>
+              <w:rPr>
+                <w:lang w:val="ru"/>
+              </w:rPr>
+              <w:t>Привычный для пользователей VK интерфейс.</w:t>
+            </w:r>
+          </w:p>
+        </w:tc>
+        <w:tc>
+          <w:tcPr>
+            <w:tcW w:w="1431" w:type="dxa"/>
+          </w:tcPr>
+          <w:p>
+            <w:pPr>
+              <w:pStyle w:val="af5"/>
+            </w:pPr>
+            <w:r>
+              <w:rPr>
+                <w:lang w:val="ru"/>
+              </w:rPr>
+              <w:t>Минималистичный интерфейс.</w:t>
+            </w:r>
+          </w:p>
+        </w:tc>
+        <w:tc>
+          <w:tcPr>
+            <w:tcW w:w="1738" w:type="dxa"/>
+          </w:tcPr>
+          <w:p>
+            <w:pPr>
+              <w:pStyle w:val="af5"/>
+            </w:pPr>
+            <w:r>
+              <w:rPr>
+                <w:lang w:val="ru"/>
+              </w:rPr>
+              <w:t>Минималистичный интерфейс, простота.</w:t>
+            </w:r>
+          </w:p>
+        </w:tc>
+        <w:tc>
+          <w:tcPr>
+            <w:tcW w:w="1184" w:type="dxa"/>
+          </w:tcPr>
+          <w:p>
+            <w:pPr>
+              <w:pStyle w:val="af5"/>
+            </w:pPr>
+            <w:r>
+              <w:rPr>
+                <w:lang w:val="ru"/>
+              </w:rPr>
+              <w:t xml:space="preserve">Интерфейс похож на </w:t>
+            </w:r>
+            <w:proofErr w:type="spellStart"/>
+            <w:r>
+              <w:rPr>
+                <w:lang w:val="ru"/>
+              </w:rPr>
+              <w:t>Telegram</w:t>
+            </w:r>
+            <w:proofErr w:type="spellEnd"/>
+            <w:r>
+              <w:rPr>
+                <w:lang w:val="ru"/>
+              </w:rPr>
+              <w:t>, удобен для работы с задачами.</w:t>
+            </w:r>
+          </w:p>
+        </w:tc>
+      </w:tr>
+      <w:tr>
+        <w:tc>
+          <w:tcPr>
+            <w:tcW w:w="1054" w:type="dxa"/>
+          </w:tcPr>
+          <w:p>
+            <w:pPr>
+              <w:pStyle w:val="af5"/>
+            </w:pPr>
+            <w:r>
+              <w:t>Интеграция</w:t>
+            </w:r>
+          </w:p>
+        </w:tc>
+        <w:tc>
+          <w:tcPr>
+            <w:tcW w:w="1409" w:type="dxa"/>
+          </w:tcPr>
+          <w:p>
+            <w:pPr>
+              <w:pStyle w:val="af5"/>
+            </w:pPr>
+            <w:r>
+              <w:t>Боты, API, интеграции с внешними сервисами</w:t>
+            </w:r>
+            <w:r>
+              <w:t>.</w:t>
+            </w:r>
+          </w:p>
+        </w:tc>
+        <w:tc>
+          <w:tcPr>
+            <w:tcW w:w="1124" w:type="dxa"/>
+          </w:tcPr>
+          <w:p>
+            <w:pPr>
+              <w:pStyle w:val="af5"/>
+            </w:pPr>
+            <w:r>
+              <w:rPr>
+                <w:lang w:val="ru"/>
+              </w:rPr>
+              <w:t>Интеграции через Business API.</w:t>
+            </w:r>
+          </w:p>
+          <w:p>
+            <w:pPr>
+              <w:rPr>
+                <w:lang w:val="ru-RU"/>
+              </w:rPr>
+            </w:pPr>
+          </w:p>
+        </w:tc>
+        <w:tc>
+          <w:tcPr>
+            <w:tcW w:w="1409" w:type="dxa"/>
+          </w:tcPr>
+          <w:p>
+            <w:pPr>
+              <w:pStyle w:val="af5"/>
+            </w:pPr>
+            <w:r>
+              <w:rPr>
+                <w:lang w:val="ru"/>
+              </w:rPr>
+              <w:t>Интеграция с экосистемой VK (почта, календарь, документы).</w:t>
+            </w:r>
+          </w:p>
+        </w:tc>
+        <w:tc>
+          <w:tcPr>
+            <w:tcW w:w="1431" w:type="dxa"/>
+          </w:tcPr>
+          <w:p>
+            <w:pPr>
+              <w:pStyle w:val="af5"/>
+            </w:pPr>
+            <w:r>
+              <w:t>Не упоминается.</w:t>
+            </w:r>
+          </w:p>
+          <w:p>
+            <w:pPr>
+              <w:rPr>
+                <w:lang w:val="ru-RU"/>
+              </w:rPr>
+            </w:pPr>
+          </w:p>
+        </w:tc>
+        <w:tc>
+          <w:tcPr>
+            <w:tcW w:w="1738" w:type="dxa"/>
+          </w:tcPr>
+          <w:p>
+            <w:pPr>
+              <w:pStyle w:val="af5"/>
+            </w:pPr>
+            <w:r>
+              <w:t>Не упоминается.</w:t>
+            </w:r>
+          </w:p>
+          <w:p>
+            <w:pPr>
+              <w:rPr>
+                <w:lang w:val="ru-RU"/>
+              </w:rPr>
+            </w:pPr>
+          </w:p>
+        </w:tc>
+        <w:tc>
+          <w:tcPr>
+            <w:tcW w:w="1184" w:type="dxa"/>
+          </w:tcPr>
+          <w:p>
+            <w:pPr>
+              <w:pStyle w:val="af5"/>
+            </w:pPr>
+            <w:r>
+              <w:rPr>
+                <w:lang w:val="ru"/>
+              </w:rPr>
+              <w:t xml:space="preserve">Интеграция с </w:t>
+            </w:r>
+            <w:proofErr w:type="spellStart"/>
+            <w:r>
+              <w:rPr>
+                <w:lang w:val="ru"/>
+              </w:rPr>
+              <w:t>таск</w:t>
+            </w:r>
+            <w:proofErr w:type="spellEnd"/>
+            <w:r>
+              <w:rPr>
+                <w:lang w:val="ru"/>
+              </w:rPr>
+              <w:t>-трекером и CRM.</w:t>
+            </w:r>
+          </w:p>
+        </w:tc>
+      </w:tr>
+      <w:tr>
+        <w:tc>
+          <w:tcPr>
+            <w:tcW w:w="1054" w:type="dxa"/>
+          </w:tcPr>
+          <w:p>
+            <w:pPr>
+              <w:pStyle w:val="af5"/>
+            </w:pPr>
+            <w:r>
+              <w:t>Доступность</w:t>
+            </w:r>
+          </w:p>
+        </w:tc>
+        <w:tc>
+          <w:tcPr>
+            <w:tcW w:w="1409" w:type="dxa"/>
+          </w:tcPr>
+          <w:p>
+            <w:pPr>
+              <w:pStyle w:val="af5"/>
+            </w:pPr>
+            <w:r>
+              <w:t xml:space="preserve">Заблокирован на территории РФ. Доступен через </w:t>
+            </w:r>
+            <w:r>
+              <w:rPr>
+                <w:lang w:val="en-US"/>
+              </w:rPr>
+              <w:t>VPN</w:t>
+            </w:r>
+            <w:r>
+              <w:t xml:space="preserve"> </w:t>
+            </w:r>
+            <w:r>
+              <w:t>или прокси-сервера.</w:t>
+            </w:r>
+          </w:p>
+        </w:tc>
+        <w:tc>
+          <w:tcPr>
+            <w:tcW w:w="1124" w:type="dxa"/>
+          </w:tcPr>
+          <w:p>
+            <w:pPr>
+              <w:pStyle w:val="af5"/>
+            </w:pPr>
+            <w:r>
+              <w:t xml:space="preserve">Заблокирован на территории РФ. Доступен через </w:t>
+            </w:r>
+            <w:r>
+              <w:rPr>
+                <w:lang w:val="en-US"/>
+              </w:rPr>
+              <w:t>VPN</w:t>
+            </w:r>
+            <w:r>
+              <w:t>.</w:t>
+            </w:r>
+          </w:p>
+        </w:tc>
+        <w:tc>
+          <w:tcPr>
+            <w:tcW w:w="1409" w:type="dxa"/>
+          </w:tcPr>
+          <w:p>
+            <w:pPr>
+              <w:pStyle w:val="af5"/>
+            </w:pPr>
+            <w:r>
+              <w:t>Доступен на территории РФ.</w:t>
+            </w:r>
+          </w:p>
+          <w:p>
+            <w:pPr>
+              <w:rPr>
+                <w:lang w:val="ru-RU"/>
+              </w:rPr>
+            </w:pPr>
+          </w:p>
+          <w:p>
+            <w:pPr>
+              <w:rPr>
+                <w:lang w:val="ru-RU"/>
+              </w:rPr>
+            </w:pPr>
+          </w:p>
+          <w:p>
+            <w:pPr>
+              <w:rPr>
+                <w:lang w:val="ru-RU"/>
+              </w:rPr>
+            </w:pPr>
+          </w:p>
+          <w:p>
+            <w:pPr>
+              <w:rPr>
+                <w:lang w:val="ru-RU"/>
+              </w:rPr>
+            </w:pPr>
+          </w:p>
+          <w:p>
+            <w:pPr>
+              <w:rPr>
+                <w:lang w:val="ru-RU"/>
+              </w:rPr>
+            </w:pPr>
+          </w:p>
+        </w:tc>
+        <w:tc>
+          <w:tcPr>
+            <w:tcW w:w="1431" w:type="dxa"/>
+          </w:tcPr>
+          <w:p>
+            <w:pPr>
+              <w:pStyle w:val="af5"/>
+            </w:pPr>
+            <w:r>
+              <w:t xml:space="preserve">Заблокирован на территории РФ. Доступен через </w:t>
+            </w:r>
+            <w:r>
+              <w:rPr>
+                <w:lang w:val="en-US"/>
+              </w:rPr>
+              <w:t>VPN</w:t>
+            </w:r>
+            <w:r>
+              <w:t>.</w:t>
+            </w:r>
+          </w:p>
+        </w:tc>
+        <w:tc>
+          <w:tcPr>
+            <w:tcW w:w="1738" w:type="dxa"/>
+          </w:tcPr>
+          <w:p>
+            <w:pPr>
+              <w:pStyle w:val="af5"/>
+            </w:pPr>
+            <w:r>
+              <w:t xml:space="preserve">Заблокирован на территории РФ. Доступен через </w:t>
+            </w:r>
+            <w:r>
+              <w:rPr>
+                <w:lang w:val="en-US"/>
+              </w:rPr>
+              <w:t>VPN</w:t>
+            </w:r>
+            <w:r>
+              <w:t>.</w:t>
+            </w:r>
+          </w:p>
+        </w:tc>
+        <w:tc>
+          <w:tcPr>
+            <w:tcW w:w="1184" w:type="dxa"/>
+          </w:tcPr>
+          <w:p>
+            <w:pPr>
+              <w:pStyle w:val="af5"/>
+            </w:pPr>
+            <w:r>
+              <w:t>Доступен на территории РФ.</w:t>
+            </w:r>
+          </w:p>
+        </w:tc>
+      </w:tr>
+      <w:tr>
+        <w:tc>
+          <w:tcPr>
+            <w:tcW w:w="1054" w:type="dxa"/>
+          </w:tcPr>
+          <w:p>
+            <w:pPr>
+              <w:pStyle w:val="af5"/>
+            </w:pPr>
+            <w:r>
+              <w:t>Кроссплатформенность</w:t>
+            </w:r>
+          </w:p>
+        </w:tc>
+        <w:tc>
+          <w:tcPr>
+            <w:tcW w:w="1409" w:type="dxa"/>
+          </w:tcPr>
+          <w:p>
+            <w:pPr>
+              <w:pStyle w:val="af5"/>
+            </w:pPr>
+            <w:r>
+              <w:t>Кроссплатформенный</w:t>
+            </w:r>
+          </w:p>
+        </w:tc>
+        <w:tc>
+          <w:tcPr>
+            <w:tcW w:w="1124" w:type="dxa"/>
+          </w:tcPr>
+          <w:p>
+            <w:pPr>
+              <w:pStyle w:val="af5"/>
+            </w:pPr>
+            <w:r>
+              <w:t>Кроссплатформенный</w:t>
+            </w:r>
+          </w:p>
+        </w:tc>
+        <w:tc>
+          <w:tcPr>
+            <w:tcW w:w="1409" w:type="dxa"/>
+          </w:tcPr>
+          <w:p>
+            <w:pPr>
+              <w:pStyle w:val="af5"/>
+            </w:pPr>
+            <w:r>
+              <w:t>Кроссплатформенный</w:t>
+            </w:r>
+          </w:p>
+        </w:tc>
+        <w:tc>
+          <w:tcPr>
+            <w:tcW w:w="1431" w:type="dxa"/>
+          </w:tcPr>
+          <w:p>
+            <w:pPr>
+              <w:pStyle w:val="af5"/>
+              <w:rPr>
+                <w:lang w:val="en-US"/>
+              </w:rPr>
+            </w:pPr>
+            <w:r>
+              <w:rPr>
+                <w:lang w:val="en-US"/>
+              </w:rPr>
+              <w:t>iOS, MacOS</w:t>
+            </w:r>
+          </w:p>
+        </w:tc>
+        <w:tc>
+          <w:tcPr>
+            <w:tcW w:w="1738" w:type="dxa"/>
+          </w:tcPr>
+          <w:p>
+            <w:pPr>
+              <w:pStyle w:val="af5"/>
+            </w:pPr>
+            <w:r>
+              <w:t>Кроссплатформенный</w:t>
+            </w:r>
+          </w:p>
+        </w:tc>
+        <w:tc>
+          <w:tcPr>
+            <w:tcW w:w="1184" w:type="dxa"/>
+          </w:tcPr>
+          <w:p>
+            <w:pPr>
+              <w:pStyle w:val="af5"/>
+            </w:pPr>
+            <w:r>
+              <w:t>Кроссплатформенный</w:t>
+            </w:r>
+          </w:p>
+        </w:tc>
+      </w:tr>
+      <w:tr>
+        <w:tc>
+          <w:tcPr>
+            <w:tcW w:w="1054" w:type="dxa"/>
+          </w:tcPr>
+          <w:p>
+            <w:pPr>
+              <w:pStyle w:val="af5"/>
+            </w:pPr>
+            <w:r>
+              <w:lastRenderedPageBreak/>
+              <w:t>Особенности</w:t>
+            </w:r>
+          </w:p>
+        </w:tc>
+        <w:tc>
+          <w:tcPr>
+            <w:tcW w:w="1409" w:type="dxa"/>
+          </w:tcPr>
+          <w:p>
+            <w:pPr>
+              <w:pStyle w:val="af5"/>
+            </w:pPr>
+            <w:r>
+              <w:t>Открытый исходный код клиентов</w:t>
+            </w:r>
+            <w:r>
+              <w:t>;</w:t>
+            </w:r>
+            <w:r>
+              <w:t xml:space="preserve"> </w:t>
+            </w:r>
+            <w:r>
+              <w:rPr>
+                <w:lang w:val="en-US"/>
+              </w:rPr>
+              <w:t>Telegram</w:t>
+            </w:r>
+            <w:r>
+              <w:t xml:space="preserve"> </w:t>
+            </w:r>
+            <w:r>
+              <w:rPr>
+                <w:lang w:val="en-US"/>
+              </w:rPr>
+              <w:t>API</w:t>
+            </w:r>
+            <w:r>
+              <w:t xml:space="preserve">; </w:t>
+            </w:r>
+            <w:proofErr w:type="spellStart"/>
+            <w:r>
+              <w:rPr>
+                <w:lang w:val="en-US"/>
+              </w:rPr>
+              <w:t>MTProto</w:t>
+            </w:r>
+            <w:proofErr w:type="spellEnd"/>
+            <w:r>
+              <w:t>.</w:t>
+            </w:r>
+          </w:p>
+        </w:tc>
+        <w:tc>
+          <w:tcPr>
+            <w:tcW w:w="1124" w:type="dxa"/>
+          </w:tcPr>
+          <w:p>
+            <w:pPr>
+              <w:pStyle w:val="af5"/>
+            </w:pPr>
+            <w:r>
+              <w:t>Нужно синхронизировать данные пользователя на новом устройстве.</w:t>
+            </w:r>
+          </w:p>
+        </w:tc>
+        <w:tc>
+          <w:tcPr>
+            <w:tcW w:w="1409" w:type="dxa"/>
+          </w:tcPr>
+          <w:p>
+            <w:pPr>
+              <w:pStyle w:val="af5"/>
+            </w:pPr>
+            <w:r>
+              <w:rPr>
+                <w:lang w:val="ru"/>
+              </w:rPr>
+              <w:t>Подходит для корпоративного общения</w:t>
+            </w:r>
+            <w:r>
+              <w:t>;</w:t>
+            </w:r>
+            <w:r>
+              <w:rPr>
+                <w:lang w:val="ru"/>
+              </w:rPr>
+              <w:t xml:space="preserve"> </w:t>
+            </w:r>
+            <w:r>
+              <w:t>в</w:t>
+            </w:r>
+            <w:proofErr w:type="spellStart"/>
+            <w:r>
+              <w:rPr>
+                <w:lang w:val="ru"/>
+              </w:rPr>
+              <w:t>ысокая</w:t>
+            </w:r>
+            <w:proofErr w:type="spellEnd"/>
+            <w:r>
+              <w:rPr>
+                <w:lang w:val="ru"/>
+              </w:rPr>
+              <w:t xml:space="preserve"> интеграция с экосистемой </w:t>
+            </w:r>
+            <w:r>
+              <w:rPr>
+                <w:lang w:val="en-US"/>
+              </w:rPr>
+              <w:t>VK</w:t>
+            </w:r>
+            <w:r>
+              <w:t>.</w:t>
+            </w:r>
+          </w:p>
+        </w:tc>
+        <w:tc>
+          <w:tcPr>
+            <w:tcW w:w="1431" w:type="dxa"/>
+          </w:tcPr>
+          <w:p>
+            <w:pPr>
+              <w:pStyle w:val="af5"/>
+            </w:pPr>
+            <w:r>
+              <w:rPr>
+                <w:lang w:val="ru"/>
+              </w:rPr>
+              <w:t>Акцент</w:t>
+            </w:r>
+            <w:r>
+              <w:rPr>
+                <w:lang w:val="ru"/>
+              </w:rPr>
+              <w:t xml:space="preserve"> на анонимность и защиту от перехвата</w:t>
+            </w:r>
+            <w:r>
+              <w:t xml:space="preserve">; </w:t>
+            </w:r>
+            <w:r>
+              <w:t xml:space="preserve">дополнение к соцсети </w:t>
+            </w:r>
+            <w:r>
+              <w:rPr>
+                <w:lang w:val="en-US"/>
+              </w:rPr>
+              <w:t>X</w:t>
+            </w:r>
+            <w:r>
+              <w:t>.</w:t>
+            </w:r>
+          </w:p>
+        </w:tc>
+        <w:tc>
+          <w:tcPr>
+            <w:tcW w:w="1738" w:type="dxa"/>
+          </w:tcPr>
+          <w:p>
+            <w:pPr>
+              <w:pStyle w:val="af5"/>
+            </w:pPr>
+            <w:r>
+              <w:rPr>
+                <w:lang w:val="ru"/>
+              </w:rPr>
+              <w:t>Рекомендован для максимальной приватности</w:t>
+            </w:r>
+            <w:r>
+              <w:t xml:space="preserve">; </w:t>
+            </w:r>
+            <w:r>
+              <w:t>н</w:t>
+            </w:r>
+            <w:proofErr w:type="spellStart"/>
+            <w:r>
+              <w:rPr>
+                <w:lang w:val="ru"/>
+              </w:rPr>
+              <w:t>ет</w:t>
+            </w:r>
+            <w:proofErr w:type="spellEnd"/>
+            <w:r>
+              <w:rPr>
+                <w:lang w:val="ru"/>
+              </w:rPr>
+              <w:t xml:space="preserve"> облачной синхронизации истории.</w:t>
+            </w:r>
+          </w:p>
+        </w:tc>
+        <w:tc>
+          <w:tcPr>
+            <w:tcW w:w="1184" w:type="dxa"/>
+          </w:tcPr>
+          <w:p>
+            <w:pPr>
+              <w:pStyle w:val="af5"/>
+            </w:pPr>
+            <w:r>
+              <w:t>Система управления проектами</w:t>
+            </w:r>
+          </w:p>
+          <w:p>
+            <w:pPr>
+              <w:pStyle w:val="af5"/>
+            </w:pPr>
+            <w:r>
+              <w:t>для больших команд</w:t>
+            </w:r>
+            <w:r>
+              <w:t xml:space="preserve">. </w:t>
+            </w:r>
+            <w:r>
+              <w:rPr>
+                <w:lang w:val="ru"/>
+              </w:rPr>
+              <w:t>Российский корпоративный мессенджер.</w:t>
+            </w:r>
+          </w:p>
+        </w:tc>
+      </w:tr>
+    </w:tbl>
+    <w:p>
+      <w:pPr>
+        <w:pStyle w:val="2"/>
+        <w:rPr>
+          <w:lang w:val="ru-RU"/>
+        </w:rPr>
+        <w:sectPr>
+          <w:pgSz w:w="16834" w:h="11909" w:orient="landscape"/>
+          <w:pgMar w:top="567" w:right="1134" w:bottom="567" w:left="1134" w:header="720" w:footer="720" w:gutter="0"/>
+          <w:cols w:space="720"/>
+          <w:docGrid w:linePitch="326"/>
+        </w:sectPr>
+      </w:pPr>
     </w:p>
     <w:p>
       <w:pPr>
@@ -2245,7 +4325,7 @@
                     <pic:cNvPicPr/>
                   </pic:nvPicPr>
                   <pic:blipFill>
-                    <a:blip r:embed="rId8">
+                    <a:blip r:embed="rId10">
                       <a:extLst>
                         <a:ext uri="{28A0092B-C50C-407E-A947-70E740481C1C}">
                           <a14:useLocalDpi xmlns:a14="http://schemas.microsoft.com/office/drawing/2010/main" val="0"/>
@@ -2431,7 +4511,7 @@
                 <w:noProof/>
               </w:rPr>
               <w:drawing>
-                <wp:inline distT="0" distB="0" distL="0" distR="0" wp14:anchorId="71671DD3" wp14:editId="0190AA2D">
+                <wp:inline distT="0" distB="0" distL="0" distR="0" wp14:anchorId="71671DD3" wp14:editId="0F76556E">
                   <wp:extent cx="1825200" cy="4057200"/>
                   <wp:effectExtent l="0" t="0" r="3810" b="635"/>
                   <wp:docPr id="123481061" name="Рисунок 3"/>
@@ -2446,7 +4526,7 @@
                           <pic:cNvPicPr/>
                         </pic:nvPicPr>
                         <pic:blipFill>
-                          <a:blip r:embed="rId9" cstate="print">
+                          <a:blip r:embed="rId11" cstate="print">
                             <a:extLst>
                               <a:ext uri="{28A0092B-C50C-407E-A947-70E740481C1C}">
                                 <a14:useLocalDpi xmlns:a14="http://schemas.microsoft.com/office/drawing/2010/main" val="0"/>
@@ -2488,7 +4568,7 @@
                 <w:noProof/>
               </w:rPr>
               <w:drawing>
-                <wp:inline distT="0" distB="0" distL="0" distR="0" wp14:anchorId="38B411F3" wp14:editId="1BBB7553">
+                <wp:inline distT="0" distB="0" distL="0" distR="0" wp14:anchorId="38B411F3" wp14:editId="4029678D">
                   <wp:extent cx="1825200" cy="4057200"/>
                   <wp:effectExtent l="0" t="0" r="3810" b="635"/>
                   <wp:docPr id="938729790" name="Рисунок 4"/>
@@ -2503,7 +4583,7 @@
                           <pic:cNvPicPr/>
                         </pic:nvPicPr>
                         <pic:blipFill>
-                          <a:blip r:embed="rId10" cstate="print">
+                          <a:blip r:embed="rId12" cstate="print">
                             <a:extLst>
                               <a:ext uri="{28A0092B-C50C-407E-A947-70E740481C1C}">
                                 <a14:useLocalDpi xmlns:a14="http://schemas.microsoft.com/office/drawing/2010/main" val="0"/>
@@ -2580,7 +4660,7 @@
       <w:pPr>
         <w:pStyle w:val="1"/>
         <w:rPr>
-          <w:lang w:val="en-US"/>
+          <w:lang w:val="ru-RU"/>
         </w:rPr>
       </w:pPr>
       <w:bookmarkStart w:id="16" w:name="_nc8amvv1wtnt" w:colFirst="0" w:colLast="0"/>
@@ -2632,7 +4712,7 @@
         </w:rPr>
         <w:t xml:space="preserve">: </w:t>
       </w:r>
-      <w:hyperlink r:id="rId11" w:history="1">
+      <w:hyperlink r:id="rId13" w:history="1">
         <w:r>
           <w:rPr>
             <w:rStyle w:val="a9"/>
@@ -2703,49 +4783,7 @@
         <w:rPr>
           <w:lang w:val="ru-RU"/>
         </w:rPr>
-        <w:t xml:space="preserve"> </w:t>
-      </w:r>
-      <w:r>
-        <w:rPr>
-          <w:lang w:val="ru-RU"/>
-        </w:rPr>
-        <w:t xml:space="preserve">(дата обращения </w:t>
-      </w:r>
-      <w:r>
-        <w:rPr>
-          <w:lang w:val="ru-RU"/>
-        </w:rPr>
-        <w:t>01</w:t>
-      </w:r>
-      <w:r>
-        <w:rPr>
-          <w:lang w:val="ru-RU"/>
-        </w:rPr>
-        <w:t>.</w:t>
-      </w:r>
-      <w:r>
-        <w:rPr>
-          <w:lang w:val="ru-RU"/>
-        </w:rPr>
-        <w:t>05</w:t>
-      </w:r>
-      <w:r>
-        <w:rPr>
-          <w:lang w:val="ru-RU"/>
-        </w:rPr>
-        <w:t>.202</w:t>
-      </w:r>
-      <w:r>
-        <w:rPr>
-          <w:lang w:val="ru-RU"/>
-        </w:rPr>
-        <w:t>6</w:t>
-      </w:r>
-      <w:r>
-        <w:rPr>
-          <w:lang w:val="ru-RU"/>
-        </w:rPr>
-        <w:t>).</w:t>
+        <w:t xml:space="preserve"> (дата обращения 01.05.2026).</w:t>
       </w:r>
     </w:p>
     <w:p>
@@ -2784,7 +4822,7 @@
         </w:rPr>
         <w:t xml:space="preserve">: </w:t>
       </w:r>
-      <w:hyperlink r:id="rId12" w:history="1">
+      <w:hyperlink r:id="rId14" w:history="1">
         <w:r>
           <w:rPr>
             <w:rStyle w:val="a9"/>
@@ -2865,13 +4903,7 @@
         <w:rPr>
           <w:lang w:val="ru-RU"/>
         </w:rPr>
-        <w:t>01.05.2026</w:t>
-      </w:r>
-      <w:r>
-        <w:rPr>
-          <w:lang w:val="ru-RU"/>
-        </w:rPr>
-        <w:t>).</w:t>
+        <w:t>01.05.2026).</w:t>
       </w:r>
     </w:p>
     <w:p>
@@ -2916,7 +4948,7 @@
         </w:rPr>
         <w:t xml:space="preserve">: </w:t>
       </w:r>
-      <w:hyperlink r:id="rId13" w:history="1">
+      <w:hyperlink r:id="rId15" w:history="1">
         <w:r>
           <w:rPr>
             <w:rStyle w:val="a9"/>
@@ -3095,7 +5127,7 @@
         </w:rPr>
         <w:t xml:space="preserve">: </w:t>
       </w:r>
-      <w:hyperlink r:id="rId14" w:history="1">
+      <w:hyperlink r:id="rId16" w:history="1">
         <w:r>
           <w:rPr>
             <w:rStyle w:val="a9"/>
@@ -3165,7 +5197,7 @@
         </w:rPr>
         <w:t xml:space="preserve">: </w:t>
       </w:r>
-      <w:hyperlink r:id="rId15" w:history="1">
+      <w:hyperlink r:id="rId17" w:history="1">
         <w:r>
           <w:rPr>
             <w:rStyle w:val="a9"/>
@@ -3284,7 +5316,7 @@
         </w:rPr>
         <w:t xml:space="preserve">: </w:t>
       </w:r>
-      <w:hyperlink r:id="rId16" w:history="1">
+      <w:hyperlink r:id="rId18" w:history="1">
         <w:r>
           <w:rPr>
             <w:rStyle w:val="a9"/>
@@ -3404,13 +5436,10 @@
           <w:lang w:val="ru-RU"/>
         </w:rPr>
         <w:sectPr>
-          <w:footerReference w:type="default" r:id="rId17"/>
-          <w:footerReference w:type="first" r:id="rId18"/>
           <w:pgSz w:w="11909" w:h="16834"/>
           <w:pgMar w:top="1133" w:right="850" w:bottom="1133" w:left="1700" w:header="720" w:footer="720" w:gutter="0"/>
-          <w:pgNumType w:start="1"/>
           <w:cols w:space="720"/>
-          <w:titlePg/>
+          <w:docGrid w:linePitch="326"/>
         </w:sectPr>
       </w:pPr>
       <w:bookmarkStart w:id="19" w:name="_tj1xiu5003xl" w:colFirst="0" w:colLast="0"/>
@@ -4957,6 +6986,96 @@
     </w:lvl>
   </w:abstractNum>
   <w:abstractNum w:abstractNumId="4" w15:restartNumberingAfterBreak="0">
+    <w:nsid w:val="39DE31EC"/>
+    <w:multiLevelType w:val="hybridMultilevel"/>
+    <w:tmpl w:val="3C760B3E"/>
+    <w:lvl w:ilvl="0" w:tplc="40AC7BAE">
+      <w:start w:val="1"/>
+      <w:numFmt w:val="decimal"/>
+      <w:suff w:val="space"/>
+      <w:lvlText w:val="%1."/>
+      <w:lvlJc w:val="left"/>
+      <w:pPr>
+        <w:ind w:left="0" w:firstLine="709"/>
+      </w:pPr>
+      <w:rPr>
+        <w:rFonts w:hint="default"/>
+      </w:rPr>
+    </w:lvl>
+    <w:lvl w:ilvl="1" w:tplc="04190019" w:tentative="1">
+      <w:start w:val="1"/>
+      <w:numFmt w:val="lowerLetter"/>
+      <w:lvlText w:val="%2."/>
+      <w:lvlJc w:val="left"/>
+      <w:pPr>
+        <w:ind w:left="2148" w:hanging="360"/>
+      </w:pPr>
+    </w:lvl>
+    <w:lvl w:ilvl="2" w:tplc="0419001B" w:tentative="1">
+      <w:start w:val="1"/>
+      <w:numFmt w:val="lowerRoman"/>
+      <w:lvlText w:val="%3."/>
+      <w:lvlJc w:val="right"/>
+      <w:pPr>
+        <w:ind w:left="2868" w:hanging="180"/>
+      </w:pPr>
+    </w:lvl>
+    <w:lvl w:ilvl="3" w:tplc="0419000F" w:tentative="1">
+      <w:start w:val="1"/>
+      <w:numFmt w:val="decimal"/>
+      <w:lvlText w:val="%4."/>
+      <w:lvlJc w:val="left"/>
+      <w:pPr>
+        <w:ind w:left="3588" w:hanging="360"/>
+      </w:pPr>
+    </w:lvl>
+    <w:lvl w:ilvl="4" w:tplc="04190019" w:tentative="1">
+      <w:start w:val="1"/>
+      <w:numFmt w:val="lowerLetter"/>
+      <w:lvlText w:val="%5."/>
+      <w:lvlJc w:val="left"/>
+      <w:pPr>
+        <w:ind w:left="4308" w:hanging="360"/>
+      </w:pPr>
+    </w:lvl>
+    <w:lvl w:ilvl="5" w:tplc="0419001B" w:tentative="1">
+      <w:start w:val="1"/>
+      <w:numFmt w:val="lowerRoman"/>
+      <w:lvlText w:val="%6."/>
+      <w:lvlJc w:val="right"/>
+      <w:pPr>
+        <w:ind w:left="5028" w:hanging="180"/>
+      </w:pPr>
+    </w:lvl>
+    <w:lvl w:ilvl="6" w:tplc="0419000F" w:tentative="1">
+      <w:start w:val="1"/>
+      <w:numFmt w:val="decimal"/>
+      <w:lvlText w:val="%7."/>
+      <w:lvlJc w:val="left"/>
+      <w:pPr>
+        <w:ind w:left="5748" w:hanging="360"/>
+      </w:pPr>
+    </w:lvl>
+    <w:lvl w:ilvl="7" w:tplc="04190019" w:tentative="1">
+      <w:start w:val="1"/>
+      <w:numFmt w:val="lowerLetter"/>
+      <w:lvlText w:val="%8."/>
+      <w:lvlJc w:val="left"/>
+      <w:pPr>
+        <w:ind w:left="6468" w:hanging="360"/>
+      </w:pPr>
+    </w:lvl>
+    <w:lvl w:ilvl="8" w:tplc="0419001B" w:tentative="1">
+      <w:start w:val="1"/>
+      <w:numFmt w:val="lowerRoman"/>
+      <w:lvlText w:val="%9."/>
+      <w:lvlJc w:val="right"/>
+      <w:pPr>
+        <w:ind w:left="7188" w:hanging="180"/>
+      </w:pPr>
+    </w:lvl>
+  </w:abstractNum>
+  <w:abstractNum w:abstractNumId="5" w15:restartNumberingAfterBreak="0">
     <w:nsid w:val="49895793"/>
     <w:multiLevelType w:val="multilevel"/>
     <w:tmpl w:val="A720F002"/>
@@ -5086,13 +7205,16 @@
     <w:abstractNumId w:val="1"/>
   </w:num>
   <w:num w:numId="3" w16cid:durableId="161313484">
-    <w:abstractNumId w:val="4"/>
+    <w:abstractNumId w:val="5"/>
   </w:num>
   <w:num w:numId="4" w16cid:durableId="371535712">
     <w:abstractNumId w:val="2"/>
   </w:num>
   <w:num w:numId="5" w16cid:durableId="1008644">
     <w:abstractNumId w:val="0"/>
+  </w:num>
+  <w:num w:numId="6" w16cid:durableId="279343976">
+    <w:abstractNumId w:val="4"/>
   </w:num>
 </w:numbering>
 </file>
@@ -5921,6 +8043,53 @@
       <w:shd w:val="clear" w:color="auto" w:fill="E1DFDD"/>
     </w:rPr>
   </w:style>
+  <w:style w:type="paragraph" w:customStyle="1" w:styleId="af4">
+    <w:name w:val="Подпись к таблице"/>
+    <w:basedOn w:val="a"/>
+    <w:next w:val="af5"/>
+    <w:link w:val="af6"/>
+    <w:qFormat/>
+    <w:rsid w:val="00804CE9"/>
+    <w:pPr>
+      <w:ind w:firstLine="0"/>
+    </w:pPr>
+    <w:rPr>
+      <w:lang w:val="ru-RU"/>
+    </w:rPr>
+  </w:style>
+  <w:style w:type="character" w:customStyle="1" w:styleId="af6">
+    <w:name w:val="Подпись к таблице Знак"/>
+    <w:basedOn w:val="a0"/>
+    <w:link w:val="af4"/>
+    <w:rsid w:val="00804CE9"/>
+    <w:rPr>
+      <w:lang w:val="ru-RU"/>
+    </w:rPr>
+  </w:style>
+  <w:style w:type="paragraph" w:customStyle="1" w:styleId="af5">
+    <w:name w:val="Таблица"/>
+    <w:basedOn w:val="a"/>
+    <w:next w:val="a"/>
+    <w:link w:val="af7"/>
+    <w:qFormat/>
+    <w:rsid w:val="00804CE9"/>
+    <w:pPr>
+      <w:spacing w:line="240" w:lineRule="auto"/>
+      <w:ind w:firstLine="0"/>
+    </w:pPr>
+    <w:rPr>
+      <w:lang w:val="ru-RU"/>
+    </w:rPr>
+  </w:style>
+  <w:style w:type="character" w:customStyle="1" w:styleId="af7">
+    <w:name w:val="Таблица Знак"/>
+    <w:basedOn w:val="a0"/>
+    <w:link w:val="af5"/>
+    <w:rsid w:val="00804CE9"/>
+    <w:rPr>
+      <w:lang w:val="ru-RU"/>
+    </w:rPr>
+  </w:style>
 </w:styles>
 </file>
 

</xml_diff>